<commit_message>
Actualización del documento de especificación de datos INEC
</commit_message>
<xml_diff>
--- a/DOCS/DPDS_INEC.docx
+++ b/DOCS/DPDS_INEC.docx
@@ -53,7 +53,21 @@
           <w:rFonts w:ascii="Cambria" w:hAnsi="Cambria"/>
           <w:lang w:val="es-MX"/>
         </w:rPr>
-        <w:t>v0.1.0</w:t>
+        <w:t>v0.</w:t>
+      </w:r>
+      <w:r>
+        <w:rPr>
+          <w:rFonts w:ascii="Cambria" w:hAnsi="Cambria"/>
+          <w:lang w:val="es-MX"/>
+        </w:rPr>
+        <w:t>2</w:t>
+      </w:r>
+      <w:r>
+        <w:rPr>
+          <w:rFonts w:ascii="Cambria" w:hAnsi="Cambria"/>
+          <w:lang w:val="es-MX"/>
+        </w:rPr>
+        <w:t>.0</w:t>
       </w:r>
       <w:r>
         <w:rPr>
@@ -337,7 +351,21 @@
                 <w:rFonts w:ascii="Cambria" w:hAnsi="Cambria"/>
                 <w:lang w:val="es-MX"/>
               </w:rPr>
-              <w:t>v0.1.0</w:t>
+              <w:t>v0.</w:t>
+            </w:r>
+            <w:r>
+              <w:rPr>
+                <w:rFonts w:ascii="Cambria" w:hAnsi="Cambria"/>
+                <w:lang w:val="es-MX"/>
+              </w:rPr>
+              <w:t>2</w:t>
+            </w:r>
+            <w:r>
+              <w:rPr>
+                <w:rFonts w:ascii="Cambria" w:hAnsi="Cambria"/>
+                <w:lang w:val="es-MX"/>
+              </w:rPr>
+              <w:t>.0</w:t>
             </w:r>
           </w:p>
         </w:tc>
@@ -474,6 +502,13 @@
                 <w:lang w:val="es-MX"/>
               </w:rPr>
             </w:pPr>
+            <w:r>
+              <w:rPr>
+                <w:rFonts w:ascii="Cambria" w:hAnsi="Cambria"/>
+                <w:lang w:val="es-MX"/>
+              </w:rPr>
+              <w:t>Zaida Rovira Jurado - MIES</w:t>
+            </w:r>
           </w:p>
         </w:tc>
       </w:tr>
@@ -566,7 +601,19 @@
               <w:rPr>
                 <w:rFonts w:ascii="Cambria" w:hAnsi="Cambria"/>
               </w:rPr>
-              <w:t>17/06/2026</w:t>
+              <w:t>1</w:t>
+            </w:r>
+            <w:r>
+              <w:rPr>
+                <w:rFonts w:ascii="Cambria" w:hAnsi="Cambria"/>
+              </w:rPr>
+              <w:t>8</w:t>
+            </w:r>
+            <w:r>
+              <w:rPr>
+                <w:rFonts w:ascii="Cambria" w:hAnsi="Cambria"/>
+              </w:rPr>
+              <w:t>/06/2026</w:t>
             </w:r>
           </w:p>
         </w:tc>
@@ -702,7 +749,35 @@
           <w:rFonts w:ascii="Cambria" w:hAnsi="Cambria"/>
           <w:lang w:val="es-MX"/>
         </w:rPr>
-        <w:t xml:space="preserve"> comprender a profundidad qué dimensiones específicas (salud, educación, servicios) explican en mayor medida la situación de pobreza en cada zona geográfica evaluada</w:t>
+        <w:t xml:space="preserve"> comprender a profundidad qué dimensiones específicas (</w:t>
+      </w:r>
+      <w:r>
+        <w:rPr>
+          <w:rFonts w:ascii="Cambria" w:hAnsi="Cambria"/>
+          <w:lang w:val="es-MX"/>
+        </w:rPr>
+        <w:t xml:space="preserve">vivienda, </w:t>
+      </w:r>
+      <w:r>
+        <w:rPr>
+          <w:rFonts w:ascii="Cambria" w:hAnsi="Cambria"/>
+          <w:lang w:val="es-MX"/>
+        </w:rPr>
+        <w:t>educación, servicios</w:t>
+      </w:r>
+      <w:r>
+        <w:rPr>
+          <w:rFonts w:ascii="Cambria" w:hAnsi="Cambria"/>
+          <w:lang w:val="es-MX"/>
+        </w:rPr>
+        <w:t>, hacinamiento, dependencia</w:t>
+      </w:r>
+      <w:r>
+        <w:rPr>
+          <w:rFonts w:ascii="Cambria" w:hAnsi="Cambria"/>
+          <w:lang w:val="es-MX"/>
+        </w:rPr>
+        <w:t>) explican en mayor medida la situación de pobreza en cada zona geográfica evaluada</w:t>
       </w:r>
       <w:r>
         <w:rPr>
@@ -728,7 +803,27 @@
           <w:bCs/>
           <w:lang w:val="es-MX"/>
         </w:rPr>
-        <w:t xml:space="preserve">¿Qué decisiones habilita este producto de datos? </w:t>
+        <w:t xml:space="preserve">¿Qué </w:t>
+      </w:r>
+      <w:proofErr w:type="gramStart"/>
+      <w:r>
+        <w:rPr>
+          <w:rFonts w:ascii="Cambria" w:hAnsi="Cambria"/>
+          <w:b/>
+          <w:bCs/>
+          <w:lang w:val="es-MX"/>
+        </w:rPr>
+        <w:t>decisiones habilita</w:t>
+      </w:r>
+      <w:proofErr w:type="gramEnd"/>
+      <w:r>
+        <w:rPr>
+          <w:rFonts w:ascii="Cambria" w:hAnsi="Cambria"/>
+          <w:b/>
+          <w:bCs/>
+          <w:lang w:val="es-MX"/>
+        </w:rPr>
+        <w:t xml:space="preserve"> este producto de datos? </w:t>
       </w:r>
     </w:p>
     <w:p>
@@ -750,6 +845,7 @@
         </w:rPr>
         <w:t>[</w:t>
       </w:r>
+      <w:proofErr w:type="gramStart"/>
       <w:r>
         <w:rPr>
           <w:rFonts w:ascii="Cambria" w:hAnsi="Cambria"/>
@@ -757,7 +853,17 @@
           <w:bCs/>
           <w:lang w:val="es-MX"/>
         </w:rPr>
-        <w:t>Ministro / Gobierno Central</w:t>
+        <w:t>Ministro</w:t>
+      </w:r>
+      <w:proofErr w:type="gramEnd"/>
+      <w:r>
+        <w:rPr>
+          <w:rFonts w:ascii="Cambria" w:hAnsi="Cambria"/>
+          <w:b/>
+          <w:bCs/>
+          <w:lang w:val="es-MX"/>
+        </w:rPr>
+        <w:t xml:space="preserve"> / Gobierno Central</w:t>
       </w:r>
       <w:r>
         <w:rPr>
@@ -836,25 +942,7 @@
           <w:bCs/>
           <w:lang w:val="es-MX"/>
         </w:rPr>
-        <w:t xml:space="preserve"> Decisión </w:t>
-      </w:r>
-      <w:r>
-        <w:rPr>
-          <w:rFonts w:ascii="Cambria" w:hAnsi="Cambria"/>
-          <w:b/>
-          <w:bCs/>
-          <w:lang w:val="es-MX"/>
-        </w:rPr>
-        <w:t>táctica</w:t>
-      </w:r>
-      <w:r>
-        <w:rPr>
-          <w:rFonts w:ascii="Cambria" w:hAnsi="Cambria"/>
-          <w:b/>
-          <w:bCs/>
-          <w:lang w:val="es-MX"/>
-        </w:rPr>
-        <w:t xml:space="preserve">: </w:t>
+        <w:t xml:space="preserve"> Decisión táctica: </w:t>
       </w:r>
       <w:r>
         <w:rPr>
@@ -926,25 +1014,7 @@
           <w:bCs/>
           <w:lang w:val="es-MX"/>
         </w:rPr>
-        <w:t xml:space="preserve">] Decisión </w:t>
-      </w:r>
-      <w:r>
-        <w:rPr>
-          <w:rFonts w:ascii="Cambria" w:hAnsi="Cambria"/>
-          <w:b/>
-          <w:bCs/>
-          <w:lang w:val="es-MX"/>
-        </w:rPr>
-        <w:t>operativa</w:t>
-      </w:r>
-      <w:r>
-        <w:rPr>
-          <w:rFonts w:ascii="Cambria" w:hAnsi="Cambria"/>
-          <w:b/>
-          <w:bCs/>
-          <w:lang w:val="es-MX"/>
-        </w:rPr>
-        <w:t xml:space="preserve">: </w:t>
+        <w:t xml:space="preserve">] Decisión operativa: </w:t>
       </w:r>
       <w:r>
         <w:rPr>
@@ -997,18 +1067,18 @@
     <w:tbl>
       <w:tblPr>
         <w:tblStyle w:val="TableGrid"/>
-        <w:tblW w:w="8730" w:type="dxa"/>
+        <w:tblW w:w="8926" w:type="dxa"/>
         <w:tblLook w:val="04A0" w:firstRow="1" w:lastRow="0" w:firstColumn="1" w:lastColumn="0" w:noHBand="0" w:noVBand="1"/>
       </w:tblPr>
       <w:tblGrid>
-        <w:gridCol w:w="2831"/>
-        <w:gridCol w:w="3067"/>
-        <w:gridCol w:w="2832"/>
+        <w:gridCol w:w="2122"/>
+        <w:gridCol w:w="4819"/>
+        <w:gridCol w:w="1985"/>
       </w:tblGrid>
       <w:tr>
         <w:tc>
           <w:tcPr>
-            <w:tcW w:w="2831" w:type="dxa"/>
+            <w:tcW w:w="2122" w:type="dxa"/>
           </w:tcPr>
           <w:p>
             <w:pPr>
@@ -1033,7 +1103,7 @@
         </w:tc>
         <w:tc>
           <w:tcPr>
-            <w:tcW w:w="3067" w:type="dxa"/>
+            <w:tcW w:w="4819" w:type="dxa"/>
           </w:tcPr>
           <w:p>
             <w:pPr>
@@ -1058,7 +1128,7 @@
         </w:tc>
         <w:tc>
           <w:tcPr>
-            <w:tcW w:w="2832" w:type="dxa"/>
+            <w:tcW w:w="1985" w:type="dxa"/>
           </w:tcPr>
           <w:p>
             <w:pPr>
@@ -1085,7 +1155,7 @@
       <w:tr>
         <w:tc>
           <w:tcPr>
-            <w:tcW w:w="2831" w:type="dxa"/>
+            <w:tcW w:w="2122" w:type="dxa"/>
           </w:tcPr>
           <w:p>
             <w:pPr>
@@ -1109,7 +1179,7 @@
         </w:tc>
         <w:tc>
           <w:tcPr>
-            <w:tcW w:w="3067" w:type="dxa"/>
+            <w:tcW w:w="4819" w:type="dxa"/>
           </w:tcPr>
           <w:p>
             <w:pPr>
@@ -1156,7 +1226,7 @@
         </w:tc>
         <w:tc>
           <w:tcPr>
-            <w:tcW w:w="2832" w:type="dxa"/>
+            <w:tcW w:w="1985" w:type="dxa"/>
           </w:tcPr>
           <w:p>
             <w:pPr>
@@ -1177,7 +1247,7 @@
       <w:tr>
         <w:tc>
           <w:tcPr>
-            <w:tcW w:w="2831" w:type="dxa"/>
+            <w:tcW w:w="2122" w:type="dxa"/>
           </w:tcPr>
           <w:p>
             <w:pPr>
@@ -1201,7 +1271,7 @@
         </w:tc>
         <w:tc>
           <w:tcPr>
-            <w:tcW w:w="3067" w:type="dxa"/>
+            <w:tcW w:w="4819" w:type="dxa"/>
           </w:tcPr>
           <w:p>
             <w:pPr>
@@ -1243,7 +1313,7 @@
         </w:tc>
         <w:tc>
           <w:tcPr>
-            <w:tcW w:w="2832" w:type="dxa"/>
+            <w:tcW w:w="1985" w:type="dxa"/>
           </w:tcPr>
           <w:p>
             <w:pPr>
@@ -1264,7 +1334,7 @@
       <w:tr>
         <w:tc>
           <w:tcPr>
-            <w:tcW w:w="2831" w:type="dxa"/>
+            <w:tcW w:w="2122" w:type="dxa"/>
           </w:tcPr>
           <w:p>
             <w:pPr>
@@ -1297,7 +1367,7 @@
         </w:tc>
         <w:tc>
           <w:tcPr>
-            <w:tcW w:w="3067" w:type="dxa"/>
+            <w:tcW w:w="4819" w:type="dxa"/>
           </w:tcPr>
           <w:p>
             <w:pPr>
@@ -1351,7 +1421,7 @@
         </w:tc>
         <w:tc>
           <w:tcPr>
-            <w:tcW w:w="2832" w:type="dxa"/>
+            <w:tcW w:w="1985" w:type="dxa"/>
           </w:tcPr>
           <w:p>
             <w:pPr>
@@ -1372,7 +1442,7 @@
       <w:tr>
         <w:tc>
           <w:tcPr>
-            <w:tcW w:w="2831" w:type="dxa"/>
+            <w:tcW w:w="2122" w:type="dxa"/>
           </w:tcPr>
           <w:p>
             <w:pPr>
@@ -1403,7 +1473,7 @@
         </w:tc>
         <w:tc>
           <w:tcPr>
-            <w:tcW w:w="3067" w:type="dxa"/>
+            <w:tcW w:w="4819" w:type="dxa"/>
           </w:tcPr>
           <w:p>
             <w:pPr>
@@ -1417,19 +1487,7 @@
               <w:rPr>
                 <w:rFonts w:ascii="Cambria" w:hAnsi="Cambria"/>
               </w:rPr>
-              <w:t xml:space="preserve">1. Auditar que </w:t>
-            </w:r>
-            <w:r>
-              <w:rPr>
-                <w:rFonts w:ascii="Cambria" w:hAnsi="Cambria"/>
-              </w:rPr>
-              <w:t>la asignación de presupuestos corresponda</w:t>
-            </w:r>
-            <w:r>
-              <w:rPr>
-                <w:rFonts w:ascii="Cambria" w:hAnsi="Cambria"/>
-              </w:rPr>
-              <w:t xml:space="preserve"> a los cantones</w:t>
+              <w:t>1. Auditar que la asignación de presupuestos corresponda a los cantones</w:t>
             </w:r>
             <w:r>
               <w:rPr>
@@ -1463,7 +1521,7 @@
         </w:tc>
         <w:tc>
           <w:tcPr>
-            <w:tcW w:w="2832" w:type="dxa"/>
+            <w:tcW w:w="1985" w:type="dxa"/>
           </w:tcPr>
           <w:p>
             <w:pPr>
@@ -1511,34 +1569,13 @@
           <w:lang w:val="es-MX"/>
         </w:rPr>
       </w:pPr>
-    </w:p>
-    <w:p>
-      <w:pPr>
+      <w:r>
         <w:rPr>
           <w:rFonts w:ascii="Cambria" w:hAnsi="Cambria"/>
           <w:b/>
           <w:bCs/>
           <w:lang w:val="es-MX"/>
         </w:rPr>
-      </w:pPr>
-    </w:p>
-    <w:p>
-      <w:pPr>
-        <w:rPr>
-          <w:rFonts w:ascii="Cambria" w:hAnsi="Cambria"/>
-          <w:b/>
-          <w:bCs/>
-          <w:lang w:val="es-MX"/>
-        </w:rPr>
-      </w:pPr>
-      <w:r>
-        <w:rPr>
-          <w:rFonts w:ascii="Cambria" w:hAnsi="Cambria"/>
-          <w:b/>
-          <w:bCs/>
-          <w:lang w:val="es-MX"/>
-        </w:rPr>
-        <w:lastRenderedPageBreak/>
         <w:t>3.- PUERTOS DE ENTRADA (INPUT PORTS)</w:t>
       </w:r>
     </w:p>
@@ -1552,8 +1589,8 @@
         <w:gridCol w:w="352"/>
         <w:gridCol w:w="3859"/>
         <w:gridCol w:w="1266"/>
-        <w:gridCol w:w="1889"/>
-        <w:gridCol w:w="1560"/>
+        <w:gridCol w:w="2031"/>
+        <w:gridCol w:w="1418"/>
       </w:tblGrid>
       <w:tr>
         <w:tc>
@@ -1635,7 +1672,7 @@
         </w:tc>
         <w:tc>
           <w:tcPr>
-            <w:tcW w:w="1889" w:type="dxa"/>
+            <w:tcW w:w="2031" w:type="dxa"/>
             <w:hideMark/>
           </w:tcPr>
           <w:p>
@@ -1660,7 +1697,7 @@
         </w:tc>
         <w:tc>
           <w:tcPr>
-            <w:tcW w:w="1560" w:type="dxa"/>
+            <w:tcW w:w="1418" w:type="dxa"/>
             <w:hideMark/>
           </w:tcPr>
           <w:p>
@@ -1749,7 +1786,7 @@
         </w:tc>
         <w:tc>
           <w:tcPr>
-            <w:tcW w:w="1889" w:type="dxa"/>
+            <w:tcW w:w="2031" w:type="dxa"/>
           </w:tcPr>
           <w:p>
             <w:pPr>
@@ -1768,7 +1805,7 @@
         </w:tc>
         <w:tc>
           <w:tcPr>
-            <w:tcW w:w="1560" w:type="dxa"/>
+            <w:tcW w:w="1418" w:type="dxa"/>
           </w:tcPr>
           <w:p>
             <w:pPr>
@@ -1851,7 +1888,7 @@
         </w:tc>
         <w:tc>
           <w:tcPr>
-            <w:tcW w:w="1889" w:type="dxa"/>
+            <w:tcW w:w="2031" w:type="dxa"/>
           </w:tcPr>
           <w:p>
             <w:pPr>
@@ -1870,7 +1907,7 @@
         </w:tc>
         <w:tc>
           <w:tcPr>
-            <w:tcW w:w="1560" w:type="dxa"/>
+            <w:tcW w:w="1418" w:type="dxa"/>
           </w:tcPr>
           <w:p>
             <w:pPr>
@@ -1965,7 +2002,7 @@
         </w:tc>
         <w:tc>
           <w:tcPr>
-            <w:tcW w:w="1889" w:type="dxa"/>
+            <w:tcW w:w="2031" w:type="dxa"/>
           </w:tcPr>
           <w:p>
             <w:pPr>
@@ -1984,7 +2021,7 @@
         </w:tc>
         <w:tc>
           <w:tcPr>
-            <w:tcW w:w="1560" w:type="dxa"/>
+            <w:tcW w:w="1418" w:type="dxa"/>
           </w:tcPr>
           <w:p>
             <w:pPr>
@@ -2079,38 +2116,26 @@
         </w:tc>
         <w:tc>
           <w:tcPr>
-            <w:tcW w:w="1889" w:type="dxa"/>
-          </w:tcPr>
-          <w:p>
-            <w:pPr>
-              <w:spacing w:after="160" w:line="276" w:lineRule="auto"/>
-              <w:rPr>
-                <w:rFonts w:ascii="Cambria" w:hAnsi="Cambria"/>
-              </w:rPr>
-            </w:pPr>
-            <w:r>
-              <w:rPr>
-                <w:rFonts w:ascii="Cambria" w:hAnsi="Cambria"/>
-              </w:rPr>
-              <w:t xml:space="preserve">INEC (Clasificador DPA - División </w:t>
-            </w:r>
-            <w:r>
-              <w:rPr>
-                <w:rFonts w:ascii="Cambria" w:hAnsi="Cambria"/>
-              </w:rPr>
-              <w:t>Político-Administrativa</w:t>
-            </w:r>
-            <w:r>
-              <w:rPr>
-                <w:rFonts w:ascii="Cambria" w:hAnsi="Cambria"/>
-              </w:rPr>
-              <w:t>)</w:t>
-            </w:r>
-          </w:p>
-        </w:tc>
-        <w:tc>
-          <w:tcPr>
-            <w:tcW w:w="1560" w:type="dxa"/>
+            <w:tcW w:w="2031" w:type="dxa"/>
+          </w:tcPr>
+          <w:p>
+            <w:pPr>
+              <w:spacing w:after="160" w:line="276" w:lineRule="auto"/>
+              <w:rPr>
+                <w:rFonts w:ascii="Cambria" w:hAnsi="Cambria"/>
+              </w:rPr>
+            </w:pPr>
+            <w:r>
+              <w:rPr>
+                <w:rFonts w:ascii="Cambria" w:hAnsi="Cambria"/>
+              </w:rPr>
+              <w:t>INEC (Clasificador DPA)</w:t>
+            </w:r>
+          </w:p>
+        </w:tc>
+        <w:tc>
+          <w:tcPr>
+            <w:tcW w:w="1418" w:type="dxa"/>
           </w:tcPr>
           <w:p>
             <w:pPr>
@@ -2155,6 +2180,7 @@
           <w:bCs/>
           <w:lang w:val="es-MX"/>
         </w:rPr>
+        <w:lastRenderedPageBreak/>
         <w:t>4.- ESQUEMA DE DATOS (OUTPUT PORT)</w:t>
       </w:r>
     </w:p>
@@ -2166,17 +2192,17 @@
         <w:tblLook w:val="04A0" w:firstRow="1" w:lastRow="0" w:firstColumn="1" w:lastColumn="0" w:noHBand="0" w:noVBand="1"/>
       </w:tblPr>
       <w:tblGrid>
-        <w:gridCol w:w="348"/>
-        <w:gridCol w:w="2450"/>
-        <w:gridCol w:w="1191"/>
-        <w:gridCol w:w="1741"/>
-        <w:gridCol w:w="1477"/>
-        <w:gridCol w:w="1693"/>
+        <w:gridCol w:w="562"/>
+        <w:gridCol w:w="2410"/>
+        <w:gridCol w:w="1276"/>
+        <w:gridCol w:w="1701"/>
+        <w:gridCol w:w="1559"/>
+        <w:gridCol w:w="1392"/>
       </w:tblGrid>
       <w:tr>
         <w:tc>
           <w:tcPr>
-            <w:tcW w:w="348" w:type="dxa"/>
+            <w:tcW w:w="562" w:type="dxa"/>
             <w:hideMark/>
           </w:tcPr>
           <w:p>
@@ -2200,7 +2226,7 @@
         </w:tc>
         <w:tc>
           <w:tcPr>
-            <w:tcW w:w="2450" w:type="dxa"/>
+            <w:tcW w:w="2410" w:type="dxa"/>
             <w:hideMark/>
           </w:tcPr>
           <w:p>
@@ -2224,7 +2250,7 @@
         </w:tc>
         <w:tc>
           <w:tcPr>
-            <w:tcW w:w="1191" w:type="dxa"/>
+            <w:tcW w:w="1276" w:type="dxa"/>
             <w:hideMark/>
           </w:tcPr>
           <w:p>
@@ -2248,7 +2274,7 @@
         </w:tc>
         <w:tc>
           <w:tcPr>
-            <w:tcW w:w="1741" w:type="dxa"/>
+            <w:tcW w:w="1701" w:type="dxa"/>
             <w:hideMark/>
           </w:tcPr>
           <w:p>
@@ -2272,7 +2298,7 @@
         </w:tc>
         <w:tc>
           <w:tcPr>
-            <w:tcW w:w="1477" w:type="dxa"/>
+            <w:tcW w:w="1559" w:type="dxa"/>
             <w:hideMark/>
           </w:tcPr>
           <w:p>
@@ -2296,7 +2322,7 @@
         </w:tc>
         <w:tc>
           <w:tcPr>
-            <w:tcW w:w="1693" w:type="dxa"/>
+            <w:tcW w:w="1392" w:type="dxa"/>
             <w:hideMark/>
           </w:tcPr>
           <w:p>
@@ -2314,7 +2340,7 @@
                 <w:b/>
                 <w:bCs/>
               </w:rPr>
-              <w:t>¿Obligatorio?</w:t>
+              <w:t>Obligatorio</w:t>
             </w:r>
           </w:p>
         </w:tc>
@@ -2322,7 +2348,7 @@
       <w:tr>
         <w:tc>
           <w:tcPr>
-            <w:tcW w:w="348" w:type="dxa"/>
+            <w:tcW w:w="562" w:type="dxa"/>
             <w:hideMark/>
           </w:tcPr>
           <w:p>
@@ -2346,7 +2372,7 @@
         </w:tc>
         <w:tc>
           <w:tcPr>
-            <w:tcW w:w="2450" w:type="dxa"/>
+            <w:tcW w:w="2410" w:type="dxa"/>
           </w:tcPr>
           <w:p>
             <w:pPr>
@@ -2367,7 +2393,7 @@
         </w:tc>
         <w:tc>
           <w:tcPr>
-            <w:tcW w:w="1191" w:type="dxa"/>
+            <w:tcW w:w="1276" w:type="dxa"/>
           </w:tcPr>
           <w:p>
             <w:pPr>
@@ -2386,45 +2412,45 @@
         </w:tc>
         <w:tc>
           <w:tcPr>
-            <w:tcW w:w="1741" w:type="dxa"/>
-          </w:tcPr>
-          <w:p>
-            <w:pPr>
-              <w:spacing w:after="160" w:line="276" w:lineRule="auto"/>
-              <w:rPr>
-                <w:rFonts w:ascii="Cambria" w:hAnsi="Cambria"/>
-              </w:rPr>
-            </w:pPr>
-            <w:r>
-              <w:rPr>
-                <w:rFonts w:ascii="Cambria" w:hAnsi="Cambria"/>
-              </w:rPr>
-              <w:t>Código único territorial del cantón utilizado para graficar el mapa coroplético.</w:t>
-            </w:r>
-          </w:p>
-        </w:tc>
-        <w:tc>
-          <w:tcPr>
-            <w:tcW w:w="1477" w:type="dxa"/>
-          </w:tcPr>
-          <w:p>
-            <w:pPr>
-              <w:spacing w:after="160" w:line="276" w:lineRule="auto"/>
-              <w:rPr>
-                <w:rFonts w:ascii="Cambria" w:hAnsi="Cambria"/>
-              </w:rPr>
-            </w:pPr>
-            <w:r>
-              <w:rPr>
-                <w:rFonts w:ascii="Cambria" w:hAnsi="Cambria"/>
-              </w:rPr>
-              <w:t>Consistencia provincia-cantón-parroquia (debe existir en el catálogo maestro).</w:t>
-            </w:r>
-          </w:p>
-        </w:tc>
-        <w:tc>
-          <w:tcPr>
-            <w:tcW w:w="1693" w:type="dxa"/>
+            <w:tcW w:w="1701" w:type="dxa"/>
+          </w:tcPr>
+          <w:p>
+            <w:pPr>
+              <w:spacing w:after="160" w:line="276" w:lineRule="auto"/>
+              <w:rPr>
+                <w:rFonts w:ascii="Cambria" w:hAnsi="Cambria"/>
+              </w:rPr>
+            </w:pPr>
+            <w:r>
+              <w:rPr>
+                <w:rFonts w:ascii="Cambria" w:hAnsi="Cambria"/>
+              </w:rPr>
+              <w:t>Código INEC para mapa coroplético.</w:t>
+            </w:r>
+          </w:p>
+        </w:tc>
+        <w:tc>
+          <w:tcPr>
+            <w:tcW w:w="1559" w:type="dxa"/>
+          </w:tcPr>
+          <w:p>
+            <w:pPr>
+              <w:spacing w:after="160" w:line="276" w:lineRule="auto"/>
+              <w:rPr>
+                <w:rFonts w:ascii="Cambria" w:hAnsi="Cambria"/>
+              </w:rPr>
+            </w:pPr>
+            <w:r>
+              <w:rPr>
+                <w:rFonts w:ascii="Cambria" w:hAnsi="Cambria"/>
+              </w:rPr>
+              <w:t>Consistencia provincia-cantón (debe existir en el catálogo maestro).</w:t>
+            </w:r>
+          </w:p>
+        </w:tc>
+        <w:tc>
+          <w:tcPr>
+            <w:tcW w:w="1392" w:type="dxa"/>
           </w:tcPr>
           <w:p>
             <w:pPr>
@@ -2445,7 +2471,7 @@
       <w:tr>
         <w:tc>
           <w:tcPr>
-            <w:tcW w:w="348" w:type="dxa"/>
+            <w:tcW w:w="562" w:type="dxa"/>
             <w:hideMark/>
           </w:tcPr>
           <w:p>
@@ -2469,85 +2495,83 @@
         </w:tc>
         <w:tc>
           <w:tcPr>
-            <w:tcW w:w="2450" w:type="dxa"/>
-          </w:tcPr>
-          <w:p>
-            <w:pPr>
-              <w:spacing w:after="160" w:line="276" w:lineRule="auto"/>
-              <w:rPr>
-                <w:rFonts w:ascii="Cambria" w:hAnsi="Cambria"/>
-              </w:rPr>
-            </w:pPr>
-            <w:proofErr w:type="spellStart"/>
-            <w:r>
-              <w:rPr>
-                <w:rFonts w:ascii="Cambria" w:hAnsi="Cambria"/>
-              </w:rPr>
-              <w:t>es_pobre_multidimensional</w:t>
-            </w:r>
-            <w:proofErr w:type="spellEnd"/>
-          </w:p>
-        </w:tc>
-        <w:tc>
-          <w:tcPr>
-            <w:tcW w:w="1191" w:type="dxa"/>
-          </w:tcPr>
-          <w:p>
-            <w:pPr>
-              <w:spacing w:after="160" w:line="276" w:lineRule="auto"/>
-              <w:rPr>
-                <w:rFonts w:ascii="Cambria" w:hAnsi="Cambria"/>
-              </w:rPr>
-            </w:pPr>
-            <w:r>
-              <w:rPr>
-                <w:rFonts w:ascii="Cambria" w:hAnsi="Cambria"/>
-              </w:rPr>
-              <w:t>BOOLEAN</w:t>
-            </w:r>
-          </w:p>
-        </w:tc>
-        <w:tc>
-          <w:tcPr>
-            <w:tcW w:w="1741" w:type="dxa"/>
-          </w:tcPr>
-          <w:p>
-            <w:pPr>
-              <w:spacing w:after="160" w:line="276" w:lineRule="auto"/>
-              <w:rPr>
-                <w:rFonts w:ascii="Cambria" w:hAnsi="Cambria"/>
-              </w:rPr>
-            </w:pPr>
-            <w:r>
-              <w:rPr>
-                <w:rFonts w:ascii="Cambria" w:hAnsi="Cambria"/>
-              </w:rPr>
-              <w:t>Indicador que determina si el hogar tiene privación en ≥3 de los 9 indicadores evaluados.</w:t>
-            </w:r>
-          </w:p>
-        </w:tc>
-        <w:tc>
-          <w:tcPr>
-            <w:tcW w:w="1477" w:type="dxa"/>
-          </w:tcPr>
-          <w:p>
-            <w:pPr>
-              <w:spacing w:after="160" w:line="276" w:lineRule="auto"/>
-              <w:rPr>
-                <w:rFonts w:ascii="Cambria" w:hAnsi="Cambria"/>
-              </w:rPr>
-            </w:pPr>
-            <w:r>
-              <w:rPr>
-                <w:rFonts w:ascii="Cambria" w:hAnsi="Cambria"/>
-              </w:rPr>
-              <w:t>Nulos no permitidos</w:t>
-            </w:r>
-          </w:p>
-        </w:tc>
-        <w:tc>
-          <w:tcPr>
-            <w:tcW w:w="1693" w:type="dxa"/>
+            <w:tcW w:w="2410" w:type="dxa"/>
+          </w:tcPr>
+          <w:p>
+            <w:pPr>
+              <w:spacing w:after="160" w:line="276" w:lineRule="auto"/>
+              <w:rPr>
+                <w:rFonts w:ascii="Cambria" w:hAnsi="Cambria"/>
+              </w:rPr>
+            </w:pPr>
+            <w:r>
+              <w:rPr>
+                <w:rFonts w:ascii="Cambria" w:hAnsi="Cambria"/>
+              </w:rPr>
+              <w:t>provincia</w:t>
+            </w:r>
+          </w:p>
+        </w:tc>
+        <w:tc>
+          <w:tcPr>
+            <w:tcW w:w="1276" w:type="dxa"/>
+          </w:tcPr>
+          <w:p>
+            <w:pPr>
+              <w:spacing w:after="160" w:line="276" w:lineRule="auto"/>
+              <w:rPr>
+                <w:rFonts w:ascii="Cambria" w:hAnsi="Cambria"/>
+              </w:rPr>
+            </w:pPr>
+            <w:r>
+              <w:rPr>
+                <w:rFonts w:ascii="Cambria" w:hAnsi="Cambria"/>
+              </w:rPr>
+              <w:t>VARCHAR</w:t>
+            </w:r>
+          </w:p>
+        </w:tc>
+        <w:tc>
+          <w:tcPr>
+            <w:tcW w:w="1701" w:type="dxa"/>
+          </w:tcPr>
+          <w:p>
+            <w:pPr>
+              <w:spacing w:after="160" w:line="276" w:lineRule="auto"/>
+              <w:rPr>
+                <w:rFonts w:ascii="Cambria" w:hAnsi="Cambria"/>
+              </w:rPr>
+            </w:pPr>
+            <w:r>
+              <w:rPr>
+                <w:rFonts w:ascii="Cambria" w:hAnsi="Cambria"/>
+              </w:rPr>
+              <w:t>Nombre de provincia para filtros.</w:t>
+            </w:r>
+          </w:p>
+        </w:tc>
+        <w:tc>
+          <w:tcPr>
+            <w:tcW w:w="1559" w:type="dxa"/>
+          </w:tcPr>
+          <w:p>
+            <w:pPr>
+              <w:spacing w:after="160" w:line="276" w:lineRule="auto"/>
+              <w:rPr>
+                <w:rFonts w:ascii="Cambria" w:hAnsi="Cambria"/>
+              </w:rPr>
+            </w:pPr>
+            <w:r>
+              <w:rPr>
+                <w:rFonts w:ascii="Cambria" w:hAnsi="Cambria"/>
+              </w:rPr>
+              <w:t>No debe contener nulos ni caracteres especiales.</w:t>
+            </w:r>
+          </w:p>
+        </w:tc>
+        <w:tc>
+          <w:tcPr>
+            <w:tcW w:w="1392" w:type="dxa"/>
           </w:tcPr>
           <w:p>
             <w:pPr>
@@ -2566,9 +2590,12 @@
         </w:tc>
       </w:tr>
       <w:tr>
-        <w:tc>
-          <w:tcPr>
-            <w:tcW w:w="348" w:type="dxa"/>
+        <w:trPr>
+          <w:trHeight w:val="1494"/>
+        </w:trPr>
+        <w:tc>
+          <w:tcPr>
+            <w:tcW w:w="562" w:type="dxa"/>
             <w:hideMark/>
           </w:tcPr>
           <w:p>
@@ -2592,7 +2619,7 @@
         </w:tc>
         <w:tc>
           <w:tcPr>
-            <w:tcW w:w="2450" w:type="dxa"/>
+            <w:tcW w:w="2410" w:type="dxa"/>
           </w:tcPr>
           <w:p>
             <w:pPr>
@@ -2606,99 +2633,83 @@
               <w:rPr>
                 <w:rFonts w:ascii="Cambria" w:hAnsi="Cambria"/>
               </w:rPr>
-              <w:t>tasa_nbi_oficial</w:t>
+              <w:t>canton</w:t>
             </w:r>
             <w:proofErr w:type="spellEnd"/>
           </w:p>
         </w:tc>
         <w:tc>
           <w:tcPr>
-            <w:tcW w:w="1191" w:type="dxa"/>
-          </w:tcPr>
-          <w:p>
-            <w:pPr>
-              <w:spacing w:after="160" w:line="276" w:lineRule="auto"/>
-              <w:rPr>
-                <w:rFonts w:ascii="Cambria" w:hAnsi="Cambria"/>
-              </w:rPr>
-            </w:pPr>
-            <w:r>
-              <w:rPr>
-                <w:rFonts w:ascii="Cambria" w:hAnsi="Cambria"/>
-              </w:rPr>
-              <w:t>DECIMAL</w:t>
-            </w:r>
-          </w:p>
-        </w:tc>
-        <w:tc>
-          <w:tcPr>
-            <w:tcW w:w="1741" w:type="dxa"/>
-          </w:tcPr>
-          <w:p>
-            <w:pPr>
-              <w:spacing w:after="160" w:line="276" w:lineRule="auto"/>
-              <w:rPr>
-                <w:rFonts w:ascii="Cambria" w:hAnsi="Cambria"/>
-              </w:rPr>
-            </w:pPr>
-            <w:r>
-              <w:rPr>
-                <w:rFonts w:ascii="Cambria" w:hAnsi="Cambria"/>
-              </w:rPr>
-              <w:t xml:space="preserve">Porcentaje de pobreza por Necesidades Básicas Insatisfechas </w:t>
-            </w:r>
-            <w:r>
-              <w:rPr>
-                <w:rFonts w:ascii="Cambria" w:hAnsi="Cambria"/>
-              </w:rPr>
-              <w:lastRenderedPageBreak/>
-              <w:t>oficial del INEC para comparar contra nuestro cálculo.</w:t>
-            </w:r>
-          </w:p>
-        </w:tc>
-        <w:tc>
-          <w:tcPr>
-            <w:tcW w:w="1477" w:type="dxa"/>
-          </w:tcPr>
-          <w:p>
-            <w:pPr>
-              <w:spacing w:after="160" w:line="276" w:lineRule="auto"/>
-              <w:rPr>
-                <w:rFonts w:ascii="Cambria" w:hAnsi="Cambria"/>
-              </w:rPr>
-            </w:pPr>
-            <w:r>
-              <w:rPr>
-                <w:rFonts w:ascii="Cambria" w:hAnsi="Cambria"/>
-              </w:rPr>
-              <w:lastRenderedPageBreak/>
-              <w:t xml:space="preserve">Debe ser un valor porcentual </w:t>
-            </w:r>
-            <w:r>
-              <w:rPr>
-                <w:rFonts w:ascii="Cambria" w:hAnsi="Cambria"/>
-              </w:rPr>
-              <w:lastRenderedPageBreak/>
-              <w:t>entre 0 y 100.</w:t>
-            </w:r>
-          </w:p>
-        </w:tc>
-        <w:tc>
-          <w:tcPr>
-            <w:tcW w:w="1693" w:type="dxa"/>
-          </w:tcPr>
-          <w:p>
-            <w:pPr>
-              <w:spacing w:after="160" w:line="276" w:lineRule="auto"/>
-              <w:rPr>
-                <w:rFonts w:ascii="Cambria" w:hAnsi="Cambria"/>
-              </w:rPr>
-            </w:pPr>
-            <w:r>
-              <w:rPr>
-                <w:rFonts w:ascii="Cambria" w:hAnsi="Cambria"/>
-              </w:rPr>
-              <w:lastRenderedPageBreak/>
+            <w:tcW w:w="1276" w:type="dxa"/>
+          </w:tcPr>
+          <w:p>
+            <w:pPr>
+              <w:spacing w:after="160" w:line="276" w:lineRule="auto"/>
+              <w:rPr>
+                <w:rFonts w:ascii="Cambria" w:hAnsi="Cambria"/>
+              </w:rPr>
+            </w:pPr>
+            <w:r>
+              <w:rPr>
+                <w:rFonts w:ascii="Cambria" w:hAnsi="Cambria"/>
+              </w:rPr>
+              <w:t>VARCHAR</w:t>
+            </w:r>
+          </w:p>
+        </w:tc>
+        <w:tc>
+          <w:tcPr>
+            <w:tcW w:w="1701" w:type="dxa"/>
+          </w:tcPr>
+          <w:p>
+            <w:pPr>
+              <w:spacing w:after="160" w:line="276" w:lineRule="auto"/>
+              <w:rPr>
+                <w:rFonts w:ascii="Cambria" w:hAnsi="Cambria"/>
+              </w:rPr>
+            </w:pPr>
+            <w:r>
+              <w:rPr>
+                <w:rFonts w:ascii="Cambria" w:hAnsi="Cambria"/>
+              </w:rPr>
+              <w:t>Nombre de cantón para filtros y Top 5.</w:t>
+            </w:r>
+          </w:p>
+        </w:tc>
+        <w:tc>
+          <w:tcPr>
+            <w:tcW w:w="1559" w:type="dxa"/>
+          </w:tcPr>
+          <w:p>
+            <w:pPr>
+              <w:spacing w:after="160" w:line="276" w:lineRule="auto"/>
+              <w:rPr>
+                <w:rFonts w:ascii="Cambria" w:hAnsi="Cambria"/>
+              </w:rPr>
+            </w:pPr>
+            <w:r>
+              <w:rPr>
+                <w:rFonts w:ascii="Cambria" w:hAnsi="Cambria"/>
+              </w:rPr>
+              <w:t>Debe coincidir con la descripción oficial de la DPA.</w:t>
+            </w:r>
+          </w:p>
+        </w:tc>
+        <w:tc>
+          <w:tcPr>
+            <w:tcW w:w="1392" w:type="dxa"/>
+          </w:tcPr>
+          <w:p>
+            <w:pPr>
+              <w:spacing w:after="160" w:line="276" w:lineRule="auto"/>
+              <w:rPr>
+                <w:rFonts w:ascii="Cambria" w:hAnsi="Cambria"/>
+              </w:rPr>
+            </w:pPr>
+            <w:r>
+              <w:rPr>
+                <w:rFonts w:ascii="Cambria" w:hAnsi="Cambria"/>
+              </w:rPr>
               <w:t>Sí</w:t>
             </w:r>
           </w:p>
@@ -2707,7 +2718,7 @@
       <w:tr>
         <w:tc>
           <w:tcPr>
-            <w:tcW w:w="348" w:type="dxa"/>
+            <w:tcW w:w="562" w:type="dxa"/>
             <w:hideMark/>
           </w:tcPr>
           <w:p>
@@ -2731,7 +2742,7 @@
         </w:tc>
         <w:tc>
           <w:tcPr>
-            <w:tcW w:w="2450" w:type="dxa"/>
+            <w:tcW w:w="2410" w:type="dxa"/>
           </w:tcPr>
           <w:p>
             <w:pPr>
@@ -2745,71 +2756,71 @@
               <w:rPr>
                 <w:rFonts w:ascii="Cambria" w:hAnsi="Cambria"/>
               </w:rPr>
-              <w:t>ingreso_hogar</w:t>
+              <w:t>area</w:t>
             </w:r>
             <w:proofErr w:type="spellEnd"/>
           </w:p>
         </w:tc>
         <w:tc>
           <w:tcPr>
-            <w:tcW w:w="1191" w:type="dxa"/>
-          </w:tcPr>
-          <w:p>
-            <w:pPr>
-              <w:spacing w:after="160" w:line="276" w:lineRule="auto"/>
-              <w:rPr>
-                <w:rFonts w:ascii="Cambria" w:hAnsi="Cambria"/>
-              </w:rPr>
-            </w:pPr>
-            <w:r>
-              <w:rPr>
-                <w:rFonts w:ascii="Cambria" w:hAnsi="Cambria"/>
-              </w:rPr>
-              <w:t>DECIMAL</w:t>
-            </w:r>
-          </w:p>
-        </w:tc>
-        <w:tc>
-          <w:tcPr>
-            <w:tcW w:w="1741" w:type="dxa"/>
-          </w:tcPr>
-          <w:p>
-            <w:pPr>
-              <w:spacing w:after="160" w:line="276" w:lineRule="auto"/>
-              <w:rPr>
-                <w:rFonts w:ascii="Cambria" w:hAnsi="Cambria"/>
-              </w:rPr>
-            </w:pPr>
-            <w:r>
-              <w:rPr>
-                <w:rFonts w:ascii="Cambria" w:hAnsi="Cambria"/>
-              </w:rPr>
-              <w:t>Total de ingresos económicos reportados por el hogar encuestado.</w:t>
-            </w:r>
-          </w:p>
-        </w:tc>
-        <w:tc>
-          <w:tcPr>
-            <w:tcW w:w="1477" w:type="dxa"/>
-          </w:tcPr>
-          <w:p>
-            <w:pPr>
-              <w:spacing w:after="160" w:line="276" w:lineRule="auto"/>
-              <w:rPr>
-                <w:rFonts w:ascii="Cambria" w:hAnsi="Cambria"/>
-              </w:rPr>
-            </w:pPr>
-            <w:r>
-              <w:rPr>
-                <w:rFonts w:ascii="Cambria" w:hAnsi="Cambria"/>
-              </w:rPr>
-              <w:t>No debe contener valores negativos y debe estar dentro de un umbral realista.</w:t>
-            </w:r>
-          </w:p>
-        </w:tc>
-        <w:tc>
-          <w:tcPr>
-            <w:tcW w:w="1693" w:type="dxa"/>
+            <w:tcW w:w="1276" w:type="dxa"/>
+          </w:tcPr>
+          <w:p>
+            <w:pPr>
+              <w:spacing w:after="160" w:line="276" w:lineRule="auto"/>
+              <w:rPr>
+                <w:rFonts w:ascii="Cambria" w:hAnsi="Cambria"/>
+              </w:rPr>
+            </w:pPr>
+            <w:r>
+              <w:rPr>
+                <w:rFonts w:ascii="Cambria" w:hAnsi="Cambria"/>
+              </w:rPr>
+              <w:t>VARCHAR</w:t>
+            </w:r>
+          </w:p>
+        </w:tc>
+        <w:tc>
+          <w:tcPr>
+            <w:tcW w:w="1701" w:type="dxa"/>
+          </w:tcPr>
+          <w:p>
+            <w:pPr>
+              <w:spacing w:after="160" w:line="276" w:lineRule="auto"/>
+              <w:rPr>
+                <w:rFonts w:ascii="Cambria" w:hAnsi="Cambria"/>
+              </w:rPr>
+            </w:pPr>
+            <w:r>
+              <w:rPr>
+                <w:rFonts w:ascii="Cambria" w:hAnsi="Cambria"/>
+              </w:rPr>
+              <w:t>Zona del hogar: 'Urbana' o 'Rural'.</w:t>
+            </w:r>
+          </w:p>
+        </w:tc>
+        <w:tc>
+          <w:tcPr>
+            <w:tcW w:w="1559" w:type="dxa"/>
+          </w:tcPr>
+          <w:p>
+            <w:pPr>
+              <w:spacing w:after="160" w:line="276" w:lineRule="auto"/>
+              <w:rPr>
+                <w:rFonts w:ascii="Cambria" w:hAnsi="Cambria"/>
+              </w:rPr>
+            </w:pPr>
+            <w:r>
+              <w:rPr>
+                <w:rFonts w:ascii="Cambria" w:hAnsi="Cambria"/>
+              </w:rPr>
+              <w:t>Valores estandarizados según el modelo metodológico.</w:t>
+            </w:r>
+          </w:p>
+        </w:tc>
+        <w:tc>
+          <w:tcPr>
+            <w:tcW w:w="1392" w:type="dxa"/>
           </w:tcPr>
           <w:p>
             <w:pPr>
@@ -2830,7 +2841,7 @@
       <w:tr>
         <w:tc>
           <w:tcPr>
-            <w:tcW w:w="348" w:type="dxa"/>
+            <w:tcW w:w="562" w:type="dxa"/>
             <w:hideMark/>
           </w:tcPr>
           <w:p>
@@ -2854,26 +2865,26 @@
         </w:tc>
         <w:tc>
           <w:tcPr>
-            <w:tcW w:w="2450" w:type="dxa"/>
-          </w:tcPr>
-          <w:p>
-            <w:pPr>
-              <w:spacing w:after="160" w:line="276" w:lineRule="auto"/>
-              <w:rPr>
-                <w:rFonts w:ascii="Cambria" w:hAnsi="Cambria"/>
-              </w:rPr>
-            </w:pPr>
-            <w:r>
-              <w:rPr>
-                <w:rFonts w:ascii="Cambria" w:hAnsi="Cambria"/>
-              </w:rPr>
-              <w:t>zona</w:t>
-            </w:r>
-          </w:p>
-        </w:tc>
-        <w:tc>
-          <w:tcPr>
-            <w:tcW w:w="1191" w:type="dxa"/>
+            <w:tcW w:w="2410" w:type="dxa"/>
+          </w:tcPr>
+          <w:p>
+            <w:pPr>
+              <w:spacing w:after="160" w:line="276" w:lineRule="auto"/>
+              <w:rPr>
+                <w:rFonts w:ascii="Cambria" w:hAnsi="Cambria"/>
+              </w:rPr>
+            </w:pPr>
+            <w:r>
+              <w:rPr>
+                <w:rFonts w:ascii="Cambria" w:hAnsi="Cambria"/>
+              </w:rPr>
+              <w:t>gravedad</w:t>
+            </w:r>
+          </w:p>
+        </w:tc>
+        <w:tc>
+          <w:tcPr>
+            <w:tcW w:w="1276" w:type="dxa"/>
           </w:tcPr>
           <w:p>
             <w:pPr>
@@ -2892,49 +2903,1186 @@
         </w:tc>
         <w:tc>
           <w:tcPr>
-            <w:tcW w:w="1741" w:type="dxa"/>
-          </w:tcPr>
-          <w:p>
-            <w:pPr>
-              <w:spacing w:after="160" w:line="276" w:lineRule="auto"/>
-              <w:rPr>
-                <w:rFonts w:ascii="Cambria" w:hAnsi="Cambria"/>
-              </w:rPr>
-            </w:pPr>
-            <w:r>
-              <w:rPr>
-                <w:rFonts w:ascii="Cambria" w:hAnsi="Cambria"/>
-              </w:rPr>
-              <w:t>Clasificación del área de asentamiento del hogar encuestado.</w:t>
-            </w:r>
-          </w:p>
-        </w:tc>
-        <w:tc>
-          <w:tcPr>
-            <w:tcW w:w="1477" w:type="dxa"/>
-          </w:tcPr>
-          <w:p>
-            <w:pPr>
-              <w:spacing w:after="160" w:line="276" w:lineRule="auto"/>
-              <w:rPr>
-                <w:rFonts w:ascii="Cambria" w:hAnsi="Cambria"/>
-              </w:rPr>
-            </w:pPr>
-            <w:r>
-              <w:rPr>
-                <w:rFonts w:ascii="Cambria" w:hAnsi="Cambria"/>
-              </w:rPr>
-              <w:t>Solo puede contener "Urbana" o "Rural".</w:t>
-            </w:r>
-          </w:p>
-        </w:tc>
-        <w:tc>
-          <w:tcPr>
-            <w:tcW w:w="1693" w:type="dxa"/>
-          </w:tcPr>
-          <w:p>
-            <w:pPr>
-              <w:spacing w:after="160" w:line="276" w:lineRule="auto"/>
+            <w:tcW w:w="1701" w:type="dxa"/>
+          </w:tcPr>
+          <w:p>
+            <w:pPr>
+              <w:spacing w:after="160" w:line="276" w:lineRule="auto"/>
+              <w:rPr>
+                <w:rFonts w:ascii="Cambria" w:hAnsi="Cambria"/>
+              </w:rPr>
+            </w:pPr>
+            <w:r>
+              <w:rPr>
+                <w:rFonts w:ascii="Cambria" w:hAnsi="Cambria"/>
+              </w:rPr>
+              <w:t>Nivel de pobreza del hogar.</w:t>
+            </w:r>
+          </w:p>
+        </w:tc>
+        <w:tc>
+          <w:tcPr>
+            <w:tcW w:w="1559" w:type="dxa"/>
+          </w:tcPr>
+          <w:p>
+            <w:pPr>
+              <w:spacing w:after="160" w:line="276" w:lineRule="auto"/>
+              <w:rPr>
+                <w:rFonts w:ascii="Cambria" w:hAnsi="Cambria"/>
+              </w:rPr>
+            </w:pPr>
+            <w:r>
+              <w:rPr>
+                <w:rFonts w:ascii="Cambria" w:hAnsi="Cambria"/>
+              </w:rPr>
+              <w:t>Nulos no permitidos.</w:t>
+            </w:r>
+          </w:p>
+        </w:tc>
+        <w:tc>
+          <w:tcPr>
+            <w:tcW w:w="1392" w:type="dxa"/>
+          </w:tcPr>
+          <w:p>
+            <w:pPr>
+              <w:spacing w:after="160" w:line="276" w:lineRule="auto"/>
+              <w:rPr>
+                <w:rFonts w:ascii="Cambria" w:hAnsi="Cambria"/>
+              </w:rPr>
+            </w:pPr>
+            <w:r>
+              <w:rPr>
+                <w:rFonts w:ascii="Cambria" w:hAnsi="Cambria"/>
+              </w:rPr>
+              <w:t>Sí</w:t>
+            </w:r>
+          </w:p>
+        </w:tc>
+      </w:tr>
+      <w:tr>
+        <w:tc>
+          <w:tcPr>
+            <w:tcW w:w="562" w:type="dxa"/>
+          </w:tcPr>
+          <w:p>
+            <w:pPr>
+              <w:spacing w:line="276" w:lineRule="auto"/>
+              <w:rPr>
+                <w:rFonts w:ascii="Cambria" w:hAnsi="Cambria"/>
+                <w:b/>
+                <w:bCs/>
+              </w:rPr>
+            </w:pPr>
+            <w:r>
+              <w:rPr>
+                <w:rFonts w:ascii="Cambria" w:hAnsi="Cambria"/>
+                <w:b/>
+                <w:bCs/>
+              </w:rPr>
+              <w:t>6</w:t>
+            </w:r>
+          </w:p>
+        </w:tc>
+        <w:tc>
+          <w:tcPr>
+            <w:tcW w:w="2410" w:type="dxa"/>
+          </w:tcPr>
+          <w:p>
+            <w:pPr>
+              <w:spacing w:line="276" w:lineRule="auto"/>
+              <w:rPr>
+                <w:rFonts w:ascii="Cambria" w:hAnsi="Cambria"/>
+              </w:rPr>
+            </w:pPr>
+            <w:proofErr w:type="spellStart"/>
+            <w:r>
+              <w:rPr>
+                <w:rFonts w:ascii="Cambria" w:hAnsi="Cambria"/>
+              </w:rPr>
+              <w:t>es_pobre_nbi_calculado</w:t>
+            </w:r>
+            <w:proofErr w:type="spellEnd"/>
+          </w:p>
+        </w:tc>
+        <w:tc>
+          <w:tcPr>
+            <w:tcW w:w="1276" w:type="dxa"/>
+          </w:tcPr>
+          <w:p>
+            <w:pPr>
+              <w:spacing w:line="276" w:lineRule="auto"/>
+              <w:rPr>
+                <w:rFonts w:ascii="Cambria" w:hAnsi="Cambria"/>
+              </w:rPr>
+            </w:pPr>
+            <w:r>
+              <w:rPr>
+                <w:rFonts w:ascii="Cambria" w:hAnsi="Cambria"/>
+              </w:rPr>
+              <w:t>BOOLEAN</w:t>
+            </w:r>
+          </w:p>
+        </w:tc>
+        <w:tc>
+          <w:tcPr>
+            <w:tcW w:w="1701" w:type="dxa"/>
+          </w:tcPr>
+          <w:p>
+            <w:pPr>
+              <w:spacing w:line="276" w:lineRule="auto"/>
+              <w:rPr>
+                <w:rFonts w:ascii="Cambria" w:hAnsi="Cambria"/>
+                <w:lang w:val="es-ES"/>
+              </w:rPr>
+            </w:pPr>
+            <w:r>
+              <w:rPr>
+                <w:rFonts w:ascii="Cambria" w:hAnsi="Cambria"/>
+              </w:rPr>
+              <w:t>Verdadero si presenta</w:t>
+            </w:r>
+            <w:r>
+              <w:rPr>
+                <w:rFonts w:ascii="Cambria" w:hAnsi="Cambria"/>
+                <w:lang w:val="es-ES"/>
+              </w:rPr>
+              <w:t xml:space="preserve"> </w:t>
+            </w:r>
+            <w:r>
+              <w:rPr>
+                <w:rFonts w:ascii="Cambria" w:hAnsi="Cambria"/>
+                <w:lang w:val="es-ES"/>
+              </w:rPr>
+              <w:t>≥</w:t>
+            </w:r>
+            <w:r>
+              <w:rPr>
+                <w:rFonts w:ascii="Cambria" w:hAnsi="Cambria"/>
+                <w:lang w:val="es-ES"/>
+              </w:rPr>
+              <w:t>3</w:t>
+            </w:r>
+            <w:r>
+              <w:rPr>
+                <w:rFonts w:ascii="Cambria" w:hAnsi="Cambria"/>
+                <w:lang w:val="es-ES"/>
+              </w:rPr>
+              <w:t xml:space="preserve"> privaciones</w:t>
+            </w:r>
+          </w:p>
+          <w:p>
+            <w:pPr>
+              <w:spacing w:line="276" w:lineRule="auto"/>
+              <w:rPr>
+                <w:rFonts w:ascii="Cambria" w:hAnsi="Cambria"/>
+                <w:lang w:val="es-ES"/>
+              </w:rPr>
+            </w:pPr>
+          </w:p>
+        </w:tc>
+        <w:tc>
+          <w:tcPr>
+            <w:tcW w:w="1559" w:type="dxa"/>
+          </w:tcPr>
+          <w:p>
+            <w:pPr>
+              <w:spacing w:line="276" w:lineRule="auto"/>
+              <w:rPr>
+                <w:rFonts w:ascii="Cambria" w:hAnsi="Cambria"/>
+              </w:rPr>
+            </w:pPr>
+            <w:r>
+              <w:rPr>
+                <w:rFonts w:ascii="Cambria" w:hAnsi="Cambria"/>
+              </w:rPr>
+              <w:t>Debe permitir la comparación de tasas.</w:t>
+            </w:r>
+          </w:p>
+        </w:tc>
+        <w:tc>
+          <w:tcPr>
+            <w:tcW w:w="1392" w:type="dxa"/>
+          </w:tcPr>
+          <w:p>
+            <w:pPr>
+              <w:spacing w:line="276" w:lineRule="auto"/>
+              <w:rPr>
+                <w:rFonts w:ascii="Cambria" w:hAnsi="Cambria"/>
+              </w:rPr>
+            </w:pPr>
+            <w:r>
+              <w:rPr>
+                <w:rFonts w:ascii="Cambria" w:hAnsi="Cambria"/>
+              </w:rPr>
+              <w:t>Sí</w:t>
+            </w:r>
+          </w:p>
+        </w:tc>
+      </w:tr>
+      <w:tr>
+        <w:tc>
+          <w:tcPr>
+            <w:tcW w:w="562" w:type="dxa"/>
+          </w:tcPr>
+          <w:p>
+            <w:pPr>
+              <w:spacing w:line="276" w:lineRule="auto"/>
+              <w:rPr>
+                <w:rFonts w:ascii="Cambria" w:hAnsi="Cambria"/>
+                <w:b/>
+                <w:bCs/>
+              </w:rPr>
+            </w:pPr>
+            <w:r>
+              <w:rPr>
+                <w:rFonts w:ascii="Cambria" w:hAnsi="Cambria"/>
+                <w:b/>
+                <w:bCs/>
+              </w:rPr>
+              <w:t>7</w:t>
+            </w:r>
+          </w:p>
+        </w:tc>
+        <w:tc>
+          <w:tcPr>
+            <w:tcW w:w="2410" w:type="dxa"/>
+          </w:tcPr>
+          <w:p>
+            <w:pPr>
+              <w:spacing w:line="276" w:lineRule="auto"/>
+              <w:rPr>
+                <w:rFonts w:ascii="Cambria" w:hAnsi="Cambria"/>
+              </w:rPr>
+            </w:pPr>
+            <w:proofErr w:type="spellStart"/>
+            <w:r>
+              <w:rPr>
+                <w:rFonts w:ascii="Cambria" w:hAnsi="Cambria"/>
+              </w:rPr>
+              <w:t>es_pobre_nbi_oficial</w:t>
+            </w:r>
+            <w:proofErr w:type="spellEnd"/>
+          </w:p>
+        </w:tc>
+        <w:tc>
+          <w:tcPr>
+            <w:tcW w:w="1276" w:type="dxa"/>
+          </w:tcPr>
+          <w:p>
+            <w:pPr>
+              <w:spacing w:line="276" w:lineRule="auto"/>
+              <w:rPr>
+                <w:rFonts w:ascii="Cambria" w:hAnsi="Cambria"/>
+              </w:rPr>
+            </w:pPr>
+            <w:r>
+              <w:rPr>
+                <w:rFonts w:ascii="Cambria" w:hAnsi="Cambria"/>
+              </w:rPr>
+              <w:t>BOOLEAN</w:t>
+            </w:r>
+          </w:p>
+        </w:tc>
+        <w:tc>
+          <w:tcPr>
+            <w:tcW w:w="1701" w:type="dxa"/>
+          </w:tcPr>
+          <w:p>
+            <w:pPr>
+              <w:spacing w:line="276" w:lineRule="auto"/>
+              <w:rPr>
+                <w:rFonts w:ascii="Cambria" w:hAnsi="Cambria"/>
+              </w:rPr>
+            </w:pPr>
+            <w:r>
+              <w:rPr>
+                <w:rFonts w:ascii="Cambria" w:hAnsi="Cambria"/>
+              </w:rPr>
+              <w:t>Tasa oficial INEC para comparación.</w:t>
+            </w:r>
+          </w:p>
+        </w:tc>
+        <w:tc>
+          <w:tcPr>
+            <w:tcW w:w="1559" w:type="dxa"/>
+          </w:tcPr>
+          <w:p>
+            <w:pPr>
+              <w:spacing w:line="276" w:lineRule="auto"/>
+              <w:rPr>
+                <w:rFonts w:ascii="Cambria" w:hAnsi="Cambria"/>
+              </w:rPr>
+            </w:pPr>
+            <w:r>
+              <w:rPr>
+                <w:rFonts w:ascii="Cambria" w:hAnsi="Cambria"/>
+              </w:rPr>
+              <w:t>Solo valores 0 o 1.</w:t>
+            </w:r>
+          </w:p>
+        </w:tc>
+        <w:tc>
+          <w:tcPr>
+            <w:tcW w:w="1392" w:type="dxa"/>
+          </w:tcPr>
+          <w:p>
+            <w:pPr>
+              <w:spacing w:line="276" w:lineRule="auto"/>
+              <w:rPr>
+                <w:rFonts w:ascii="Cambria" w:hAnsi="Cambria"/>
+              </w:rPr>
+            </w:pPr>
+            <w:r>
+              <w:rPr>
+                <w:rFonts w:ascii="Cambria" w:hAnsi="Cambria"/>
+              </w:rPr>
+              <w:t>Sí</w:t>
+            </w:r>
+          </w:p>
+        </w:tc>
+      </w:tr>
+      <w:tr>
+        <w:tc>
+          <w:tcPr>
+            <w:tcW w:w="562" w:type="dxa"/>
+          </w:tcPr>
+          <w:p>
+            <w:pPr>
+              <w:spacing w:line="276" w:lineRule="auto"/>
+              <w:rPr>
+                <w:rFonts w:ascii="Cambria" w:hAnsi="Cambria"/>
+                <w:b/>
+                <w:bCs/>
+              </w:rPr>
+            </w:pPr>
+            <w:r>
+              <w:rPr>
+                <w:rFonts w:ascii="Cambria" w:hAnsi="Cambria"/>
+                <w:b/>
+                <w:bCs/>
+              </w:rPr>
+              <w:t>8</w:t>
+            </w:r>
+          </w:p>
+        </w:tc>
+        <w:tc>
+          <w:tcPr>
+            <w:tcW w:w="2410" w:type="dxa"/>
+          </w:tcPr>
+          <w:p>
+            <w:pPr>
+              <w:spacing w:line="276" w:lineRule="auto"/>
+              <w:rPr>
+                <w:rFonts w:ascii="Cambria" w:hAnsi="Cambria"/>
+              </w:rPr>
+            </w:pPr>
+            <w:proofErr w:type="spellStart"/>
+            <w:r>
+              <w:rPr>
+                <w:rFonts w:ascii="Cambria" w:hAnsi="Cambria"/>
+              </w:rPr>
+              <w:t>pobreza_vivienda</w:t>
+            </w:r>
+            <w:proofErr w:type="spellEnd"/>
+          </w:p>
+        </w:tc>
+        <w:tc>
+          <w:tcPr>
+            <w:tcW w:w="1276" w:type="dxa"/>
+          </w:tcPr>
+          <w:p>
+            <w:pPr>
+              <w:spacing w:line="276" w:lineRule="auto"/>
+              <w:rPr>
+                <w:rFonts w:ascii="Cambria" w:hAnsi="Cambria"/>
+              </w:rPr>
+            </w:pPr>
+            <w:r>
+              <w:rPr>
+                <w:rFonts w:ascii="Cambria" w:hAnsi="Cambria"/>
+              </w:rPr>
+              <w:t>INT</w:t>
+            </w:r>
+          </w:p>
+        </w:tc>
+        <w:tc>
+          <w:tcPr>
+            <w:tcW w:w="1701" w:type="dxa"/>
+          </w:tcPr>
+          <w:p>
+            <w:pPr>
+              <w:spacing w:line="276" w:lineRule="auto"/>
+              <w:rPr>
+                <w:rFonts w:ascii="Cambria" w:hAnsi="Cambria"/>
+              </w:rPr>
+            </w:pPr>
+            <w:r>
+              <w:rPr>
+                <w:rFonts w:ascii="Cambria" w:hAnsi="Cambria"/>
+              </w:rPr>
+              <w:t>Privación en dimensión Vivienda.</w:t>
+            </w:r>
+          </w:p>
+        </w:tc>
+        <w:tc>
+          <w:tcPr>
+            <w:tcW w:w="1559" w:type="dxa"/>
+          </w:tcPr>
+          <w:p>
+            <w:pPr>
+              <w:spacing w:line="276" w:lineRule="auto"/>
+              <w:rPr>
+                <w:rFonts w:ascii="Cambria" w:hAnsi="Cambria"/>
+              </w:rPr>
+            </w:pPr>
+            <w:r>
+              <w:rPr>
+                <w:rFonts w:ascii="Cambria" w:hAnsi="Cambria"/>
+              </w:rPr>
+              <w:t>Solo valores 0 o 1.</w:t>
+            </w:r>
+          </w:p>
+        </w:tc>
+        <w:tc>
+          <w:tcPr>
+            <w:tcW w:w="1392" w:type="dxa"/>
+          </w:tcPr>
+          <w:p>
+            <w:pPr>
+              <w:spacing w:line="276" w:lineRule="auto"/>
+              <w:rPr>
+                <w:rFonts w:ascii="Cambria" w:hAnsi="Cambria"/>
+              </w:rPr>
+            </w:pPr>
+            <w:r>
+              <w:rPr>
+                <w:rFonts w:ascii="Cambria" w:hAnsi="Cambria"/>
+              </w:rPr>
+              <w:t>Sí</w:t>
+            </w:r>
+          </w:p>
+        </w:tc>
+      </w:tr>
+      <w:tr>
+        <w:tc>
+          <w:tcPr>
+            <w:tcW w:w="562" w:type="dxa"/>
+          </w:tcPr>
+          <w:p>
+            <w:pPr>
+              <w:spacing w:line="276" w:lineRule="auto"/>
+              <w:rPr>
+                <w:rFonts w:ascii="Cambria" w:hAnsi="Cambria"/>
+                <w:b/>
+                <w:bCs/>
+              </w:rPr>
+            </w:pPr>
+            <w:r>
+              <w:rPr>
+                <w:rFonts w:ascii="Cambria" w:hAnsi="Cambria"/>
+                <w:b/>
+                <w:bCs/>
+              </w:rPr>
+              <w:t>9</w:t>
+            </w:r>
+          </w:p>
+        </w:tc>
+        <w:tc>
+          <w:tcPr>
+            <w:tcW w:w="2410" w:type="dxa"/>
+          </w:tcPr>
+          <w:p>
+            <w:pPr>
+              <w:spacing w:line="276" w:lineRule="auto"/>
+              <w:rPr>
+                <w:rFonts w:ascii="Cambria" w:hAnsi="Cambria"/>
+              </w:rPr>
+            </w:pPr>
+            <w:proofErr w:type="spellStart"/>
+            <w:r>
+              <w:rPr>
+                <w:rFonts w:ascii="Cambria" w:hAnsi="Cambria"/>
+              </w:rPr>
+              <w:t>pobreza_educacion</w:t>
+            </w:r>
+            <w:proofErr w:type="spellEnd"/>
+          </w:p>
+        </w:tc>
+        <w:tc>
+          <w:tcPr>
+            <w:tcW w:w="1276" w:type="dxa"/>
+          </w:tcPr>
+          <w:p>
+            <w:pPr>
+              <w:spacing w:line="276" w:lineRule="auto"/>
+              <w:rPr>
+                <w:rFonts w:ascii="Cambria" w:hAnsi="Cambria"/>
+              </w:rPr>
+            </w:pPr>
+            <w:r>
+              <w:rPr>
+                <w:rFonts w:ascii="Cambria" w:hAnsi="Cambria"/>
+              </w:rPr>
+              <w:t>INT</w:t>
+            </w:r>
+          </w:p>
+        </w:tc>
+        <w:tc>
+          <w:tcPr>
+            <w:tcW w:w="1701" w:type="dxa"/>
+          </w:tcPr>
+          <w:p>
+            <w:pPr>
+              <w:spacing w:line="276" w:lineRule="auto"/>
+              <w:rPr>
+                <w:rFonts w:ascii="Cambria" w:hAnsi="Cambria"/>
+              </w:rPr>
+            </w:pPr>
+            <w:r>
+              <w:rPr>
+                <w:rFonts w:ascii="Cambria" w:hAnsi="Cambria"/>
+              </w:rPr>
+              <w:t>Privación en dimensión Educación.</w:t>
+            </w:r>
+          </w:p>
+        </w:tc>
+        <w:tc>
+          <w:tcPr>
+            <w:tcW w:w="1559" w:type="dxa"/>
+          </w:tcPr>
+          <w:p>
+            <w:pPr>
+              <w:spacing w:line="276" w:lineRule="auto"/>
+              <w:rPr>
+                <w:rFonts w:ascii="Cambria" w:hAnsi="Cambria"/>
+              </w:rPr>
+            </w:pPr>
+            <w:r>
+              <w:rPr>
+                <w:rFonts w:ascii="Cambria" w:hAnsi="Cambria"/>
+              </w:rPr>
+              <w:t>Solo valores 0 o 1.</w:t>
+            </w:r>
+          </w:p>
+        </w:tc>
+        <w:tc>
+          <w:tcPr>
+            <w:tcW w:w="1392" w:type="dxa"/>
+          </w:tcPr>
+          <w:p>
+            <w:pPr>
+              <w:spacing w:line="276" w:lineRule="auto"/>
+              <w:rPr>
+                <w:rFonts w:ascii="Cambria" w:hAnsi="Cambria"/>
+              </w:rPr>
+            </w:pPr>
+            <w:r>
+              <w:rPr>
+                <w:rFonts w:ascii="Cambria" w:hAnsi="Cambria"/>
+              </w:rPr>
+              <w:t>Sí</w:t>
+            </w:r>
+          </w:p>
+        </w:tc>
+      </w:tr>
+      <w:tr>
+        <w:tc>
+          <w:tcPr>
+            <w:tcW w:w="562" w:type="dxa"/>
+          </w:tcPr>
+          <w:p>
+            <w:pPr>
+              <w:spacing w:line="276" w:lineRule="auto"/>
+              <w:rPr>
+                <w:rFonts w:ascii="Cambria" w:hAnsi="Cambria"/>
+                <w:b/>
+                <w:bCs/>
+              </w:rPr>
+            </w:pPr>
+            <w:r>
+              <w:rPr>
+                <w:rFonts w:ascii="Cambria" w:hAnsi="Cambria"/>
+                <w:b/>
+                <w:bCs/>
+              </w:rPr>
+              <w:lastRenderedPageBreak/>
+              <w:t>10</w:t>
+            </w:r>
+          </w:p>
+        </w:tc>
+        <w:tc>
+          <w:tcPr>
+            <w:tcW w:w="2410" w:type="dxa"/>
+          </w:tcPr>
+          <w:p>
+            <w:pPr>
+              <w:spacing w:line="276" w:lineRule="auto"/>
+              <w:rPr>
+                <w:rFonts w:ascii="Cambria" w:hAnsi="Cambria"/>
+              </w:rPr>
+            </w:pPr>
+            <w:proofErr w:type="spellStart"/>
+            <w:r>
+              <w:rPr>
+                <w:rFonts w:ascii="Cambria" w:hAnsi="Cambria"/>
+              </w:rPr>
+              <w:t>pobreza_servicios</w:t>
+            </w:r>
+            <w:proofErr w:type="spellEnd"/>
+          </w:p>
+        </w:tc>
+        <w:tc>
+          <w:tcPr>
+            <w:tcW w:w="1276" w:type="dxa"/>
+          </w:tcPr>
+          <w:p>
+            <w:pPr>
+              <w:spacing w:line="276" w:lineRule="auto"/>
+              <w:rPr>
+                <w:rFonts w:ascii="Cambria" w:hAnsi="Cambria"/>
+              </w:rPr>
+            </w:pPr>
+            <w:r>
+              <w:rPr>
+                <w:rFonts w:ascii="Cambria" w:hAnsi="Cambria"/>
+              </w:rPr>
+              <w:t>INT</w:t>
+            </w:r>
+          </w:p>
+        </w:tc>
+        <w:tc>
+          <w:tcPr>
+            <w:tcW w:w="1701" w:type="dxa"/>
+          </w:tcPr>
+          <w:p>
+            <w:pPr>
+              <w:spacing w:line="276" w:lineRule="auto"/>
+              <w:rPr>
+                <w:rFonts w:ascii="Cambria" w:hAnsi="Cambria"/>
+              </w:rPr>
+            </w:pPr>
+            <w:r>
+              <w:rPr>
+                <w:rFonts w:ascii="Cambria" w:hAnsi="Cambria"/>
+              </w:rPr>
+              <w:t>Privación en dimensión Servicios.</w:t>
+            </w:r>
+          </w:p>
+        </w:tc>
+        <w:tc>
+          <w:tcPr>
+            <w:tcW w:w="1559" w:type="dxa"/>
+          </w:tcPr>
+          <w:p>
+            <w:pPr>
+              <w:spacing w:line="276" w:lineRule="auto"/>
+              <w:rPr>
+                <w:rFonts w:ascii="Cambria" w:hAnsi="Cambria"/>
+              </w:rPr>
+            </w:pPr>
+            <w:r>
+              <w:rPr>
+                <w:rFonts w:ascii="Cambria" w:hAnsi="Cambria"/>
+              </w:rPr>
+              <w:t>Solo valores 0 o 1.</w:t>
+            </w:r>
+          </w:p>
+        </w:tc>
+        <w:tc>
+          <w:tcPr>
+            <w:tcW w:w="1392" w:type="dxa"/>
+          </w:tcPr>
+          <w:p>
+            <w:pPr>
+              <w:spacing w:line="276" w:lineRule="auto"/>
+              <w:rPr>
+                <w:rFonts w:ascii="Cambria" w:hAnsi="Cambria"/>
+              </w:rPr>
+            </w:pPr>
+            <w:r>
+              <w:rPr>
+                <w:rFonts w:ascii="Cambria" w:hAnsi="Cambria"/>
+              </w:rPr>
+              <w:t>Sí</w:t>
+            </w:r>
+          </w:p>
+        </w:tc>
+      </w:tr>
+      <w:tr>
+        <w:tc>
+          <w:tcPr>
+            <w:tcW w:w="562" w:type="dxa"/>
+          </w:tcPr>
+          <w:p>
+            <w:pPr>
+              <w:spacing w:line="276" w:lineRule="auto"/>
+              <w:rPr>
+                <w:rFonts w:ascii="Cambria" w:hAnsi="Cambria"/>
+                <w:b/>
+                <w:bCs/>
+              </w:rPr>
+            </w:pPr>
+            <w:r>
+              <w:rPr>
+                <w:rFonts w:ascii="Cambria" w:hAnsi="Cambria"/>
+                <w:b/>
+                <w:bCs/>
+              </w:rPr>
+              <w:t>11</w:t>
+            </w:r>
+          </w:p>
+        </w:tc>
+        <w:tc>
+          <w:tcPr>
+            <w:tcW w:w="2410" w:type="dxa"/>
+          </w:tcPr>
+          <w:p>
+            <w:pPr>
+              <w:spacing w:line="276" w:lineRule="auto"/>
+              <w:rPr>
+                <w:rFonts w:ascii="Cambria" w:hAnsi="Cambria"/>
+              </w:rPr>
+            </w:pPr>
+            <w:proofErr w:type="spellStart"/>
+            <w:r>
+              <w:rPr>
+                <w:rFonts w:ascii="Cambria" w:hAnsi="Cambria"/>
+              </w:rPr>
+              <w:t>pobreza_hacinamiento</w:t>
+            </w:r>
+            <w:proofErr w:type="spellEnd"/>
+          </w:p>
+        </w:tc>
+        <w:tc>
+          <w:tcPr>
+            <w:tcW w:w="1276" w:type="dxa"/>
+          </w:tcPr>
+          <w:p>
+            <w:pPr>
+              <w:spacing w:line="276" w:lineRule="auto"/>
+              <w:rPr>
+                <w:rFonts w:ascii="Cambria" w:hAnsi="Cambria"/>
+              </w:rPr>
+            </w:pPr>
+            <w:r>
+              <w:rPr>
+                <w:rFonts w:ascii="Cambria" w:hAnsi="Cambria"/>
+              </w:rPr>
+              <w:t>INT</w:t>
+            </w:r>
+          </w:p>
+        </w:tc>
+        <w:tc>
+          <w:tcPr>
+            <w:tcW w:w="1701" w:type="dxa"/>
+          </w:tcPr>
+          <w:p>
+            <w:pPr>
+              <w:spacing w:line="276" w:lineRule="auto"/>
+              <w:rPr>
+                <w:rFonts w:ascii="Cambria" w:hAnsi="Cambria"/>
+              </w:rPr>
+            </w:pPr>
+            <w:r>
+              <w:rPr>
+                <w:rFonts w:ascii="Cambria" w:hAnsi="Cambria"/>
+              </w:rPr>
+              <w:t>Privación en dimensión Hacinamiento.</w:t>
+            </w:r>
+          </w:p>
+        </w:tc>
+        <w:tc>
+          <w:tcPr>
+            <w:tcW w:w="1559" w:type="dxa"/>
+          </w:tcPr>
+          <w:p>
+            <w:pPr>
+              <w:spacing w:line="276" w:lineRule="auto"/>
+              <w:rPr>
+                <w:rFonts w:ascii="Cambria" w:hAnsi="Cambria"/>
+              </w:rPr>
+            </w:pPr>
+            <w:r>
+              <w:rPr>
+                <w:rFonts w:ascii="Cambria" w:hAnsi="Cambria"/>
+              </w:rPr>
+              <w:t>Solo valores 0 o 1.</w:t>
+            </w:r>
+          </w:p>
+        </w:tc>
+        <w:tc>
+          <w:tcPr>
+            <w:tcW w:w="1392" w:type="dxa"/>
+          </w:tcPr>
+          <w:p>
+            <w:pPr>
+              <w:spacing w:line="276" w:lineRule="auto"/>
+              <w:rPr>
+                <w:rFonts w:ascii="Cambria" w:hAnsi="Cambria"/>
+              </w:rPr>
+            </w:pPr>
+            <w:r>
+              <w:rPr>
+                <w:rFonts w:ascii="Cambria" w:hAnsi="Cambria"/>
+              </w:rPr>
+              <w:t>Sí</w:t>
+            </w:r>
+          </w:p>
+        </w:tc>
+      </w:tr>
+      <w:tr>
+        <w:tc>
+          <w:tcPr>
+            <w:tcW w:w="562" w:type="dxa"/>
+          </w:tcPr>
+          <w:p>
+            <w:pPr>
+              <w:spacing w:line="276" w:lineRule="auto"/>
+              <w:rPr>
+                <w:rFonts w:ascii="Cambria" w:hAnsi="Cambria"/>
+                <w:b/>
+                <w:bCs/>
+              </w:rPr>
+            </w:pPr>
+            <w:r>
+              <w:rPr>
+                <w:rFonts w:ascii="Cambria" w:hAnsi="Cambria"/>
+                <w:b/>
+                <w:bCs/>
+              </w:rPr>
+              <w:t>12</w:t>
+            </w:r>
+          </w:p>
+        </w:tc>
+        <w:tc>
+          <w:tcPr>
+            <w:tcW w:w="2410" w:type="dxa"/>
+          </w:tcPr>
+          <w:p>
+            <w:pPr>
+              <w:spacing w:line="276" w:lineRule="auto"/>
+              <w:rPr>
+                <w:rFonts w:ascii="Cambria" w:hAnsi="Cambria"/>
+              </w:rPr>
+            </w:pPr>
+            <w:proofErr w:type="spellStart"/>
+            <w:r>
+              <w:rPr>
+                <w:rFonts w:ascii="Cambria" w:hAnsi="Cambria"/>
+              </w:rPr>
+              <w:t>pobreza_dependencia</w:t>
+            </w:r>
+            <w:proofErr w:type="spellEnd"/>
+          </w:p>
+        </w:tc>
+        <w:tc>
+          <w:tcPr>
+            <w:tcW w:w="1276" w:type="dxa"/>
+          </w:tcPr>
+          <w:p>
+            <w:pPr>
+              <w:spacing w:line="276" w:lineRule="auto"/>
+              <w:rPr>
+                <w:rFonts w:ascii="Cambria" w:hAnsi="Cambria"/>
+              </w:rPr>
+            </w:pPr>
+            <w:r>
+              <w:rPr>
+                <w:rFonts w:ascii="Cambria" w:hAnsi="Cambria"/>
+              </w:rPr>
+              <w:t>INT</w:t>
+            </w:r>
+          </w:p>
+        </w:tc>
+        <w:tc>
+          <w:tcPr>
+            <w:tcW w:w="1701" w:type="dxa"/>
+          </w:tcPr>
+          <w:p>
+            <w:pPr>
+              <w:spacing w:line="276" w:lineRule="auto"/>
+              <w:rPr>
+                <w:rFonts w:ascii="Cambria" w:hAnsi="Cambria"/>
+              </w:rPr>
+            </w:pPr>
+            <w:r>
+              <w:rPr>
+                <w:rFonts w:ascii="Cambria" w:hAnsi="Cambria"/>
+              </w:rPr>
+              <w:t>Privación en dimensión Dependencia.</w:t>
+            </w:r>
+          </w:p>
+        </w:tc>
+        <w:tc>
+          <w:tcPr>
+            <w:tcW w:w="1559" w:type="dxa"/>
+          </w:tcPr>
+          <w:p>
+            <w:pPr>
+              <w:spacing w:line="276" w:lineRule="auto"/>
+              <w:rPr>
+                <w:rFonts w:ascii="Cambria" w:hAnsi="Cambria"/>
+              </w:rPr>
+            </w:pPr>
+            <w:r>
+              <w:rPr>
+                <w:rFonts w:ascii="Cambria" w:hAnsi="Cambria"/>
+              </w:rPr>
+              <w:t>Solo valores 0 o 1.</w:t>
+            </w:r>
+          </w:p>
+        </w:tc>
+        <w:tc>
+          <w:tcPr>
+            <w:tcW w:w="1392" w:type="dxa"/>
+          </w:tcPr>
+          <w:p>
+            <w:pPr>
+              <w:spacing w:line="276" w:lineRule="auto"/>
+              <w:rPr>
+                <w:rFonts w:ascii="Cambria" w:hAnsi="Cambria"/>
+              </w:rPr>
+            </w:pPr>
+            <w:r>
+              <w:rPr>
+                <w:rFonts w:ascii="Cambria" w:hAnsi="Cambria"/>
+              </w:rPr>
+              <w:t>Sí</w:t>
+            </w:r>
+          </w:p>
+        </w:tc>
+      </w:tr>
+      <w:tr>
+        <w:tc>
+          <w:tcPr>
+            <w:tcW w:w="562" w:type="dxa"/>
+          </w:tcPr>
+          <w:p>
+            <w:pPr>
+              <w:spacing w:line="276" w:lineRule="auto"/>
+              <w:rPr>
+                <w:rFonts w:ascii="Cambria" w:hAnsi="Cambria"/>
+                <w:b/>
+                <w:bCs/>
+              </w:rPr>
+            </w:pPr>
+            <w:r>
+              <w:rPr>
+                <w:rFonts w:ascii="Cambria" w:hAnsi="Cambria"/>
+                <w:b/>
+                <w:bCs/>
+              </w:rPr>
+              <w:t>13</w:t>
+            </w:r>
+          </w:p>
+        </w:tc>
+        <w:tc>
+          <w:tcPr>
+            <w:tcW w:w="2410" w:type="dxa"/>
+          </w:tcPr>
+          <w:p>
+            <w:pPr>
+              <w:spacing w:line="276" w:lineRule="auto"/>
+              <w:rPr>
+                <w:rFonts w:ascii="Cambria" w:hAnsi="Cambria"/>
+              </w:rPr>
+            </w:pPr>
+            <w:proofErr w:type="spellStart"/>
+            <w:r>
+              <w:rPr>
+                <w:rFonts w:ascii="Cambria" w:hAnsi="Cambria"/>
+              </w:rPr>
+              <w:t>quintil_ingreso</w:t>
+            </w:r>
+            <w:proofErr w:type="spellEnd"/>
+          </w:p>
+        </w:tc>
+        <w:tc>
+          <w:tcPr>
+            <w:tcW w:w="1276" w:type="dxa"/>
+          </w:tcPr>
+          <w:p>
+            <w:pPr>
+              <w:spacing w:line="276" w:lineRule="auto"/>
+              <w:rPr>
+                <w:rFonts w:ascii="Cambria" w:hAnsi="Cambria"/>
+              </w:rPr>
+            </w:pPr>
+            <w:r>
+              <w:rPr>
+                <w:rFonts w:ascii="Cambria" w:hAnsi="Cambria"/>
+              </w:rPr>
+              <w:t>VARCHAR</w:t>
+            </w:r>
+          </w:p>
+        </w:tc>
+        <w:tc>
+          <w:tcPr>
+            <w:tcW w:w="1701" w:type="dxa"/>
+          </w:tcPr>
+          <w:p>
+            <w:pPr>
+              <w:spacing w:line="276" w:lineRule="auto"/>
+              <w:rPr>
+                <w:rFonts w:ascii="Cambria" w:hAnsi="Cambria"/>
+              </w:rPr>
+            </w:pPr>
+            <w:r>
+              <w:rPr>
+                <w:rFonts w:ascii="Cambria" w:hAnsi="Cambria"/>
+              </w:rPr>
+              <w:t>Segmento de ingreso per cápita (Q1 a Q5).</w:t>
+            </w:r>
+          </w:p>
+        </w:tc>
+        <w:tc>
+          <w:tcPr>
+            <w:tcW w:w="1559" w:type="dxa"/>
+          </w:tcPr>
+          <w:p>
+            <w:pPr>
+              <w:spacing w:line="276" w:lineRule="auto"/>
+              <w:rPr>
+                <w:rFonts w:ascii="Cambria" w:hAnsi="Cambria"/>
+              </w:rPr>
+            </w:pPr>
+            <w:r>
+              <w:rPr>
+                <w:rFonts w:ascii="Cambria" w:hAnsi="Cambria"/>
+              </w:rPr>
+              <w:t>Rango estricto de 'Q1' a 'Q5'</w:t>
+            </w:r>
+          </w:p>
+        </w:tc>
+        <w:tc>
+          <w:tcPr>
+            <w:tcW w:w="1392" w:type="dxa"/>
+          </w:tcPr>
+          <w:p>
+            <w:pPr>
+              <w:spacing w:line="276" w:lineRule="auto"/>
+              <w:rPr>
+                <w:rFonts w:ascii="Cambria" w:hAnsi="Cambria"/>
+              </w:rPr>
+            </w:pPr>
+            <w:r>
+              <w:rPr>
+                <w:rFonts w:ascii="Cambria" w:hAnsi="Cambria"/>
+              </w:rPr>
+              <w:t>Sí</w:t>
+            </w:r>
+          </w:p>
+        </w:tc>
+      </w:tr>
+      <w:tr>
+        <w:tc>
+          <w:tcPr>
+            <w:tcW w:w="562" w:type="dxa"/>
+          </w:tcPr>
+          <w:p>
+            <w:pPr>
+              <w:spacing w:line="276" w:lineRule="auto"/>
+              <w:rPr>
+                <w:rFonts w:ascii="Cambria" w:hAnsi="Cambria"/>
+                <w:b/>
+                <w:bCs/>
+              </w:rPr>
+            </w:pPr>
+            <w:r>
+              <w:rPr>
+                <w:rFonts w:ascii="Cambria" w:hAnsi="Cambria"/>
+                <w:b/>
+                <w:bCs/>
+              </w:rPr>
+              <w:t>14</w:t>
+            </w:r>
+          </w:p>
+        </w:tc>
+        <w:tc>
+          <w:tcPr>
+            <w:tcW w:w="2410" w:type="dxa"/>
+          </w:tcPr>
+          <w:p>
+            <w:pPr>
+              <w:spacing w:line="276" w:lineRule="auto"/>
+              <w:rPr>
+                <w:rFonts w:ascii="Cambria" w:hAnsi="Cambria"/>
+              </w:rPr>
+            </w:pPr>
+            <w:proofErr w:type="spellStart"/>
+            <w:r>
+              <w:rPr>
+                <w:rFonts w:ascii="Cambria" w:hAnsi="Cambria"/>
+              </w:rPr>
+              <w:t>factor_expansion</w:t>
+            </w:r>
+            <w:proofErr w:type="spellEnd"/>
+          </w:p>
+        </w:tc>
+        <w:tc>
+          <w:tcPr>
+            <w:tcW w:w="1276" w:type="dxa"/>
+          </w:tcPr>
+          <w:p>
+            <w:pPr>
+              <w:spacing w:line="276" w:lineRule="auto"/>
+              <w:rPr>
+                <w:rFonts w:ascii="Cambria" w:hAnsi="Cambria"/>
+              </w:rPr>
+            </w:pPr>
+            <w:r>
+              <w:rPr>
+                <w:rFonts w:ascii="Cambria" w:hAnsi="Cambria"/>
+              </w:rPr>
+              <w:t>DECIMAL</w:t>
+            </w:r>
+          </w:p>
+        </w:tc>
+        <w:tc>
+          <w:tcPr>
+            <w:tcW w:w="1701" w:type="dxa"/>
+          </w:tcPr>
+          <w:p>
+            <w:pPr>
+              <w:spacing w:line="276" w:lineRule="auto"/>
+              <w:rPr>
+                <w:rFonts w:ascii="Cambria" w:hAnsi="Cambria"/>
+              </w:rPr>
+            </w:pPr>
+            <w:r>
+              <w:rPr>
+                <w:rFonts w:ascii="Cambria" w:hAnsi="Cambria"/>
+              </w:rPr>
+              <w:t>Peso de muestra para proyección nacional.</w:t>
+            </w:r>
+          </w:p>
+        </w:tc>
+        <w:tc>
+          <w:tcPr>
+            <w:tcW w:w="1559" w:type="dxa"/>
+          </w:tcPr>
+          <w:p>
+            <w:pPr>
+              <w:spacing w:line="276" w:lineRule="auto"/>
+              <w:rPr>
+                <w:rFonts w:ascii="Cambria" w:hAnsi="Cambria"/>
+              </w:rPr>
+            </w:pPr>
+            <w:r>
+              <w:rPr>
+                <w:rFonts w:ascii="Cambria" w:hAnsi="Cambria"/>
+              </w:rPr>
+              <w:t>Mayor a 0. No nulo.</w:t>
+            </w:r>
+          </w:p>
+        </w:tc>
+        <w:tc>
+          <w:tcPr>
+            <w:tcW w:w="1392" w:type="dxa"/>
+          </w:tcPr>
+          <w:p>
+            <w:pPr>
+              <w:spacing w:line="276" w:lineRule="auto"/>
               <w:rPr>
                 <w:rFonts w:ascii="Cambria" w:hAnsi="Cambria"/>
               </w:rPr>
@@ -2985,14 +4133,14 @@
         <w:tblLook w:val="04A0" w:firstRow="1" w:lastRow="0" w:firstColumn="1" w:lastColumn="0" w:noHBand="0" w:noVBand="1"/>
       </w:tblPr>
       <w:tblGrid>
-        <w:gridCol w:w="3256"/>
-        <w:gridCol w:w="2976"/>
-        <w:gridCol w:w="2262"/>
+        <w:gridCol w:w="1717"/>
+        <w:gridCol w:w="3523"/>
+        <w:gridCol w:w="3254"/>
       </w:tblGrid>
       <w:tr>
         <w:tc>
           <w:tcPr>
-            <w:tcW w:w="3256" w:type="dxa"/>
+            <w:tcW w:w="1717" w:type="dxa"/>
             <w:hideMark/>
           </w:tcPr>
           <w:p>
@@ -3015,7 +4163,7 @@
         </w:tc>
         <w:tc>
           <w:tcPr>
-            <w:tcW w:w="2976" w:type="dxa"/>
+            <w:tcW w:w="3523" w:type="dxa"/>
             <w:hideMark/>
           </w:tcPr>
           <w:p>
@@ -3038,7 +4186,7 @@
         </w:tc>
         <w:tc>
           <w:tcPr>
-            <w:tcW w:w="2262" w:type="dxa"/>
+            <w:tcW w:w="3254" w:type="dxa"/>
             <w:hideMark/>
           </w:tcPr>
           <w:p>
@@ -3063,7 +4211,7 @@
       <w:tr>
         <w:tc>
           <w:tcPr>
-            <w:tcW w:w="3256" w:type="dxa"/>
+            <w:tcW w:w="1717" w:type="dxa"/>
             <w:hideMark/>
           </w:tcPr>
           <w:p>
@@ -3085,59 +4233,45 @@
               <w:rPr>
                 <w:rFonts w:ascii="Cambria" w:hAnsi="Cambria"/>
               </w:rPr>
-              <w:t xml:space="preserve"> </w:t>
-            </w:r>
-            <w:r>
-              <w:rPr>
-                <w:rFonts w:ascii="Cambria" w:hAnsi="Cambria"/>
-                <w:i/>
-                <w:iCs/>
-              </w:rPr>
-              <w:t>(Qué tan recientes son)</w:t>
-            </w:r>
-            <w:r>
-              <w:rPr>
-                <w:rFonts w:ascii="Cambria" w:hAnsi="Cambria"/>
-              </w:rPr>
-              <w:t xml:space="preserve"> </w:t>
-            </w:r>
-          </w:p>
-        </w:tc>
-        <w:tc>
-          <w:tcPr>
-            <w:tcW w:w="2976" w:type="dxa"/>
-          </w:tcPr>
-          <w:p>
-            <w:pPr>
-              <w:spacing w:after="160" w:line="276" w:lineRule="auto"/>
-              <w:rPr>
-                <w:rFonts w:ascii="Cambria" w:hAnsi="Cambria"/>
-              </w:rPr>
-            </w:pPr>
-            <w:r>
-              <w:rPr>
-                <w:rFonts w:ascii="Cambria" w:hAnsi="Cambria"/>
-              </w:rPr>
-              <w:t>El tablero se actualizará con un desfase máximo de 30 días calendario tras la publicación oficial del cierre anual por parte del INEC.</w:t>
-            </w:r>
-          </w:p>
-        </w:tc>
-        <w:tc>
-          <w:tcPr>
-            <w:tcW w:w="2262" w:type="dxa"/>
-          </w:tcPr>
-          <w:p>
-            <w:pPr>
-              <w:spacing w:after="160" w:line="276" w:lineRule="auto"/>
-              <w:rPr>
-                <w:rFonts w:ascii="Cambria" w:hAnsi="Cambria"/>
-              </w:rPr>
-            </w:pPr>
-            <w:r>
-              <w:rPr>
-                <w:rFonts w:ascii="Cambria" w:hAnsi="Cambria"/>
-              </w:rPr>
-              <w:t xml:space="preserve">Comparación entre la fecha de publicación oficial del dataset anual en el portal del INEC y la fecha de carga del registro en la tabla </w:t>
+              <w:t xml:space="preserve">  </w:t>
+            </w:r>
+          </w:p>
+        </w:tc>
+        <w:tc>
+          <w:tcPr>
+            <w:tcW w:w="3523" w:type="dxa"/>
+          </w:tcPr>
+          <w:p>
+            <w:pPr>
+              <w:spacing w:after="160" w:line="276" w:lineRule="auto"/>
+              <w:rPr>
+                <w:rFonts w:ascii="Cambria" w:hAnsi="Cambria"/>
+              </w:rPr>
+            </w:pPr>
+            <w:r>
+              <w:rPr>
+                <w:rFonts w:ascii="Cambria" w:hAnsi="Cambria"/>
+              </w:rPr>
+              <w:t>Máximo 30 días calendario tras la publicación anual del INEC.</w:t>
+            </w:r>
+          </w:p>
+        </w:tc>
+        <w:tc>
+          <w:tcPr>
+            <w:tcW w:w="3254" w:type="dxa"/>
+          </w:tcPr>
+          <w:p>
+            <w:pPr>
+              <w:spacing w:after="160" w:line="276" w:lineRule="auto"/>
+              <w:rPr>
+                <w:rFonts w:ascii="Cambria" w:hAnsi="Cambria"/>
+              </w:rPr>
+            </w:pPr>
+            <w:r>
+              <w:rPr>
+                <w:rFonts w:ascii="Cambria" w:hAnsi="Cambria"/>
+              </w:rPr>
+              <w:t xml:space="preserve">Diferencia de días: Publicación del INEC vs. Carga final en </w:t>
             </w:r>
             <w:proofErr w:type="spellStart"/>
             <w:r>
@@ -3151,7 +4285,7 @@
               <w:rPr>
                 <w:rFonts w:ascii="Cambria" w:hAnsi="Cambria"/>
               </w:rPr>
-              <w:t xml:space="preserve"> en </w:t>
+              <w:t xml:space="preserve"> de </w:t>
             </w:r>
             <w:proofErr w:type="spellStart"/>
             <w:r>
@@ -3173,7 +4307,7 @@
       <w:tr>
         <w:tc>
           <w:tcPr>
-            <w:tcW w:w="3256" w:type="dxa"/>
+            <w:tcW w:w="1717" w:type="dxa"/>
             <w:hideMark/>
           </w:tcPr>
           <w:p>
@@ -3197,85 +4331,43 @@
               </w:rPr>
               <w:t xml:space="preserve"> </w:t>
             </w:r>
-            <w:r>
-              <w:rPr>
-                <w:rFonts w:ascii="Cambria" w:hAnsi="Cambria"/>
-                <w:i/>
-                <w:iCs/>
-              </w:rPr>
-              <w:t>(Tiempo de disponibilidad</w:t>
-            </w:r>
-            <w:r>
-              <w:rPr>
-                <w:rFonts w:ascii="Cambria" w:hAnsi="Cambria"/>
-                <w:i/>
-                <w:iCs/>
-              </w:rPr>
-              <w:t xml:space="preserve"> desde el origen</w:t>
-            </w:r>
-            <w:r>
-              <w:rPr>
-                <w:rFonts w:ascii="Cambria" w:hAnsi="Cambria"/>
-                <w:i/>
-                <w:iCs/>
-              </w:rPr>
-              <w:t>)</w:t>
-            </w:r>
-            <w:r>
-              <w:rPr>
-                <w:rFonts w:ascii="Cambria" w:hAnsi="Cambria"/>
-              </w:rPr>
-              <w:t xml:space="preserve"> </w:t>
-            </w:r>
-          </w:p>
-        </w:tc>
-        <w:tc>
-          <w:tcPr>
-            <w:tcW w:w="2976" w:type="dxa"/>
-          </w:tcPr>
-          <w:p>
-            <w:pPr>
-              <w:spacing w:after="160" w:line="276" w:lineRule="auto"/>
-              <w:rPr>
-                <w:rFonts w:ascii="Cambria" w:hAnsi="Cambria"/>
-              </w:rPr>
-            </w:pPr>
-            <w:r>
-              <w:rPr>
-                <w:rFonts w:ascii="Cambria" w:hAnsi="Cambria"/>
-              </w:rPr>
-              <w:t>Menor a 12 horas</w:t>
-            </w:r>
-            <w:r>
-              <w:rPr>
-                <w:rFonts w:ascii="Cambria" w:hAnsi="Cambria"/>
-              </w:rPr>
-              <w:t>. U</w:t>
-            </w:r>
-            <w:r>
-              <w:rPr>
-                <w:rFonts w:ascii="Cambria" w:hAnsi="Cambria"/>
-              </w:rPr>
-              <w:t>na vez que el archivo anual se coloca en el origen, el tablero se actualiza el mismo día.</w:t>
-            </w:r>
-          </w:p>
-        </w:tc>
-        <w:tc>
-          <w:tcPr>
-            <w:tcW w:w="2262" w:type="dxa"/>
-          </w:tcPr>
-          <w:p>
-            <w:pPr>
-              <w:spacing w:after="160" w:line="276" w:lineRule="auto"/>
-              <w:rPr>
-                <w:rFonts w:ascii="Cambria" w:hAnsi="Cambria"/>
-              </w:rPr>
-            </w:pPr>
-            <w:r>
-              <w:rPr>
-                <w:rFonts w:ascii="Cambria" w:hAnsi="Cambria"/>
-              </w:rPr>
-              <w:t xml:space="preserve">Diferencia de tiempo entre el inicio de la ejecución del Pipeline en </w:t>
+          </w:p>
+        </w:tc>
+        <w:tc>
+          <w:tcPr>
+            <w:tcW w:w="3523" w:type="dxa"/>
+          </w:tcPr>
+          <w:p>
+            <w:pPr>
+              <w:spacing w:after="160" w:line="276" w:lineRule="auto"/>
+              <w:rPr>
+                <w:rFonts w:ascii="Cambria" w:hAnsi="Cambria"/>
+              </w:rPr>
+            </w:pPr>
+            <w:r>
+              <w:rPr>
+                <w:rFonts w:ascii="Cambria" w:hAnsi="Cambria"/>
+              </w:rPr>
+              <w:t>Menor a 12 horas desde la disponibilidad del archivo origen.</w:t>
+            </w:r>
+          </w:p>
+        </w:tc>
+        <w:tc>
+          <w:tcPr>
+            <w:tcW w:w="3254" w:type="dxa"/>
+          </w:tcPr>
+          <w:p>
+            <w:pPr>
+              <w:spacing w:after="160" w:line="276" w:lineRule="auto"/>
+              <w:rPr>
+                <w:rFonts w:ascii="Cambria" w:hAnsi="Cambria"/>
+              </w:rPr>
+            </w:pPr>
+            <w:r>
+              <w:rPr>
+                <w:rFonts w:ascii="Cambria" w:hAnsi="Cambria"/>
+              </w:rPr>
+              <w:t xml:space="preserve">Tiempo transcurrido entre el inicio del pipeline en </w:t>
             </w:r>
             <w:proofErr w:type="spellStart"/>
             <w:r>
@@ -3289,21 +4381,7 @@
               <w:rPr>
                 <w:rFonts w:ascii="Cambria" w:hAnsi="Cambria"/>
               </w:rPr>
-              <w:t xml:space="preserve"> y los modelos dimensionales en </w:t>
-            </w:r>
-            <w:proofErr w:type="spellStart"/>
-            <w:r>
-              <w:rPr>
-                <w:rFonts w:ascii="Cambria" w:hAnsi="Cambria"/>
-              </w:rPr>
-              <w:t>Snowflake</w:t>
-            </w:r>
-            <w:proofErr w:type="spellEnd"/>
-            <w:r>
-              <w:rPr>
-                <w:rFonts w:ascii="Cambria" w:hAnsi="Cambria"/>
-              </w:rPr>
-              <w:t xml:space="preserve"> y el Tablero.</w:t>
+              <w:t xml:space="preserve"> y la actualización del tablero.</w:t>
             </w:r>
           </w:p>
         </w:tc>
@@ -3311,7 +4389,7 @@
       <w:tr>
         <w:tc>
           <w:tcPr>
-            <w:tcW w:w="3256" w:type="dxa"/>
+            <w:tcW w:w="1717" w:type="dxa"/>
             <w:hideMark/>
           </w:tcPr>
           <w:p>
@@ -3329,69 +4407,81 @@
               </w:rPr>
               <w:t>Completitud</w:t>
             </w:r>
-            <w:r>
-              <w:rPr>
-                <w:rFonts w:ascii="Cambria" w:hAnsi="Cambria"/>
+          </w:p>
+        </w:tc>
+        <w:tc>
+          <w:tcPr>
+            <w:tcW w:w="3523" w:type="dxa"/>
+          </w:tcPr>
+          <w:p>
+            <w:pPr>
+              <w:spacing w:after="160" w:line="276" w:lineRule="auto"/>
+              <w:rPr>
+                <w:rFonts w:ascii="Cambria" w:hAnsi="Cambria"/>
+                <w:lang w:val="es-ES"/>
+              </w:rPr>
+            </w:pPr>
+            <w:r>
+              <w:rPr>
+                <w:rFonts w:ascii="Cambria" w:hAnsi="Cambria"/>
+                <w:lang w:val="es-ES"/>
+              </w:rPr>
+              <w:t>100% en indicadores clave y DPA;</w:t>
+            </w:r>
+            <w:r>
+              <w:rPr>
+                <w:rFonts w:ascii="Cambria" w:hAnsi="Cambria"/>
+                <w:lang w:val="es-ES"/>
               </w:rPr>
               <w:t xml:space="preserve"> </w:t>
             </w:r>
             <w:r>
               <w:rPr>
                 <w:rFonts w:ascii="Cambria" w:hAnsi="Cambria"/>
-                <w:i/>
-                <w:iCs/>
-              </w:rPr>
-              <w:t>(% de campos sin nulos)</w:t>
-            </w:r>
-            <w:r>
-              <w:rPr>
-                <w:rFonts w:ascii="Cambria" w:hAnsi="Cambria"/>
+                <w:lang w:val="es-ES"/>
+              </w:rPr>
+              <w:t>&gt;95</w:t>
+            </w:r>
+            <w:r>
+              <w:rPr>
+                <w:rFonts w:ascii="Cambria" w:hAnsi="Cambria"/>
+                <w:lang w:val="es-ES"/>
               </w:rPr>
               <w:t xml:space="preserve"> </w:t>
             </w:r>
-          </w:p>
-        </w:tc>
-        <w:tc>
-          <w:tcPr>
-            <w:tcW w:w="2976" w:type="dxa"/>
-          </w:tcPr>
-          <w:p>
-            <w:pPr>
-              <w:spacing w:after="160" w:line="276" w:lineRule="auto"/>
-              <w:rPr>
-                <w:rFonts w:ascii="Cambria" w:hAnsi="Cambria"/>
-              </w:rPr>
-            </w:pPr>
-            <w:r>
-              <w:rPr>
-                <w:rFonts w:ascii="Cambria" w:hAnsi="Cambria"/>
-              </w:rPr>
-              <w:t>100% para los 9 indicadores clave de pobreza y la llave geográfica (DPA); &gt; 95% para campos descriptivos.</w:t>
-            </w:r>
-          </w:p>
-        </w:tc>
-        <w:tc>
-          <w:tcPr>
-            <w:tcW w:w="2262" w:type="dxa"/>
-          </w:tcPr>
-          <w:p>
-            <w:pPr>
-              <w:spacing w:after="160" w:line="276" w:lineRule="auto"/>
-              <w:rPr>
-                <w:rFonts w:ascii="Cambria" w:hAnsi="Cambria"/>
-              </w:rPr>
-            </w:pPr>
-            <w:r>
-              <w:rPr>
-                <w:rFonts w:ascii="Cambria" w:hAnsi="Cambria"/>
-              </w:rPr>
-              <w:t>Consultas</w:t>
-            </w:r>
-            <w:r>
-              <w:rPr>
-                <w:rFonts w:ascii="Cambria" w:hAnsi="Cambria"/>
-              </w:rPr>
-              <w:t xml:space="preserve"> de perfilado que cuenten (Total Nulos / Total Filas) * 100 antes de la carga final.</w:t>
+            <w:r>
+              <w:rPr>
+                <w:rFonts w:ascii="Cambria" w:hAnsi="Cambria"/>
+                <w:lang w:val="es-ES"/>
+              </w:rPr>
+              <w:t>en campos descriptivos.</w:t>
+            </w:r>
+          </w:p>
+          <w:p>
+            <w:pPr>
+              <w:spacing w:after="160" w:line="276" w:lineRule="auto"/>
+              <w:rPr>
+                <w:rFonts w:ascii="Cambria" w:hAnsi="Cambria"/>
+              </w:rPr>
+            </w:pPr>
+          </w:p>
+        </w:tc>
+        <w:tc>
+          <w:tcPr>
+            <w:tcW w:w="3254" w:type="dxa"/>
+          </w:tcPr>
+          <w:p>
+            <w:pPr>
+              <w:spacing w:after="160" w:line="276" w:lineRule="auto"/>
+              <w:rPr>
+                <w:rFonts w:ascii="Cambria" w:hAnsi="Cambria"/>
+              </w:rPr>
+            </w:pPr>
+            <w:r>
+              <w:rPr>
+                <w:rFonts w:ascii="Cambria" w:hAnsi="Cambria"/>
+              </w:rPr>
+              <w:t>(Total Nulos / Total Filas) * 100 antes de la carga final.</w:t>
             </w:r>
           </w:p>
         </w:tc>
@@ -3399,7 +4489,7 @@
       <w:tr>
         <w:tc>
           <w:tcPr>
-            <w:tcW w:w="3256" w:type="dxa"/>
+            <w:tcW w:w="1717" w:type="dxa"/>
             <w:hideMark/>
           </w:tcPr>
           <w:p>
@@ -3415,66 +4505,45 @@
                 <w:b/>
                 <w:bCs/>
               </w:rPr>
-              <w:lastRenderedPageBreak/>
               <w:t>Exactitud</w:t>
             </w:r>
-            <w:r>
-              <w:rPr>
-                <w:rFonts w:ascii="Cambria" w:hAnsi="Cambria"/>
-              </w:rPr>
-              <w:t xml:space="preserve"> </w:t>
-            </w:r>
-            <w:r>
-              <w:rPr>
-                <w:rFonts w:ascii="Cambria" w:hAnsi="Cambria"/>
-                <w:i/>
-                <w:iCs/>
-              </w:rPr>
-              <w:t>(% sin errores de negocio)</w:t>
-            </w:r>
-            <w:r>
-              <w:rPr>
-                <w:rFonts w:ascii="Cambria" w:hAnsi="Cambria"/>
-              </w:rPr>
-              <w:t xml:space="preserve"> </w:t>
-            </w:r>
-          </w:p>
-        </w:tc>
-        <w:tc>
-          <w:tcPr>
-            <w:tcW w:w="2976" w:type="dxa"/>
-          </w:tcPr>
-          <w:p>
-            <w:pPr>
-              <w:spacing w:after="160" w:line="276" w:lineRule="auto"/>
-              <w:rPr>
-                <w:rFonts w:ascii="Cambria" w:hAnsi="Cambria"/>
-              </w:rPr>
-            </w:pPr>
-            <w:r>
-              <w:rPr>
-                <w:rFonts w:ascii="Cambria" w:hAnsi="Cambria"/>
-              </w:rPr>
-              <w:t>100% de consistencia geográfica (provincia-cantón-parroquia) y 0% de valores de ingresos negativos.</w:t>
-            </w:r>
-          </w:p>
-        </w:tc>
-        <w:tc>
-          <w:tcPr>
-            <w:tcW w:w="2262" w:type="dxa"/>
-          </w:tcPr>
-          <w:p>
-            <w:pPr>
-              <w:spacing w:after="160" w:line="276" w:lineRule="auto"/>
-              <w:rPr>
-                <w:rFonts w:ascii="Cambria" w:hAnsi="Cambria"/>
-              </w:rPr>
-            </w:pPr>
-            <w:r>
-              <w:rPr>
-                <w:rFonts w:ascii="Cambria" w:hAnsi="Cambria"/>
-              </w:rPr>
-              <w:t>Reporte de validación cruzada: LEFT JOIN entre los datos procesados y el catálogo DPA de datos.gob.ec para identificar registros huérfanos o anómalos.</w:t>
+          </w:p>
+        </w:tc>
+        <w:tc>
+          <w:tcPr>
+            <w:tcW w:w="3523" w:type="dxa"/>
+          </w:tcPr>
+          <w:p>
+            <w:pPr>
+              <w:spacing w:after="160" w:line="276" w:lineRule="auto"/>
+              <w:rPr>
+                <w:rFonts w:ascii="Cambria" w:hAnsi="Cambria"/>
+              </w:rPr>
+            </w:pPr>
+            <w:r>
+              <w:rPr>
+                <w:rFonts w:ascii="Cambria" w:hAnsi="Cambria"/>
+              </w:rPr>
+              <w:t>100% consistencia geográfica (DPA) y 0% ingresos negativos.</w:t>
+            </w:r>
+          </w:p>
+        </w:tc>
+        <w:tc>
+          <w:tcPr>
+            <w:tcW w:w="3254" w:type="dxa"/>
+          </w:tcPr>
+          <w:p>
+            <w:pPr>
+              <w:spacing w:after="160" w:line="276" w:lineRule="auto"/>
+              <w:rPr>
+                <w:rFonts w:ascii="Cambria" w:hAnsi="Cambria"/>
+              </w:rPr>
+            </w:pPr>
+            <w:r>
+              <w:rPr>
+                <w:rFonts w:ascii="Cambria" w:hAnsi="Cambria"/>
+              </w:rPr>
+              <w:t>Validación cruzada: LEFT JOIN contra el catálogo maestro de datos.gob.ec para detectar huérfanos.</w:t>
             </w:r>
           </w:p>
         </w:tc>
@@ -3482,7 +4551,7 @@
       <w:tr>
         <w:tc>
           <w:tcPr>
-            <w:tcW w:w="3256" w:type="dxa"/>
+            <w:tcW w:w="1717" w:type="dxa"/>
             <w:hideMark/>
           </w:tcPr>
           <w:p>
@@ -3500,63 +4569,43 @@
               </w:rPr>
               <w:t>Disponibilidad</w:t>
             </w:r>
-            <w:r>
-              <w:rPr>
-                <w:rFonts w:ascii="Cambria" w:hAnsi="Cambria"/>
-              </w:rPr>
-              <w:t xml:space="preserve"> </w:t>
-            </w:r>
-            <w:r>
-              <w:rPr>
-                <w:rFonts w:ascii="Cambria" w:hAnsi="Cambria"/>
-                <w:i/>
-                <w:iCs/>
-              </w:rPr>
-              <w:t>(Uptime del producto)</w:t>
-            </w:r>
-            <w:r>
-              <w:rPr>
-                <w:rFonts w:ascii="Cambria" w:hAnsi="Cambria"/>
-              </w:rPr>
-              <w:t xml:space="preserve"> </w:t>
-            </w:r>
-          </w:p>
-        </w:tc>
-        <w:tc>
-          <w:tcPr>
-            <w:tcW w:w="2976" w:type="dxa"/>
-          </w:tcPr>
-          <w:p>
-            <w:pPr>
-              <w:spacing w:after="160" w:line="276" w:lineRule="auto"/>
-              <w:rPr>
-                <w:rFonts w:ascii="Cambria" w:hAnsi="Cambria"/>
-              </w:rPr>
-            </w:pPr>
-            <w:r>
-              <w:rPr>
-                <w:rFonts w:ascii="Cambria" w:hAnsi="Cambria"/>
-              </w:rPr>
-              <w:t>99% de disponibilidad del tablero coroplético y del modelo analítico durante el Demo Day y horario laboral.</w:t>
-            </w:r>
-          </w:p>
-        </w:tc>
-        <w:tc>
-          <w:tcPr>
-            <w:tcW w:w="2262" w:type="dxa"/>
-          </w:tcPr>
-          <w:p>
-            <w:pPr>
-              <w:spacing w:after="160" w:line="276" w:lineRule="auto"/>
-              <w:rPr>
-                <w:rFonts w:ascii="Cambria" w:hAnsi="Cambria"/>
-              </w:rPr>
-            </w:pPr>
-            <w:r>
-              <w:rPr>
-                <w:rFonts w:ascii="Cambria" w:hAnsi="Cambria"/>
-              </w:rPr>
-              <w:t xml:space="preserve">Monitoreo del estado de los servicios en la nube de </w:t>
+          </w:p>
+        </w:tc>
+        <w:tc>
+          <w:tcPr>
+            <w:tcW w:w="3523" w:type="dxa"/>
+          </w:tcPr>
+          <w:p>
+            <w:pPr>
+              <w:spacing w:after="160" w:line="276" w:lineRule="auto"/>
+              <w:rPr>
+                <w:rFonts w:ascii="Cambria" w:hAnsi="Cambria"/>
+              </w:rPr>
+            </w:pPr>
+            <w:r>
+              <w:rPr>
+                <w:rFonts w:ascii="Cambria" w:hAnsi="Cambria"/>
+              </w:rPr>
+              <w:t>99% de uptime del tablero y modelo analítico durante horas laborales y Demo Day.</w:t>
+            </w:r>
+          </w:p>
+        </w:tc>
+        <w:tc>
+          <w:tcPr>
+            <w:tcW w:w="3254" w:type="dxa"/>
+          </w:tcPr>
+          <w:p>
+            <w:pPr>
+              <w:spacing w:after="160" w:line="276" w:lineRule="auto"/>
+              <w:rPr>
+                <w:rFonts w:ascii="Cambria" w:hAnsi="Cambria"/>
+              </w:rPr>
+            </w:pPr>
+            <w:r>
+              <w:rPr>
+                <w:rFonts w:ascii="Cambria" w:hAnsi="Cambria"/>
+              </w:rPr>
+              <w:t xml:space="preserve">Monitoreo del estado de servicios en la nube de </w:t>
             </w:r>
             <w:proofErr w:type="spellStart"/>
             <w:r>
@@ -3570,13 +4619,7 @@
               <w:rPr>
                 <w:rFonts w:ascii="Cambria" w:hAnsi="Cambria"/>
               </w:rPr>
-              <w:t xml:space="preserve"> y la visualización del tablero</w:t>
-            </w:r>
-            <w:r>
-              <w:rPr>
-                <w:rFonts w:ascii="Cambria" w:hAnsi="Cambria"/>
-              </w:rPr>
-              <w:t>.</w:t>
+              <w:t xml:space="preserve"> y accesibilidad en Power BI.</w:t>
             </w:r>
           </w:p>
         </w:tc>
@@ -3584,7 +4627,7 @@
       <w:tr>
         <w:tc>
           <w:tcPr>
-            <w:tcW w:w="3256" w:type="dxa"/>
+            <w:tcW w:w="1717" w:type="dxa"/>
           </w:tcPr>
           <w:p>
             <w:pPr>
@@ -3607,7 +4650,7 @@
         </w:tc>
         <w:tc>
           <w:tcPr>
-            <w:tcW w:w="2976" w:type="dxa"/>
+            <w:tcW w:w="3523" w:type="dxa"/>
           </w:tcPr>
           <w:p>
             <w:pPr>
@@ -3620,13 +4663,13 @@
               <w:rPr>
                 <w:rFonts w:ascii="Cambria" w:hAnsi="Cambria"/>
               </w:rPr>
-              <w:t>Anual (Sujeto estrictamente al ciclo de encuestas oficial de la ENEMDU).</w:t>
-            </w:r>
-          </w:p>
-        </w:tc>
-        <w:tc>
-          <w:tcPr>
-            <w:tcW w:w="2262" w:type="dxa"/>
+              <w:t>Anual (Sujeto al ciclo de publicación de la ENEMDU).</w:t>
+            </w:r>
+          </w:p>
+        </w:tc>
+        <w:tc>
+          <w:tcPr>
+            <w:tcW w:w="3254" w:type="dxa"/>
           </w:tcPr>
           <w:p>
             <w:pPr>
@@ -3639,21 +4682,7 @@
               <w:rPr>
                 <w:rFonts w:ascii="Cambria" w:hAnsi="Cambria"/>
               </w:rPr>
-              <w:t xml:space="preserve">Revisión del calendario de ejecución de los </w:t>
-            </w:r>
-            <w:r>
-              <w:rPr>
-                <w:rFonts w:ascii="Cambria" w:hAnsi="Cambria"/>
-                <w:i/>
-                <w:iCs/>
-              </w:rPr>
-              <w:t>Jobs</w:t>
-            </w:r>
-            <w:r>
-              <w:rPr>
-                <w:rFonts w:ascii="Cambria" w:hAnsi="Cambria"/>
-              </w:rPr>
-              <w:t xml:space="preserve"> orquestados para la ingesta y transformación</w:t>
+              <w:t>Auditoría del calendario de ejecución de los Jobs orquestados en el pipeline.</w:t>
             </w:r>
           </w:p>
         </w:tc>
@@ -3683,6 +4712,7 @@
           <w:bCs/>
           <w:lang w:val="es-MX"/>
         </w:rPr>
+        <w:lastRenderedPageBreak/>
         <w:t xml:space="preserve">6.- </w:t>
       </w:r>
       <w:r>
@@ -3703,8 +4733,8 @@
         <w:tblLook w:val="04A0" w:firstRow="1" w:lastRow="0" w:firstColumn="1" w:lastColumn="0" w:noHBand="0" w:noVBand="1"/>
       </w:tblPr>
       <w:tblGrid>
-        <w:gridCol w:w="6228"/>
-        <w:gridCol w:w="2266"/>
+        <w:gridCol w:w="4106"/>
+        <w:gridCol w:w="4388"/>
       </w:tblGrid>
       <w:tr>
         <w:trPr>
@@ -3712,7 +4742,7 @@
         </w:trPr>
         <w:tc>
           <w:tcPr>
-            <w:tcW w:w="6238" w:type="dxa"/>
+            <w:tcW w:w="4106" w:type="dxa"/>
             <w:hideMark/>
           </w:tcPr>
           <w:p>
@@ -3736,7 +4766,7 @@
         </w:tc>
         <w:tc>
           <w:tcPr>
-            <w:tcW w:w="2268" w:type="dxa"/>
+            <w:tcW w:w="4388" w:type="dxa"/>
             <w:hideMark/>
           </w:tcPr>
           <w:p>
@@ -3765,7 +4795,7 @@
         </w:trPr>
         <w:tc>
           <w:tcPr>
-            <w:tcW w:w="6238" w:type="dxa"/>
+            <w:tcW w:w="4106" w:type="dxa"/>
           </w:tcPr>
           <w:p>
             <w:pPr>
@@ -3788,20 +4818,20 @@
         </w:tc>
         <w:tc>
           <w:tcPr>
-            <w:tcW w:w="2268" w:type="dxa"/>
-          </w:tcPr>
-          <w:p>
-            <w:pPr>
-              <w:spacing w:after="160" w:line="276" w:lineRule="auto"/>
-              <w:rPr>
-                <w:rFonts w:ascii="Cambria" w:hAnsi="Cambria"/>
-              </w:rPr>
-            </w:pPr>
-            <w:r>
-              <w:rPr>
-                <w:rFonts w:ascii="Cambria" w:hAnsi="Cambria"/>
-              </w:rPr>
-              <w:t>Correo electrónico del Data Product Owner</w:t>
+            <w:tcW w:w="4388" w:type="dxa"/>
+          </w:tcPr>
+          <w:p>
+            <w:pPr>
+              <w:spacing w:after="160" w:line="276" w:lineRule="auto"/>
+              <w:rPr>
+                <w:rFonts w:ascii="Cambria" w:hAnsi="Cambria"/>
+              </w:rPr>
+            </w:pPr>
+            <w:r>
+              <w:rPr>
+                <w:rFonts w:ascii="Cambria" w:hAnsi="Cambria"/>
+              </w:rPr>
+              <w:t>soporte.datos@grupo2.com</w:t>
             </w:r>
           </w:p>
         </w:tc>
@@ -3812,7 +4842,7 @@
         </w:trPr>
         <w:tc>
           <w:tcPr>
-            <w:tcW w:w="6238" w:type="dxa"/>
+            <w:tcW w:w="4106" w:type="dxa"/>
           </w:tcPr>
           <w:p>
             <w:pPr>
@@ -3835,7 +4865,7 @@
         </w:tc>
         <w:tc>
           <w:tcPr>
-            <w:tcW w:w="2268" w:type="dxa"/>
+            <w:tcW w:w="4388" w:type="dxa"/>
           </w:tcPr>
           <w:p>
             <w:pPr>
@@ -3909,7 +4939,7 @@
         </w:trPr>
         <w:tc>
           <w:tcPr>
-            <w:tcW w:w="6238" w:type="dxa"/>
+            <w:tcW w:w="4106" w:type="dxa"/>
           </w:tcPr>
           <w:p>
             <w:pPr>
@@ -3932,7 +4962,7 @@
         </w:tc>
         <w:tc>
           <w:tcPr>
-            <w:tcW w:w="2268" w:type="dxa"/>
+            <w:tcW w:w="4388" w:type="dxa"/>
           </w:tcPr>
           <w:p>
             <w:pPr>
@@ -3950,7 +4980,7 @@
         </w:trPr>
         <w:tc>
           <w:tcPr>
-            <w:tcW w:w="6238" w:type="dxa"/>
+            <w:tcW w:w="4106" w:type="dxa"/>
           </w:tcPr>
           <w:p>
             <w:pPr>
@@ -3983,7 +5013,7 @@
         </w:tc>
         <w:tc>
           <w:tcPr>
-            <w:tcW w:w="2268" w:type="dxa"/>
+            <w:tcW w:w="4388" w:type="dxa"/>
           </w:tcPr>
           <w:p>
             <w:pPr>
@@ -4001,7 +5031,7 @@
         </w:trPr>
         <w:tc>
           <w:tcPr>
-            <w:tcW w:w="6238" w:type="dxa"/>
+            <w:tcW w:w="4106" w:type="dxa"/>
           </w:tcPr>
           <w:p>
             <w:pPr>
@@ -4024,7 +5054,7 @@
         </w:tc>
         <w:tc>
           <w:tcPr>
-            <w:tcW w:w="2268" w:type="dxa"/>
+            <w:tcW w:w="4388" w:type="dxa"/>
           </w:tcPr>
           <w:p>
             <w:pPr>
@@ -4118,16 +5148,6 @@
         </w:rPr>
         <w:t xml:space="preserve">TAGS Y CLASIFICACIÓN </w:t>
       </w:r>
-    </w:p>
-    <w:p>
-      <w:pPr>
-        <w:rPr>
-          <w:rFonts w:ascii="Cambria" w:hAnsi="Cambria"/>
-          <w:b/>
-          <w:bCs/>
-          <w:lang w:val="es-MX"/>
-        </w:rPr>
-      </w:pPr>
     </w:p>
     <w:p>
       <w:pPr>
@@ -4290,7 +5310,21 @@
         <w:rPr>
           <w:rFonts w:ascii="Cambria" w:hAnsi="Cambria"/>
         </w:rPr>
-        <w:t xml:space="preserve">] Público [ ] Interno </w:t>
+        <w:t xml:space="preserve">] Público </w:t>
+      </w:r>
+      <w:proofErr w:type="gramStart"/>
+      <w:r>
+        <w:rPr>
+          <w:rFonts w:ascii="Cambria" w:hAnsi="Cambria"/>
+        </w:rPr>
+        <w:t>[ ]</w:t>
+      </w:r>
+      <w:proofErr w:type="gramEnd"/>
+      <w:r>
+        <w:rPr>
+          <w:rFonts w:ascii="Cambria" w:hAnsi="Cambria"/>
+        </w:rPr>
+        <w:t xml:space="preserve"> Interno </w:t>
       </w:r>
       <w:r>
         <w:rPr>
@@ -4298,11 +5332,19 @@
         </w:rPr>
         <w:t xml:space="preserve">[] Confidencial </w:t>
       </w:r>
-      <w:r>
-        <w:rPr>
-          <w:rFonts w:ascii="Cambria" w:hAnsi="Cambria"/>
-        </w:rPr>
-        <w:t xml:space="preserve">[ ] Restringido </w:t>
+      <w:proofErr w:type="gramStart"/>
+      <w:r>
+        <w:rPr>
+          <w:rFonts w:ascii="Cambria" w:hAnsi="Cambria"/>
+        </w:rPr>
+        <w:t>[ ]</w:t>
+      </w:r>
+      <w:proofErr w:type="gramEnd"/>
+      <w:r>
+        <w:rPr>
+          <w:rFonts w:ascii="Cambria" w:hAnsi="Cambria"/>
+        </w:rPr>
+        <w:t xml:space="preserve"> Restringido </w:t>
       </w:r>
     </w:p>
     <w:p>
@@ -4325,7 +5367,35 @@
         <w:rPr>
           <w:rFonts w:ascii="Cambria" w:hAnsi="Cambria"/>
         </w:rPr>
-        <w:t xml:space="preserve"> [ ] Ninguna [ ] GDPR </w:t>
+        <w:t xml:space="preserve"> </w:t>
+      </w:r>
+      <w:proofErr w:type="gramStart"/>
+      <w:r>
+        <w:rPr>
+          <w:rFonts w:ascii="Cambria" w:hAnsi="Cambria"/>
+        </w:rPr>
+        <w:t>[ ]</w:t>
+      </w:r>
+      <w:proofErr w:type="gramEnd"/>
+      <w:r>
+        <w:rPr>
+          <w:rFonts w:ascii="Cambria" w:hAnsi="Cambria"/>
+        </w:rPr>
+        <w:t xml:space="preserve"> Ninguna </w:t>
+      </w:r>
+      <w:proofErr w:type="gramStart"/>
+      <w:r>
+        <w:rPr>
+          <w:rFonts w:ascii="Cambria" w:hAnsi="Cambria"/>
+        </w:rPr>
+        <w:t>[ ]</w:t>
+      </w:r>
+      <w:proofErr w:type="gramEnd"/>
+      <w:r>
+        <w:rPr>
+          <w:rFonts w:ascii="Cambria" w:hAnsi="Cambria"/>
+        </w:rPr>
+        <w:t xml:space="preserve"> GDPR </w:t>
       </w:r>
       <w:r>
         <w:rPr>
@@ -5311,6 +6381,16 @@
       </w:tblBorders>
     </w:tblPr>
   </w:style>
+  <w:style w:type="character" w:styleId="PlaceholderText">
+    <w:name w:val="Placeholder Text"/>
+    <w:basedOn w:val="DefaultParagraphFont"/>
+    <w:uiPriority w:val="99"/>
+    <w:semiHidden/>
+    <w:rsid w:val="009A1CB7"/>
+    <w:rPr>
+      <w:color w:val="666666"/>
+    </w:rPr>
+  </w:style>
 </w:styles>
 </file>
 
@@ -5607,4 +6687,16 @@
     </a:ext>
   </a:extLst>
 </a:theme>
+</file>
+
+<file path=customXml/item1.xml><?xml version="1.0" encoding="utf-8"?>
+<b:Sources xmlns:b="http://schemas.openxmlformats.org/officeDocument/2006/bibliography" xmlns="http://schemas.openxmlformats.org/officeDocument/2006/bibliography" SelectedStyle="\APASixthEditionOfficeOnline.xsl" StyleName="APA" Version="6"/>
+</file>
+
+<file path=customXml/itemProps1.xml><?xml version="1.0" encoding="utf-8"?>
+<ds:datastoreItem xmlns:ds="http://schemas.openxmlformats.org/officeDocument/2006/customXml" ds:itemID="{B286A419-14DB-4006-80A0-375B4AAAD372}">
+  <ds:schemaRefs>
+    <ds:schemaRef ds:uri="http://schemas.openxmlformats.org/officeDocument/2006/bibliography"/>
+  </ds:schemaRefs>
+</ds:datastoreItem>
 </file>
</xml_diff>

<commit_message>
Actualización v0.3.0 del documento de especificación de datos INEC
</commit_message>
<xml_diff>
--- a/DOCS/DPDS_INEC.docx
+++ b/DOCS/DPDS_INEC.docx
@@ -60,7 +60,7 @@
           <w:rFonts w:ascii="Cambria" w:hAnsi="Cambria"/>
           <w:lang w:val="es-MX"/>
         </w:rPr>
-        <w:t>2</w:t>
+        <w:t>3</w:t>
       </w:r>
       <w:r>
         <w:rPr>
@@ -358,7 +358,7 @@
                 <w:rFonts w:ascii="Cambria" w:hAnsi="Cambria"/>
                 <w:lang w:val="es-MX"/>
               </w:rPr>
-              <w:t>2</w:t>
+              <w:t>3</w:t>
             </w:r>
             <w:r>
               <w:rPr>
@@ -2346,9 +2346,13 @@
         </w:tc>
       </w:tr>
       <w:tr>
+        <w:trPr>
+          <w:trHeight w:val="616"/>
+        </w:trPr>
         <w:tc>
           <w:tcPr>
             <w:tcW w:w="562" w:type="dxa"/>
+            <w:vAlign w:val="bottom"/>
             <w:hideMark/>
           </w:tcPr>
           <w:p>
@@ -2362,7 +2366,7 @@
             </w:pPr>
             <w:r>
               <w:rPr>
-                <w:rFonts w:ascii="Cambria" w:hAnsi="Cambria"/>
+                <w:rFonts w:ascii="Cambria" w:hAnsi="Cambria" w:cs="Arial"/>
                 <w:b/>
                 <w:bCs/>
               </w:rPr>
@@ -2373,38 +2377,38 @@
         <w:tc>
           <w:tcPr>
             <w:tcW w:w="2410" w:type="dxa"/>
-          </w:tcPr>
-          <w:p>
-            <w:pPr>
-              <w:spacing w:after="160" w:line="276" w:lineRule="auto"/>
-              <w:rPr>
-                <w:rFonts w:ascii="Cambria" w:hAnsi="Cambria"/>
-              </w:rPr>
-            </w:pPr>
-            <w:proofErr w:type="spellStart"/>
-            <w:r>
-              <w:rPr>
-                <w:rFonts w:ascii="Cambria" w:hAnsi="Cambria"/>
-              </w:rPr>
-              <w:t>codigo_dpa_canton</w:t>
-            </w:r>
-            <w:proofErr w:type="spellEnd"/>
+            <w:vAlign w:val="bottom"/>
+          </w:tcPr>
+          <w:p>
+            <w:pPr>
+              <w:spacing w:after="160" w:line="276" w:lineRule="auto"/>
+              <w:rPr>
+                <w:rFonts w:ascii="Cambria" w:hAnsi="Cambria"/>
+              </w:rPr>
+            </w:pPr>
+            <w:r>
+              <w:rPr>
+                <w:rFonts w:ascii="Cambria" w:hAnsi="Cambria" w:cs="Arial"/>
+              </w:rPr>
+              <w:t>PROVINCIA</w:t>
+            </w:r>
           </w:p>
         </w:tc>
         <w:tc>
           <w:tcPr>
             <w:tcW w:w="1276" w:type="dxa"/>
-          </w:tcPr>
-          <w:p>
-            <w:pPr>
-              <w:spacing w:after="160" w:line="276" w:lineRule="auto"/>
-              <w:rPr>
-                <w:rFonts w:ascii="Cambria" w:hAnsi="Cambria"/>
-              </w:rPr>
-            </w:pPr>
-            <w:r>
-              <w:rPr>
-                <w:rFonts w:ascii="Cambria" w:hAnsi="Cambria"/>
+            <w:vAlign w:val="bottom"/>
+          </w:tcPr>
+          <w:p>
+            <w:pPr>
+              <w:spacing w:after="160" w:line="276" w:lineRule="auto"/>
+              <w:rPr>
+                <w:rFonts w:ascii="Cambria" w:hAnsi="Cambria"/>
+              </w:rPr>
+            </w:pPr>
+            <w:r>
+              <w:rPr>
+                <w:rFonts w:ascii="Cambria" w:hAnsi="Cambria" w:cs="Arial"/>
               </w:rPr>
               <w:t>VARCHAR</w:t>
             </w:r>
@@ -2413,55 +2417,58 @@
         <w:tc>
           <w:tcPr>
             <w:tcW w:w="1701" w:type="dxa"/>
-          </w:tcPr>
-          <w:p>
-            <w:pPr>
-              <w:spacing w:after="160" w:line="276" w:lineRule="auto"/>
-              <w:rPr>
-                <w:rFonts w:ascii="Cambria" w:hAnsi="Cambria"/>
-              </w:rPr>
-            </w:pPr>
-            <w:r>
-              <w:rPr>
-                <w:rFonts w:ascii="Cambria" w:hAnsi="Cambria"/>
-              </w:rPr>
-              <w:t>Código INEC para mapa coroplético.</w:t>
+            <w:vAlign w:val="bottom"/>
+          </w:tcPr>
+          <w:p>
+            <w:pPr>
+              <w:spacing w:after="160" w:line="276" w:lineRule="auto"/>
+              <w:rPr>
+                <w:rFonts w:ascii="Cambria" w:hAnsi="Cambria"/>
+              </w:rPr>
+            </w:pPr>
+            <w:r>
+              <w:rPr>
+                <w:rFonts w:ascii="Cambria" w:hAnsi="Cambria" w:cs="Arial"/>
+              </w:rPr>
+              <w:t>Nombre de la provincia.</w:t>
             </w:r>
           </w:p>
         </w:tc>
         <w:tc>
           <w:tcPr>
             <w:tcW w:w="1559" w:type="dxa"/>
-          </w:tcPr>
-          <w:p>
-            <w:pPr>
-              <w:spacing w:after="160" w:line="276" w:lineRule="auto"/>
-              <w:rPr>
-                <w:rFonts w:ascii="Cambria" w:hAnsi="Cambria"/>
-              </w:rPr>
-            </w:pPr>
-            <w:r>
-              <w:rPr>
-                <w:rFonts w:ascii="Cambria" w:hAnsi="Cambria"/>
-              </w:rPr>
-              <w:t>Consistencia provincia-cantón (debe existir en el catálogo maestro).</w:t>
+            <w:vAlign w:val="bottom"/>
+          </w:tcPr>
+          <w:p>
+            <w:pPr>
+              <w:spacing w:after="160" w:line="276" w:lineRule="auto"/>
+              <w:rPr>
+                <w:rFonts w:ascii="Cambria" w:hAnsi="Cambria"/>
+              </w:rPr>
+            </w:pPr>
+            <w:r>
+              <w:rPr>
+                <w:rFonts w:ascii="Cambria" w:hAnsi="Cambria" w:cs="Arial"/>
+              </w:rPr>
+              <w:t>Sin nulos ni caracteres especiales.</w:t>
             </w:r>
           </w:p>
         </w:tc>
         <w:tc>
           <w:tcPr>
             <w:tcW w:w="1392" w:type="dxa"/>
-          </w:tcPr>
-          <w:p>
-            <w:pPr>
-              <w:spacing w:after="160" w:line="276" w:lineRule="auto"/>
-              <w:rPr>
-                <w:rFonts w:ascii="Cambria" w:hAnsi="Cambria"/>
-              </w:rPr>
-            </w:pPr>
-            <w:r>
-              <w:rPr>
-                <w:rFonts w:ascii="Cambria" w:hAnsi="Cambria"/>
+            <w:vAlign w:val="bottom"/>
+          </w:tcPr>
+          <w:p>
+            <w:pPr>
+              <w:spacing w:after="160" w:line="276" w:lineRule="auto"/>
+              <w:rPr>
+                <w:rFonts w:ascii="Cambria" w:hAnsi="Cambria"/>
+              </w:rPr>
+            </w:pPr>
+            <w:r>
+              <w:rPr>
+                <w:rFonts w:ascii="Cambria" w:hAnsi="Cambria" w:cs="Arial"/>
               </w:rPr>
               <w:t>Sí</w:t>
             </w:r>
@@ -2472,6 +2479,7 @@
         <w:tc>
           <w:tcPr>
             <w:tcW w:w="562" w:type="dxa"/>
+            <w:vAlign w:val="bottom"/>
             <w:hideMark/>
           </w:tcPr>
           <w:p>
@@ -2485,7 +2493,7 @@
             </w:pPr>
             <w:r>
               <w:rPr>
-                <w:rFonts w:ascii="Cambria" w:hAnsi="Cambria"/>
+                <w:rFonts w:ascii="Cambria" w:hAnsi="Cambria" w:cs="Arial"/>
                 <w:b/>
                 <w:bCs/>
               </w:rPr>
@@ -2496,36 +2504,38 @@
         <w:tc>
           <w:tcPr>
             <w:tcW w:w="2410" w:type="dxa"/>
-          </w:tcPr>
-          <w:p>
-            <w:pPr>
-              <w:spacing w:after="160" w:line="276" w:lineRule="auto"/>
-              <w:rPr>
-                <w:rFonts w:ascii="Cambria" w:hAnsi="Cambria"/>
-              </w:rPr>
-            </w:pPr>
-            <w:r>
-              <w:rPr>
-                <w:rFonts w:ascii="Cambria" w:hAnsi="Cambria"/>
-              </w:rPr>
-              <w:t>provincia</w:t>
+            <w:vAlign w:val="bottom"/>
+          </w:tcPr>
+          <w:p>
+            <w:pPr>
+              <w:spacing w:after="160" w:line="276" w:lineRule="auto"/>
+              <w:rPr>
+                <w:rFonts w:ascii="Cambria" w:hAnsi="Cambria"/>
+              </w:rPr>
+            </w:pPr>
+            <w:r>
+              <w:rPr>
+                <w:rFonts w:ascii="Cambria" w:hAnsi="Cambria" w:cs="Arial"/>
+              </w:rPr>
+              <w:t>CANTON</w:t>
             </w:r>
           </w:p>
         </w:tc>
         <w:tc>
           <w:tcPr>
             <w:tcW w:w="1276" w:type="dxa"/>
-          </w:tcPr>
-          <w:p>
-            <w:pPr>
-              <w:spacing w:after="160" w:line="276" w:lineRule="auto"/>
-              <w:rPr>
-                <w:rFonts w:ascii="Cambria" w:hAnsi="Cambria"/>
-              </w:rPr>
-            </w:pPr>
-            <w:r>
-              <w:rPr>
-                <w:rFonts w:ascii="Cambria" w:hAnsi="Cambria"/>
+            <w:vAlign w:val="bottom"/>
+          </w:tcPr>
+          <w:p>
+            <w:pPr>
+              <w:spacing w:after="160" w:line="276" w:lineRule="auto"/>
+              <w:rPr>
+                <w:rFonts w:ascii="Cambria" w:hAnsi="Cambria"/>
+              </w:rPr>
+            </w:pPr>
+            <w:r>
+              <w:rPr>
+                <w:rFonts w:ascii="Cambria" w:hAnsi="Cambria" w:cs="Arial"/>
               </w:rPr>
               <w:t>VARCHAR</w:t>
             </w:r>
@@ -2534,55 +2544,58 @@
         <w:tc>
           <w:tcPr>
             <w:tcW w:w="1701" w:type="dxa"/>
-          </w:tcPr>
-          <w:p>
-            <w:pPr>
-              <w:spacing w:after="160" w:line="276" w:lineRule="auto"/>
-              <w:rPr>
-                <w:rFonts w:ascii="Cambria" w:hAnsi="Cambria"/>
-              </w:rPr>
-            </w:pPr>
-            <w:r>
-              <w:rPr>
-                <w:rFonts w:ascii="Cambria" w:hAnsi="Cambria"/>
-              </w:rPr>
-              <w:t>Nombre de provincia para filtros.</w:t>
+            <w:vAlign w:val="bottom"/>
+          </w:tcPr>
+          <w:p>
+            <w:pPr>
+              <w:spacing w:after="160" w:line="276" w:lineRule="auto"/>
+              <w:rPr>
+                <w:rFonts w:ascii="Cambria" w:hAnsi="Cambria"/>
+              </w:rPr>
+            </w:pPr>
+            <w:r>
+              <w:rPr>
+                <w:rFonts w:ascii="Cambria" w:hAnsi="Cambria" w:cs="Arial"/>
+              </w:rPr>
+              <w:t>Nombre del cantón.</w:t>
             </w:r>
           </w:p>
         </w:tc>
         <w:tc>
           <w:tcPr>
             <w:tcW w:w="1559" w:type="dxa"/>
-          </w:tcPr>
-          <w:p>
-            <w:pPr>
-              <w:spacing w:after="160" w:line="276" w:lineRule="auto"/>
-              <w:rPr>
-                <w:rFonts w:ascii="Cambria" w:hAnsi="Cambria"/>
-              </w:rPr>
-            </w:pPr>
-            <w:r>
-              <w:rPr>
-                <w:rFonts w:ascii="Cambria" w:hAnsi="Cambria"/>
-              </w:rPr>
-              <w:t>No debe contener nulos ni caracteres especiales.</w:t>
+            <w:vAlign w:val="bottom"/>
+          </w:tcPr>
+          <w:p>
+            <w:pPr>
+              <w:spacing w:after="160" w:line="276" w:lineRule="auto"/>
+              <w:rPr>
+                <w:rFonts w:ascii="Cambria" w:hAnsi="Cambria"/>
+              </w:rPr>
+            </w:pPr>
+            <w:r>
+              <w:rPr>
+                <w:rFonts w:ascii="Cambria" w:hAnsi="Cambria" w:cs="Arial"/>
+              </w:rPr>
+              <w:t>Debe pertenecer a la provincia.</w:t>
             </w:r>
           </w:p>
         </w:tc>
         <w:tc>
           <w:tcPr>
             <w:tcW w:w="1392" w:type="dxa"/>
-          </w:tcPr>
-          <w:p>
-            <w:pPr>
-              <w:spacing w:after="160" w:line="276" w:lineRule="auto"/>
-              <w:rPr>
-                <w:rFonts w:ascii="Cambria" w:hAnsi="Cambria"/>
-              </w:rPr>
-            </w:pPr>
-            <w:r>
-              <w:rPr>
-                <w:rFonts w:ascii="Cambria" w:hAnsi="Cambria"/>
+            <w:vAlign w:val="bottom"/>
+          </w:tcPr>
+          <w:p>
+            <w:pPr>
+              <w:spacing w:after="160" w:line="276" w:lineRule="auto"/>
+              <w:rPr>
+                <w:rFonts w:ascii="Cambria" w:hAnsi="Cambria"/>
+              </w:rPr>
+            </w:pPr>
+            <w:r>
+              <w:rPr>
+                <w:rFonts w:ascii="Cambria" w:hAnsi="Cambria" w:cs="Arial"/>
               </w:rPr>
               <w:t>Sí</w:t>
             </w:r>
@@ -2596,6 +2609,7 @@
         <w:tc>
           <w:tcPr>
             <w:tcW w:w="562" w:type="dxa"/>
+            <w:vAlign w:val="bottom"/>
             <w:hideMark/>
           </w:tcPr>
           <w:p>
@@ -2609,7 +2623,7 @@
             </w:pPr>
             <w:r>
               <w:rPr>
-                <w:rFonts w:ascii="Cambria" w:hAnsi="Cambria"/>
+                <w:rFonts w:ascii="Cambria" w:hAnsi="Cambria" w:cs="Arial"/>
                 <w:b/>
                 <w:bCs/>
               </w:rPr>
@@ -2620,38 +2634,38 @@
         <w:tc>
           <w:tcPr>
             <w:tcW w:w="2410" w:type="dxa"/>
-          </w:tcPr>
-          <w:p>
-            <w:pPr>
-              <w:spacing w:after="160" w:line="276" w:lineRule="auto"/>
-              <w:rPr>
-                <w:rFonts w:ascii="Cambria" w:hAnsi="Cambria"/>
-              </w:rPr>
-            </w:pPr>
-            <w:proofErr w:type="spellStart"/>
-            <w:r>
-              <w:rPr>
-                <w:rFonts w:ascii="Cambria" w:hAnsi="Cambria"/>
-              </w:rPr>
-              <w:t>canton</w:t>
-            </w:r>
-            <w:proofErr w:type="spellEnd"/>
+            <w:vAlign w:val="bottom"/>
+          </w:tcPr>
+          <w:p>
+            <w:pPr>
+              <w:spacing w:after="160" w:line="276" w:lineRule="auto"/>
+              <w:rPr>
+                <w:rFonts w:ascii="Cambria" w:hAnsi="Cambria"/>
+              </w:rPr>
+            </w:pPr>
+            <w:r>
+              <w:rPr>
+                <w:rFonts w:ascii="Cambria" w:hAnsi="Cambria" w:cs="Arial"/>
+              </w:rPr>
+              <w:t>DESCRIPCION_AREA</w:t>
+            </w:r>
           </w:p>
         </w:tc>
         <w:tc>
           <w:tcPr>
             <w:tcW w:w="1276" w:type="dxa"/>
-          </w:tcPr>
-          <w:p>
-            <w:pPr>
-              <w:spacing w:after="160" w:line="276" w:lineRule="auto"/>
-              <w:rPr>
-                <w:rFonts w:ascii="Cambria" w:hAnsi="Cambria"/>
-              </w:rPr>
-            </w:pPr>
-            <w:r>
-              <w:rPr>
-                <w:rFonts w:ascii="Cambria" w:hAnsi="Cambria"/>
+            <w:vAlign w:val="bottom"/>
+          </w:tcPr>
+          <w:p>
+            <w:pPr>
+              <w:spacing w:after="160" w:line="276" w:lineRule="auto"/>
+              <w:rPr>
+                <w:rFonts w:ascii="Cambria" w:hAnsi="Cambria"/>
+              </w:rPr>
+            </w:pPr>
+            <w:r>
+              <w:rPr>
+                <w:rFonts w:ascii="Cambria" w:hAnsi="Cambria" w:cs="Arial"/>
               </w:rPr>
               <w:t>VARCHAR</w:t>
             </w:r>
@@ -2660,55 +2674,58 @@
         <w:tc>
           <w:tcPr>
             <w:tcW w:w="1701" w:type="dxa"/>
-          </w:tcPr>
-          <w:p>
-            <w:pPr>
-              <w:spacing w:after="160" w:line="276" w:lineRule="auto"/>
-              <w:rPr>
-                <w:rFonts w:ascii="Cambria" w:hAnsi="Cambria"/>
-              </w:rPr>
-            </w:pPr>
-            <w:r>
-              <w:rPr>
-                <w:rFonts w:ascii="Cambria" w:hAnsi="Cambria"/>
-              </w:rPr>
-              <w:t>Nombre de cantón para filtros y Top 5.</w:t>
+            <w:vAlign w:val="bottom"/>
+          </w:tcPr>
+          <w:p>
+            <w:pPr>
+              <w:spacing w:after="160" w:line="276" w:lineRule="auto"/>
+              <w:rPr>
+                <w:rFonts w:ascii="Cambria" w:hAnsi="Cambria"/>
+              </w:rPr>
+            </w:pPr>
+            <w:r>
+              <w:rPr>
+                <w:rFonts w:ascii="Cambria" w:hAnsi="Cambria" w:cs="Arial"/>
+              </w:rPr>
+              <w:t>Zona de estudio (Urbana/Rural).</w:t>
             </w:r>
           </w:p>
         </w:tc>
         <w:tc>
           <w:tcPr>
             <w:tcW w:w="1559" w:type="dxa"/>
-          </w:tcPr>
-          <w:p>
-            <w:pPr>
-              <w:spacing w:after="160" w:line="276" w:lineRule="auto"/>
-              <w:rPr>
-                <w:rFonts w:ascii="Cambria" w:hAnsi="Cambria"/>
-              </w:rPr>
-            </w:pPr>
-            <w:r>
-              <w:rPr>
-                <w:rFonts w:ascii="Cambria" w:hAnsi="Cambria"/>
-              </w:rPr>
-              <w:t>Debe coincidir con la descripción oficial de la DPA.</w:t>
+            <w:vAlign w:val="bottom"/>
+          </w:tcPr>
+          <w:p>
+            <w:pPr>
+              <w:spacing w:after="160" w:line="276" w:lineRule="auto"/>
+              <w:rPr>
+                <w:rFonts w:ascii="Cambria" w:hAnsi="Cambria"/>
+              </w:rPr>
+            </w:pPr>
+            <w:r>
+              <w:rPr>
+                <w:rFonts w:ascii="Cambria" w:hAnsi="Cambria" w:cs="Arial"/>
+              </w:rPr>
+              <w:t>Según catálogo INEC.</w:t>
             </w:r>
           </w:p>
         </w:tc>
         <w:tc>
           <w:tcPr>
             <w:tcW w:w="1392" w:type="dxa"/>
-          </w:tcPr>
-          <w:p>
-            <w:pPr>
-              <w:spacing w:after="160" w:line="276" w:lineRule="auto"/>
-              <w:rPr>
-                <w:rFonts w:ascii="Cambria" w:hAnsi="Cambria"/>
-              </w:rPr>
-            </w:pPr>
-            <w:r>
-              <w:rPr>
-                <w:rFonts w:ascii="Cambria" w:hAnsi="Cambria"/>
+            <w:vAlign w:val="bottom"/>
+          </w:tcPr>
+          <w:p>
+            <w:pPr>
+              <w:spacing w:after="160" w:line="276" w:lineRule="auto"/>
+              <w:rPr>
+                <w:rFonts w:ascii="Cambria" w:hAnsi="Cambria"/>
+              </w:rPr>
+            </w:pPr>
+            <w:r>
+              <w:rPr>
+                <w:rFonts w:ascii="Cambria" w:hAnsi="Cambria" w:cs="Arial"/>
               </w:rPr>
               <w:t>Sí</w:t>
             </w:r>
@@ -2719,6 +2736,7 @@
         <w:tc>
           <w:tcPr>
             <w:tcW w:w="562" w:type="dxa"/>
+            <w:vAlign w:val="bottom"/>
             <w:hideMark/>
           </w:tcPr>
           <w:p>
@@ -2732,7 +2750,7 @@
             </w:pPr>
             <w:r>
               <w:rPr>
-                <w:rFonts w:ascii="Cambria" w:hAnsi="Cambria"/>
+                <w:rFonts w:ascii="Cambria" w:hAnsi="Cambria" w:cs="Arial"/>
                 <w:b/>
                 <w:bCs/>
               </w:rPr>
@@ -2743,6 +2761,7 @@
         <w:tc>
           <w:tcPr>
             <w:tcW w:w="2410" w:type="dxa"/>
+            <w:vAlign w:val="bottom"/>
           </w:tcPr>
           <w:p>
             <w:pPr>
@@ -2754,9 +2773,9 @@
             <w:proofErr w:type="spellStart"/>
             <w:r>
               <w:rPr>
-                <w:rFonts w:ascii="Cambria" w:hAnsi="Cambria"/>
-              </w:rPr>
-              <w:t>area</w:t>
+                <w:rFonts w:ascii="Cambria" w:hAnsi="Cambria" w:cs="Arial"/>
+              </w:rPr>
+              <w:t>Gravedad_Pobreza</w:t>
             </w:r>
             <w:proofErr w:type="spellEnd"/>
           </w:p>
@@ -2764,17 +2783,18 @@
         <w:tc>
           <w:tcPr>
             <w:tcW w:w="1276" w:type="dxa"/>
-          </w:tcPr>
-          <w:p>
-            <w:pPr>
-              <w:spacing w:after="160" w:line="276" w:lineRule="auto"/>
-              <w:rPr>
-                <w:rFonts w:ascii="Cambria" w:hAnsi="Cambria"/>
-              </w:rPr>
-            </w:pPr>
-            <w:r>
-              <w:rPr>
-                <w:rFonts w:ascii="Cambria" w:hAnsi="Cambria"/>
+            <w:vAlign w:val="bottom"/>
+          </w:tcPr>
+          <w:p>
+            <w:pPr>
+              <w:spacing w:after="160" w:line="276" w:lineRule="auto"/>
+              <w:rPr>
+                <w:rFonts w:ascii="Cambria" w:hAnsi="Cambria"/>
+              </w:rPr>
+            </w:pPr>
+            <w:r>
+              <w:rPr>
+                <w:rFonts w:ascii="Cambria" w:hAnsi="Cambria" w:cs="Arial"/>
               </w:rPr>
               <w:t>VARCHAR</w:t>
             </w:r>
@@ -2783,55 +2803,58 @@
         <w:tc>
           <w:tcPr>
             <w:tcW w:w="1701" w:type="dxa"/>
-          </w:tcPr>
-          <w:p>
-            <w:pPr>
-              <w:spacing w:after="160" w:line="276" w:lineRule="auto"/>
-              <w:rPr>
-                <w:rFonts w:ascii="Cambria" w:hAnsi="Cambria"/>
-              </w:rPr>
-            </w:pPr>
-            <w:r>
-              <w:rPr>
-                <w:rFonts w:ascii="Cambria" w:hAnsi="Cambria"/>
-              </w:rPr>
-              <w:t>Zona del hogar: 'Urbana' o 'Rural'.</w:t>
+            <w:vAlign w:val="bottom"/>
+          </w:tcPr>
+          <w:p>
+            <w:pPr>
+              <w:spacing w:after="160" w:line="276" w:lineRule="auto"/>
+              <w:rPr>
+                <w:rFonts w:ascii="Cambria" w:hAnsi="Cambria"/>
+              </w:rPr>
+            </w:pPr>
+            <w:r>
+              <w:rPr>
+                <w:rFonts w:ascii="Cambria" w:hAnsi="Cambria" w:cs="Arial"/>
+              </w:rPr>
+              <w:t>Nivel de severidad de pobreza.</w:t>
             </w:r>
           </w:p>
         </w:tc>
         <w:tc>
           <w:tcPr>
             <w:tcW w:w="1559" w:type="dxa"/>
-          </w:tcPr>
-          <w:p>
-            <w:pPr>
-              <w:spacing w:after="160" w:line="276" w:lineRule="auto"/>
-              <w:rPr>
-                <w:rFonts w:ascii="Cambria" w:hAnsi="Cambria"/>
-              </w:rPr>
-            </w:pPr>
-            <w:r>
-              <w:rPr>
-                <w:rFonts w:ascii="Cambria" w:hAnsi="Cambria"/>
-              </w:rPr>
-              <w:t>Valores estandarizados según el modelo metodológico.</w:t>
+            <w:vAlign w:val="bottom"/>
+          </w:tcPr>
+          <w:p>
+            <w:pPr>
+              <w:spacing w:after="160" w:line="276" w:lineRule="auto"/>
+              <w:rPr>
+                <w:rFonts w:ascii="Cambria" w:hAnsi="Cambria"/>
+              </w:rPr>
+            </w:pPr>
+            <w:r>
+              <w:rPr>
+                <w:rFonts w:ascii="Cambria" w:hAnsi="Cambria" w:cs="Arial"/>
+              </w:rPr>
+              <w:t>Solo 'Alta', 'Media' o 'Baja'.</w:t>
             </w:r>
           </w:p>
         </w:tc>
         <w:tc>
           <w:tcPr>
             <w:tcW w:w="1392" w:type="dxa"/>
-          </w:tcPr>
-          <w:p>
-            <w:pPr>
-              <w:spacing w:after="160" w:line="276" w:lineRule="auto"/>
-              <w:rPr>
-                <w:rFonts w:ascii="Cambria" w:hAnsi="Cambria"/>
-              </w:rPr>
-            </w:pPr>
-            <w:r>
-              <w:rPr>
-                <w:rFonts w:ascii="Cambria" w:hAnsi="Cambria"/>
+            <w:vAlign w:val="bottom"/>
+          </w:tcPr>
+          <w:p>
+            <w:pPr>
+              <w:spacing w:after="160" w:line="276" w:lineRule="auto"/>
+              <w:rPr>
+                <w:rFonts w:ascii="Cambria" w:hAnsi="Cambria"/>
+              </w:rPr>
+            </w:pPr>
+            <w:r>
+              <w:rPr>
+                <w:rFonts w:ascii="Cambria" w:hAnsi="Cambria" w:cs="Arial"/>
               </w:rPr>
               <w:t>Sí</w:t>
             </w:r>
@@ -2842,6 +2865,7 @@
         <w:tc>
           <w:tcPr>
             <w:tcW w:w="562" w:type="dxa"/>
+            <w:vAlign w:val="bottom"/>
             <w:hideMark/>
           </w:tcPr>
           <w:p>
@@ -2855,7 +2879,7 @@
             </w:pPr>
             <w:r>
               <w:rPr>
-                <w:rFonts w:ascii="Cambria" w:hAnsi="Cambria"/>
+                <w:rFonts w:ascii="Cambria" w:hAnsi="Cambria" w:cs="Arial"/>
                 <w:b/>
                 <w:bCs/>
               </w:rPr>
@@ -2866,36 +2890,38 @@
         <w:tc>
           <w:tcPr>
             <w:tcW w:w="2410" w:type="dxa"/>
-          </w:tcPr>
-          <w:p>
-            <w:pPr>
-              <w:spacing w:after="160" w:line="276" w:lineRule="auto"/>
-              <w:rPr>
-                <w:rFonts w:ascii="Cambria" w:hAnsi="Cambria"/>
-              </w:rPr>
-            </w:pPr>
-            <w:r>
-              <w:rPr>
-                <w:rFonts w:ascii="Cambria" w:hAnsi="Cambria"/>
-              </w:rPr>
-              <w:t>gravedad</w:t>
+            <w:vAlign w:val="bottom"/>
+          </w:tcPr>
+          <w:p>
+            <w:pPr>
+              <w:spacing w:after="160" w:line="276" w:lineRule="auto"/>
+              <w:rPr>
+                <w:rFonts w:ascii="Cambria" w:hAnsi="Cambria"/>
+              </w:rPr>
+            </w:pPr>
+            <w:r>
+              <w:rPr>
+                <w:rFonts w:ascii="Cambria" w:hAnsi="Cambria" w:cs="Arial"/>
+              </w:rPr>
+              <w:t>DIMENSION_PRINCIPAL</w:t>
             </w:r>
           </w:p>
         </w:tc>
         <w:tc>
           <w:tcPr>
             <w:tcW w:w="1276" w:type="dxa"/>
-          </w:tcPr>
-          <w:p>
-            <w:pPr>
-              <w:spacing w:after="160" w:line="276" w:lineRule="auto"/>
-              <w:rPr>
-                <w:rFonts w:ascii="Cambria" w:hAnsi="Cambria"/>
-              </w:rPr>
-            </w:pPr>
-            <w:r>
-              <w:rPr>
-                <w:rFonts w:ascii="Cambria" w:hAnsi="Cambria"/>
+            <w:vAlign w:val="bottom"/>
+          </w:tcPr>
+          <w:p>
+            <w:pPr>
+              <w:spacing w:after="160" w:line="276" w:lineRule="auto"/>
+              <w:rPr>
+                <w:rFonts w:ascii="Cambria" w:hAnsi="Cambria"/>
+              </w:rPr>
+            </w:pPr>
+            <w:r>
+              <w:rPr>
+                <w:rFonts w:ascii="Cambria" w:hAnsi="Cambria" w:cs="Arial"/>
               </w:rPr>
               <w:t>VARCHAR</w:t>
             </w:r>
@@ -2904,55 +2930,58 @@
         <w:tc>
           <w:tcPr>
             <w:tcW w:w="1701" w:type="dxa"/>
-          </w:tcPr>
-          <w:p>
-            <w:pPr>
-              <w:spacing w:after="160" w:line="276" w:lineRule="auto"/>
-              <w:rPr>
-                <w:rFonts w:ascii="Cambria" w:hAnsi="Cambria"/>
-              </w:rPr>
-            </w:pPr>
-            <w:r>
-              <w:rPr>
-                <w:rFonts w:ascii="Cambria" w:hAnsi="Cambria"/>
-              </w:rPr>
-              <w:t>Nivel de pobreza del hogar.</w:t>
+            <w:vAlign w:val="bottom"/>
+          </w:tcPr>
+          <w:p>
+            <w:pPr>
+              <w:spacing w:after="160" w:line="276" w:lineRule="auto"/>
+              <w:rPr>
+                <w:rFonts w:ascii="Cambria" w:hAnsi="Cambria"/>
+              </w:rPr>
+            </w:pPr>
+            <w:r>
+              <w:rPr>
+                <w:rFonts w:ascii="Cambria" w:hAnsi="Cambria" w:cs="Arial"/>
+              </w:rPr>
+              <w:t>Tipo de carencia principal.</w:t>
             </w:r>
           </w:p>
         </w:tc>
         <w:tc>
           <w:tcPr>
             <w:tcW w:w="1559" w:type="dxa"/>
-          </w:tcPr>
-          <w:p>
-            <w:pPr>
-              <w:spacing w:after="160" w:line="276" w:lineRule="auto"/>
-              <w:rPr>
-                <w:rFonts w:ascii="Cambria" w:hAnsi="Cambria"/>
-              </w:rPr>
-            </w:pPr>
-            <w:r>
-              <w:rPr>
-                <w:rFonts w:ascii="Cambria" w:hAnsi="Cambria"/>
-              </w:rPr>
-              <w:t>Nulos no permitidos.</w:t>
+            <w:vAlign w:val="bottom"/>
+          </w:tcPr>
+          <w:p>
+            <w:pPr>
+              <w:spacing w:after="160" w:line="276" w:lineRule="auto"/>
+              <w:rPr>
+                <w:rFonts w:ascii="Cambria" w:hAnsi="Cambria"/>
+              </w:rPr>
+            </w:pPr>
+            <w:r>
+              <w:rPr>
+                <w:rFonts w:ascii="Cambria" w:hAnsi="Cambria" w:cs="Arial"/>
+              </w:rPr>
+              <w:t>Valores de las 5 dimensiones NBI.</w:t>
             </w:r>
           </w:p>
         </w:tc>
         <w:tc>
           <w:tcPr>
             <w:tcW w:w="1392" w:type="dxa"/>
-          </w:tcPr>
-          <w:p>
-            <w:pPr>
-              <w:spacing w:after="160" w:line="276" w:lineRule="auto"/>
-              <w:rPr>
-                <w:rFonts w:ascii="Cambria" w:hAnsi="Cambria"/>
-              </w:rPr>
-            </w:pPr>
-            <w:r>
-              <w:rPr>
-                <w:rFonts w:ascii="Cambria" w:hAnsi="Cambria"/>
+            <w:vAlign w:val="bottom"/>
+          </w:tcPr>
+          <w:p>
+            <w:pPr>
+              <w:spacing w:after="160" w:line="276" w:lineRule="auto"/>
+              <w:rPr>
+                <w:rFonts w:ascii="Cambria" w:hAnsi="Cambria"/>
+              </w:rPr>
+            </w:pPr>
+            <w:r>
+              <w:rPr>
+                <w:rFonts w:ascii="Cambria" w:hAnsi="Cambria" w:cs="Arial"/>
               </w:rPr>
               <w:t>Sí</w:t>
             </w:r>
@@ -2963,19 +2992,20 @@
         <w:tc>
           <w:tcPr>
             <w:tcW w:w="562" w:type="dxa"/>
-          </w:tcPr>
-          <w:p>
-            <w:pPr>
-              <w:spacing w:line="276" w:lineRule="auto"/>
-              <w:rPr>
-                <w:rFonts w:ascii="Cambria" w:hAnsi="Cambria"/>
-                <w:b/>
-                <w:bCs/>
-              </w:rPr>
-            </w:pPr>
-            <w:r>
-              <w:rPr>
-                <w:rFonts w:ascii="Cambria" w:hAnsi="Cambria"/>
+            <w:vAlign w:val="bottom"/>
+          </w:tcPr>
+          <w:p>
+            <w:pPr>
+              <w:spacing w:line="276" w:lineRule="auto"/>
+              <w:rPr>
+                <w:rFonts w:ascii="Cambria" w:hAnsi="Cambria"/>
+                <w:b/>
+                <w:bCs/>
+              </w:rPr>
+            </w:pPr>
+            <w:r>
+              <w:rPr>
+                <w:rFonts w:ascii="Cambria" w:hAnsi="Cambria" w:cs="Arial"/>
                 <w:b/>
                 <w:bCs/>
               </w:rPr>
@@ -2986,46 +3016,47 @@
         <w:tc>
           <w:tcPr>
             <w:tcW w:w="2410" w:type="dxa"/>
-          </w:tcPr>
-          <w:p>
-            <w:pPr>
-              <w:spacing w:line="276" w:lineRule="auto"/>
-              <w:rPr>
-                <w:rFonts w:ascii="Cambria" w:hAnsi="Cambria"/>
-              </w:rPr>
-            </w:pPr>
-            <w:proofErr w:type="spellStart"/>
-            <w:r>
-              <w:rPr>
-                <w:rFonts w:ascii="Cambria" w:hAnsi="Cambria"/>
-              </w:rPr>
-              <w:t>es_pobre_nbi_calculado</w:t>
-            </w:r>
-            <w:proofErr w:type="spellEnd"/>
+            <w:vAlign w:val="bottom"/>
+          </w:tcPr>
+          <w:p>
+            <w:pPr>
+              <w:spacing w:line="276" w:lineRule="auto"/>
+              <w:rPr>
+                <w:rFonts w:ascii="Cambria" w:hAnsi="Cambria"/>
+              </w:rPr>
+            </w:pPr>
+            <w:r>
+              <w:rPr>
+                <w:rFonts w:ascii="Cambria" w:hAnsi="Cambria" w:cs="Arial"/>
+              </w:rPr>
+              <w:t>% Hogares bajo línea NBI</w:t>
+            </w:r>
           </w:p>
         </w:tc>
         <w:tc>
           <w:tcPr>
             <w:tcW w:w="1276" w:type="dxa"/>
-          </w:tcPr>
-          <w:p>
-            <w:pPr>
-              <w:spacing w:line="276" w:lineRule="auto"/>
-              <w:rPr>
-                <w:rFonts w:ascii="Cambria" w:hAnsi="Cambria"/>
-              </w:rPr>
-            </w:pPr>
-            <w:r>
-              <w:rPr>
-                <w:rFonts w:ascii="Cambria" w:hAnsi="Cambria"/>
-              </w:rPr>
-              <w:t>BOOLEAN</w:t>
+            <w:vAlign w:val="bottom"/>
+          </w:tcPr>
+          <w:p>
+            <w:pPr>
+              <w:spacing w:line="276" w:lineRule="auto"/>
+              <w:rPr>
+                <w:rFonts w:ascii="Cambria" w:hAnsi="Cambria"/>
+              </w:rPr>
+            </w:pPr>
+            <w:r>
+              <w:rPr>
+                <w:rFonts w:ascii="Cambria" w:hAnsi="Cambria" w:cs="Arial"/>
+              </w:rPr>
+              <w:t>DECIMAL</w:t>
             </w:r>
           </w:p>
         </w:tc>
         <w:tc>
           <w:tcPr>
             <w:tcW w:w="1701" w:type="dxa"/>
+            <w:vAlign w:val="bottom"/>
           </w:tcPr>
           <w:p>
             <w:pPr>
@@ -3037,82 +3068,47 @@
             </w:pPr>
             <w:r>
               <w:rPr>
-                <w:rFonts w:ascii="Cambria" w:hAnsi="Cambria"/>
-              </w:rPr>
-              <w:t>Verdadero si presenta</w:t>
-            </w:r>
-            <w:r>
-              <w:rPr>
-                <w:rFonts w:ascii="Cambria" w:hAnsi="Cambria"/>
-                <w:lang w:val="es-ES"/>
-              </w:rPr>
-              <w:t xml:space="preserve"> </w:t>
-            </w:r>
-            <w:r>
-              <w:rPr>
-                <w:rFonts w:ascii="Cambria" w:hAnsi="Cambria"/>
-                <w:lang w:val="es-ES"/>
-              </w:rPr>
-              <w:t>≥</w:t>
-            </w:r>
-            <w:r>
-              <w:rPr>
-                <w:rFonts w:ascii="Cambria" w:hAnsi="Cambria"/>
-                <w:lang w:val="es-ES"/>
-              </w:rPr>
-              <w:t>3</w:t>
-            </w:r>
-            <w:r>
-              <w:rPr>
-                <w:rFonts w:ascii="Cambria" w:hAnsi="Cambria"/>
-                <w:lang w:val="es-ES"/>
-              </w:rPr>
-              <w:t xml:space="preserve"> privaciones</w:t>
-            </w:r>
-          </w:p>
-          <w:p>
-            <w:pPr>
-              <w:spacing w:line="276" w:lineRule="auto"/>
-              <w:rPr>
-                <w:rFonts w:ascii="Cambria" w:hAnsi="Cambria"/>
-                <w:lang w:val="es-ES"/>
-              </w:rPr>
-            </w:pPr>
+                <w:rFonts w:ascii="Cambria" w:hAnsi="Cambria" w:cs="Arial"/>
+              </w:rPr>
+              <w:t>Porcentaje de hogares pobres.</w:t>
+            </w:r>
           </w:p>
         </w:tc>
         <w:tc>
           <w:tcPr>
             <w:tcW w:w="1559" w:type="dxa"/>
-          </w:tcPr>
-          <w:p>
-            <w:pPr>
-              <w:spacing w:line="276" w:lineRule="auto"/>
-              <w:rPr>
-                <w:rFonts w:ascii="Cambria" w:hAnsi="Cambria"/>
-              </w:rPr>
-            </w:pPr>
-            <w:r>
-              <w:rPr>
-                <w:rFonts w:ascii="Cambria" w:hAnsi="Cambria"/>
-              </w:rPr>
-              <w:t>Debe permitir la comparación de tasas.</w:t>
+            <w:vAlign w:val="bottom"/>
+          </w:tcPr>
+          <w:p>
+            <w:pPr>
+              <w:spacing w:line="276" w:lineRule="auto"/>
+              <w:rPr>
+                <w:rFonts w:ascii="Cambria" w:hAnsi="Cambria"/>
+              </w:rPr>
+            </w:pPr>
+            <w:r>
+              <w:rPr>
+                <w:rFonts w:ascii="Cambria" w:hAnsi="Cambria" w:cs="Arial"/>
+              </w:rPr>
+              <w:t>0 a 100. Sin nulos.</w:t>
             </w:r>
           </w:p>
         </w:tc>
         <w:tc>
           <w:tcPr>
             <w:tcW w:w="1392" w:type="dxa"/>
-          </w:tcPr>
-          <w:p>
-            <w:pPr>
-              <w:spacing w:line="276" w:lineRule="auto"/>
-              <w:rPr>
-                <w:rFonts w:ascii="Cambria" w:hAnsi="Cambria"/>
-              </w:rPr>
-            </w:pPr>
-            <w:r>
-              <w:rPr>
-                <w:rFonts w:ascii="Cambria" w:hAnsi="Cambria"/>
+            <w:vAlign w:val="bottom"/>
+          </w:tcPr>
+          <w:p>
+            <w:pPr>
+              <w:spacing w:line="276" w:lineRule="auto"/>
+              <w:rPr>
+                <w:rFonts w:ascii="Cambria" w:hAnsi="Cambria"/>
+              </w:rPr>
+            </w:pPr>
+            <w:r>
+              <w:rPr>
+                <w:rFonts w:ascii="Cambria" w:hAnsi="Cambria" w:cs="Arial"/>
               </w:rPr>
               <w:t>Sí</w:t>
             </w:r>
@@ -3123,19 +3119,20 @@
         <w:tc>
           <w:tcPr>
             <w:tcW w:w="562" w:type="dxa"/>
-          </w:tcPr>
-          <w:p>
-            <w:pPr>
-              <w:spacing w:line="276" w:lineRule="auto"/>
-              <w:rPr>
-                <w:rFonts w:ascii="Cambria" w:hAnsi="Cambria"/>
-                <w:b/>
-                <w:bCs/>
-              </w:rPr>
-            </w:pPr>
-            <w:r>
-              <w:rPr>
-                <w:rFonts w:ascii="Cambria" w:hAnsi="Cambria"/>
+            <w:vAlign w:val="bottom"/>
+          </w:tcPr>
+          <w:p>
+            <w:pPr>
+              <w:spacing w:line="276" w:lineRule="auto"/>
+              <w:rPr>
+                <w:rFonts w:ascii="Cambria" w:hAnsi="Cambria"/>
+                <w:b/>
+                <w:bCs/>
+              </w:rPr>
+            </w:pPr>
+            <w:r>
+              <w:rPr>
+                <w:rFonts w:ascii="Cambria" w:hAnsi="Cambria" w:cs="Arial"/>
                 <w:b/>
                 <w:bCs/>
               </w:rPr>
@@ -3146,6 +3143,7 @@
         <w:tc>
           <w:tcPr>
             <w:tcW w:w="2410" w:type="dxa"/>
+            <w:vAlign w:val="bottom"/>
           </w:tcPr>
           <w:p>
             <w:pPr>
@@ -3157,9 +3155,9 @@
             <w:proofErr w:type="spellStart"/>
             <w:r>
               <w:rPr>
-                <w:rFonts w:ascii="Cambria" w:hAnsi="Cambria"/>
-              </w:rPr>
-              <w:t>es_pobre_nbi_oficial</w:t>
+                <w:rFonts w:ascii="Cambria" w:hAnsi="Cambria" w:cs="Arial"/>
+              </w:rPr>
+              <w:t>Analisis_Diferencia_NBI</w:t>
             </w:r>
             <w:proofErr w:type="spellEnd"/>
           </w:p>
@@ -3167,74 +3165,78 @@
         <w:tc>
           <w:tcPr>
             <w:tcW w:w="1276" w:type="dxa"/>
-          </w:tcPr>
-          <w:p>
-            <w:pPr>
-              <w:spacing w:line="276" w:lineRule="auto"/>
-              <w:rPr>
-                <w:rFonts w:ascii="Cambria" w:hAnsi="Cambria"/>
-              </w:rPr>
-            </w:pPr>
-            <w:r>
-              <w:rPr>
-                <w:rFonts w:ascii="Cambria" w:hAnsi="Cambria"/>
-              </w:rPr>
-              <w:t>BOOLEAN</w:t>
+            <w:vAlign w:val="bottom"/>
+          </w:tcPr>
+          <w:p>
+            <w:pPr>
+              <w:spacing w:line="276" w:lineRule="auto"/>
+              <w:rPr>
+                <w:rFonts w:ascii="Cambria" w:hAnsi="Cambria"/>
+              </w:rPr>
+            </w:pPr>
+            <w:r>
+              <w:rPr>
+                <w:rFonts w:ascii="Cambria" w:hAnsi="Cambria" w:cs="Arial"/>
+              </w:rPr>
+              <w:t>DECIMAL</w:t>
             </w:r>
           </w:p>
         </w:tc>
         <w:tc>
           <w:tcPr>
             <w:tcW w:w="1701" w:type="dxa"/>
-          </w:tcPr>
-          <w:p>
-            <w:pPr>
-              <w:spacing w:line="276" w:lineRule="auto"/>
-              <w:rPr>
-                <w:rFonts w:ascii="Cambria" w:hAnsi="Cambria"/>
-              </w:rPr>
-            </w:pPr>
-            <w:r>
-              <w:rPr>
-                <w:rFonts w:ascii="Cambria" w:hAnsi="Cambria"/>
-              </w:rPr>
-              <w:t>Tasa oficial INEC para comparación.</w:t>
+            <w:vAlign w:val="bottom"/>
+          </w:tcPr>
+          <w:p>
+            <w:pPr>
+              <w:spacing w:line="276" w:lineRule="auto"/>
+              <w:rPr>
+                <w:rFonts w:ascii="Cambria" w:hAnsi="Cambria"/>
+              </w:rPr>
+            </w:pPr>
+            <w:r>
+              <w:rPr>
+                <w:rFonts w:ascii="Cambria" w:hAnsi="Cambria" w:cs="Arial"/>
+              </w:rPr>
+              <w:t>Diferencia % entre NBI calculado y oficial.</w:t>
             </w:r>
           </w:p>
         </w:tc>
         <w:tc>
           <w:tcPr>
             <w:tcW w:w="1559" w:type="dxa"/>
-          </w:tcPr>
-          <w:p>
-            <w:pPr>
-              <w:spacing w:line="276" w:lineRule="auto"/>
-              <w:rPr>
-                <w:rFonts w:ascii="Cambria" w:hAnsi="Cambria"/>
-              </w:rPr>
-            </w:pPr>
-            <w:r>
-              <w:rPr>
-                <w:rFonts w:ascii="Cambria" w:hAnsi="Cambria"/>
-              </w:rPr>
-              <w:t>Solo valores 0 o 1.</w:t>
+            <w:vAlign w:val="bottom"/>
+          </w:tcPr>
+          <w:p>
+            <w:pPr>
+              <w:spacing w:line="276" w:lineRule="auto"/>
+              <w:rPr>
+                <w:rFonts w:ascii="Cambria" w:hAnsi="Cambria"/>
+              </w:rPr>
+            </w:pPr>
+            <w:r>
+              <w:rPr>
+                <w:rFonts w:ascii="Cambria" w:hAnsi="Cambria" w:cs="Arial"/>
+              </w:rPr>
+              <w:t>Valores positivos o negativos.</w:t>
             </w:r>
           </w:p>
         </w:tc>
         <w:tc>
           <w:tcPr>
             <w:tcW w:w="1392" w:type="dxa"/>
-          </w:tcPr>
-          <w:p>
-            <w:pPr>
-              <w:spacing w:line="276" w:lineRule="auto"/>
-              <w:rPr>
-                <w:rFonts w:ascii="Cambria" w:hAnsi="Cambria"/>
-              </w:rPr>
-            </w:pPr>
-            <w:r>
-              <w:rPr>
-                <w:rFonts w:ascii="Cambria" w:hAnsi="Cambria"/>
+            <w:vAlign w:val="bottom"/>
+          </w:tcPr>
+          <w:p>
+            <w:pPr>
+              <w:spacing w:line="276" w:lineRule="auto"/>
+              <w:rPr>
+                <w:rFonts w:ascii="Cambria" w:hAnsi="Cambria"/>
+              </w:rPr>
+            </w:pPr>
+            <w:r>
+              <w:rPr>
+                <w:rFonts w:ascii="Cambria" w:hAnsi="Cambria" w:cs="Arial"/>
               </w:rPr>
               <w:t>Sí</w:t>
             </w:r>
@@ -3245,19 +3247,20 @@
         <w:tc>
           <w:tcPr>
             <w:tcW w:w="562" w:type="dxa"/>
-          </w:tcPr>
-          <w:p>
-            <w:pPr>
-              <w:spacing w:line="276" w:lineRule="auto"/>
-              <w:rPr>
-                <w:rFonts w:ascii="Cambria" w:hAnsi="Cambria"/>
-                <w:b/>
-                <w:bCs/>
-              </w:rPr>
-            </w:pPr>
-            <w:r>
-              <w:rPr>
-                <w:rFonts w:ascii="Cambria" w:hAnsi="Cambria"/>
+            <w:vAlign w:val="bottom"/>
+          </w:tcPr>
+          <w:p>
+            <w:pPr>
+              <w:spacing w:line="276" w:lineRule="auto"/>
+              <w:rPr>
+                <w:rFonts w:ascii="Cambria" w:hAnsi="Cambria"/>
+                <w:b/>
+                <w:bCs/>
+              </w:rPr>
+            </w:pPr>
+            <w:r>
+              <w:rPr>
+                <w:rFonts w:ascii="Cambria" w:hAnsi="Cambria" w:cs="Arial"/>
                 <w:b/>
                 <w:bCs/>
               </w:rPr>
@@ -3268,95 +3271,98 @@
         <w:tc>
           <w:tcPr>
             <w:tcW w:w="2410" w:type="dxa"/>
-          </w:tcPr>
-          <w:p>
-            <w:pPr>
-              <w:spacing w:line="276" w:lineRule="auto"/>
-              <w:rPr>
-                <w:rFonts w:ascii="Cambria" w:hAnsi="Cambria"/>
-              </w:rPr>
-            </w:pPr>
-            <w:proofErr w:type="spellStart"/>
-            <w:r>
-              <w:rPr>
-                <w:rFonts w:ascii="Cambria" w:hAnsi="Cambria"/>
-              </w:rPr>
-              <w:t>pobreza_vivienda</w:t>
-            </w:r>
-            <w:proofErr w:type="spellEnd"/>
+            <w:vAlign w:val="bottom"/>
+          </w:tcPr>
+          <w:p>
+            <w:pPr>
+              <w:spacing w:line="276" w:lineRule="auto"/>
+              <w:rPr>
+                <w:rFonts w:ascii="Cambria" w:hAnsi="Cambria"/>
+              </w:rPr>
+            </w:pPr>
+            <w:r>
+              <w:rPr>
+                <w:rFonts w:ascii="Cambria" w:hAnsi="Cambria" w:cs="Arial"/>
+              </w:rPr>
+              <w:t>PORCENTAJE_NBI_CALCULADO</w:t>
+            </w:r>
           </w:p>
         </w:tc>
         <w:tc>
           <w:tcPr>
             <w:tcW w:w="1276" w:type="dxa"/>
-          </w:tcPr>
-          <w:p>
-            <w:pPr>
-              <w:spacing w:line="276" w:lineRule="auto"/>
-              <w:rPr>
-                <w:rFonts w:ascii="Cambria" w:hAnsi="Cambria"/>
-              </w:rPr>
-            </w:pPr>
-            <w:r>
-              <w:rPr>
-                <w:rFonts w:ascii="Cambria" w:hAnsi="Cambria"/>
-              </w:rPr>
-              <w:t>INT</w:t>
+            <w:vAlign w:val="bottom"/>
+          </w:tcPr>
+          <w:p>
+            <w:pPr>
+              <w:spacing w:line="276" w:lineRule="auto"/>
+              <w:rPr>
+                <w:rFonts w:ascii="Cambria" w:hAnsi="Cambria"/>
+              </w:rPr>
+            </w:pPr>
+            <w:r>
+              <w:rPr>
+                <w:rFonts w:ascii="Cambria" w:hAnsi="Cambria" w:cs="Arial"/>
+              </w:rPr>
+              <w:t>DECIMAL</w:t>
             </w:r>
           </w:p>
         </w:tc>
         <w:tc>
           <w:tcPr>
             <w:tcW w:w="1701" w:type="dxa"/>
-          </w:tcPr>
-          <w:p>
-            <w:pPr>
-              <w:spacing w:line="276" w:lineRule="auto"/>
-              <w:rPr>
-                <w:rFonts w:ascii="Cambria" w:hAnsi="Cambria"/>
-              </w:rPr>
-            </w:pPr>
-            <w:r>
-              <w:rPr>
-                <w:rFonts w:ascii="Cambria" w:hAnsi="Cambria"/>
-              </w:rPr>
-              <w:t>Privación en dimensión Vivienda.</w:t>
+            <w:vAlign w:val="bottom"/>
+          </w:tcPr>
+          <w:p>
+            <w:pPr>
+              <w:spacing w:line="276" w:lineRule="auto"/>
+              <w:rPr>
+                <w:rFonts w:ascii="Cambria" w:hAnsi="Cambria"/>
+              </w:rPr>
+            </w:pPr>
+            <w:r>
+              <w:rPr>
+                <w:rFonts w:ascii="Cambria" w:hAnsi="Cambria" w:cs="Arial"/>
+              </w:rPr>
+              <w:t>Tasa NBI calculada.</w:t>
             </w:r>
           </w:p>
         </w:tc>
         <w:tc>
           <w:tcPr>
             <w:tcW w:w="1559" w:type="dxa"/>
-          </w:tcPr>
-          <w:p>
-            <w:pPr>
-              <w:spacing w:line="276" w:lineRule="auto"/>
-              <w:rPr>
-                <w:rFonts w:ascii="Cambria" w:hAnsi="Cambria"/>
-              </w:rPr>
-            </w:pPr>
-            <w:r>
-              <w:rPr>
-                <w:rFonts w:ascii="Cambria" w:hAnsi="Cambria"/>
-              </w:rPr>
-              <w:t>Solo valores 0 o 1.</w:t>
+            <w:vAlign w:val="bottom"/>
+          </w:tcPr>
+          <w:p>
+            <w:pPr>
+              <w:spacing w:line="276" w:lineRule="auto"/>
+              <w:rPr>
+                <w:rFonts w:ascii="Cambria" w:hAnsi="Cambria"/>
+              </w:rPr>
+            </w:pPr>
+            <w:r>
+              <w:rPr>
+                <w:rFonts w:ascii="Cambria" w:hAnsi="Cambria" w:cs="Arial"/>
+              </w:rPr>
+              <w:t>0 a 100.</w:t>
             </w:r>
           </w:p>
         </w:tc>
         <w:tc>
           <w:tcPr>
             <w:tcW w:w="1392" w:type="dxa"/>
-          </w:tcPr>
-          <w:p>
-            <w:pPr>
-              <w:spacing w:line="276" w:lineRule="auto"/>
-              <w:rPr>
-                <w:rFonts w:ascii="Cambria" w:hAnsi="Cambria"/>
-              </w:rPr>
-            </w:pPr>
-            <w:r>
-              <w:rPr>
-                <w:rFonts w:ascii="Cambria" w:hAnsi="Cambria"/>
+            <w:vAlign w:val="bottom"/>
+          </w:tcPr>
+          <w:p>
+            <w:pPr>
+              <w:spacing w:line="276" w:lineRule="auto"/>
+              <w:rPr>
+                <w:rFonts w:ascii="Cambria" w:hAnsi="Cambria"/>
+              </w:rPr>
+            </w:pPr>
+            <w:r>
+              <w:rPr>
+                <w:rFonts w:ascii="Cambria" w:hAnsi="Cambria" w:cs="Arial"/>
               </w:rPr>
               <w:t>Sí</w:t>
             </w:r>
@@ -3367,19 +3373,20 @@
         <w:tc>
           <w:tcPr>
             <w:tcW w:w="562" w:type="dxa"/>
-          </w:tcPr>
-          <w:p>
-            <w:pPr>
-              <w:spacing w:line="276" w:lineRule="auto"/>
-              <w:rPr>
-                <w:rFonts w:ascii="Cambria" w:hAnsi="Cambria"/>
-                <w:b/>
-                <w:bCs/>
-              </w:rPr>
-            </w:pPr>
-            <w:r>
-              <w:rPr>
-                <w:rFonts w:ascii="Cambria" w:hAnsi="Cambria"/>
+            <w:vAlign w:val="bottom"/>
+          </w:tcPr>
+          <w:p>
+            <w:pPr>
+              <w:spacing w:line="276" w:lineRule="auto"/>
+              <w:rPr>
+                <w:rFonts w:ascii="Cambria" w:hAnsi="Cambria"/>
+                <w:b/>
+                <w:bCs/>
+              </w:rPr>
+            </w:pPr>
+            <w:r>
+              <w:rPr>
+                <w:rFonts w:ascii="Cambria" w:hAnsi="Cambria" w:cs="Arial"/>
                 <w:b/>
                 <w:bCs/>
               </w:rPr>
@@ -3390,95 +3397,98 @@
         <w:tc>
           <w:tcPr>
             <w:tcW w:w="2410" w:type="dxa"/>
-          </w:tcPr>
-          <w:p>
-            <w:pPr>
-              <w:spacing w:line="276" w:lineRule="auto"/>
-              <w:rPr>
-                <w:rFonts w:ascii="Cambria" w:hAnsi="Cambria"/>
-              </w:rPr>
-            </w:pPr>
-            <w:proofErr w:type="spellStart"/>
-            <w:r>
-              <w:rPr>
-                <w:rFonts w:ascii="Cambria" w:hAnsi="Cambria"/>
-              </w:rPr>
-              <w:t>pobreza_educacion</w:t>
-            </w:r>
-            <w:proofErr w:type="spellEnd"/>
+            <w:vAlign w:val="bottom"/>
+          </w:tcPr>
+          <w:p>
+            <w:pPr>
+              <w:spacing w:line="276" w:lineRule="auto"/>
+              <w:rPr>
+                <w:rFonts w:ascii="Cambria" w:hAnsi="Cambria"/>
+              </w:rPr>
+            </w:pPr>
+            <w:r>
+              <w:rPr>
+                <w:rFonts w:ascii="Cambria" w:hAnsi="Cambria" w:cs="Arial"/>
+              </w:rPr>
+              <w:t>NBI_OFICIAL_INEC</w:t>
+            </w:r>
           </w:p>
         </w:tc>
         <w:tc>
           <w:tcPr>
             <w:tcW w:w="1276" w:type="dxa"/>
-          </w:tcPr>
-          <w:p>
-            <w:pPr>
-              <w:spacing w:line="276" w:lineRule="auto"/>
-              <w:rPr>
-                <w:rFonts w:ascii="Cambria" w:hAnsi="Cambria"/>
-              </w:rPr>
-            </w:pPr>
-            <w:r>
-              <w:rPr>
-                <w:rFonts w:ascii="Cambria" w:hAnsi="Cambria"/>
-              </w:rPr>
-              <w:t>INT</w:t>
+            <w:vAlign w:val="bottom"/>
+          </w:tcPr>
+          <w:p>
+            <w:pPr>
+              <w:spacing w:line="276" w:lineRule="auto"/>
+              <w:rPr>
+                <w:rFonts w:ascii="Cambria" w:hAnsi="Cambria"/>
+              </w:rPr>
+            </w:pPr>
+            <w:r>
+              <w:rPr>
+                <w:rFonts w:ascii="Cambria" w:hAnsi="Cambria" w:cs="Arial"/>
+              </w:rPr>
+              <w:t>DECIMAL</w:t>
             </w:r>
           </w:p>
         </w:tc>
         <w:tc>
           <w:tcPr>
             <w:tcW w:w="1701" w:type="dxa"/>
-          </w:tcPr>
-          <w:p>
-            <w:pPr>
-              <w:spacing w:line="276" w:lineRule="auto"/>
-              <w:rPr>
-                <w:rFonts w:ascii="Cambria" w:hAnsi="Cambria"/>
-              </w:rPr>
-            </w:pPr>
-            <w:r>
-              <w:rPr>
-                <w:rFonts w:ascii="Cambria" w:hAnsi="Cambria"/>
-              </w:rPr>
-              <w:t>Privación en dimensión Educación.</w:t>
+            <w:vAlign w:val="bottom"/>
+          </w:tcPr>
+          <w:p>
+            <w:pPr>
+              <w:spacing w:line="276" w:lineRule="auto"/>
+              <w:rPr>
+                <w:rFonts w:ascii="Cambria" w:hAnsi="Cambria"/>
+              </w:rPr>
+            </w:pPr>
+            <w:r>
+              <w:rPr>
+                <w:rFonts w:ascii="Cambria" w:hAnsi="Cambria" w:cs="Arial"/>
+              </w:rPr>
+              <w:t>Tasa NBI oficial (INEC).</w:t>
             </w:r>
           </w:p>
         </w:tc>
         <w:tc>
           <w:tcPr>
             <w:tcW w:w="1559" w:type="dxa"/>
-          </w:tcPr>
-          <w:p>
-            <w:pPr>
-              <w:spacing w:line="276" w:lineRule="auto"/>
-              <w:rPr>
-                <w:rFonts w:ascii="Cambria" w:hAnsi="Cambria"/>
-              </w:rPr>
-            </w:pPr>
-            <w:r>
-              <w:rPr>
-                <w:rFonts w:ascii="Cambria" w:hAnsi="Cambria"/>
-              </w:rPr>
-              <w:t>Solo valores 0 o 1.</w:t>
+            <w:vAlign w:val="bottom"/>
+          </w:tcPr>
+          <w:p>
+            <w:pPr>
+              <w:spacing w:line="276" w:lineRule="auto"/>
+              <w:rPr>
+                <w:rFonts w:ascii="Cambria" w:hAnsi="Cambria"/>
+              </w:rPr>
+            </w:pPr>
+            <w:r>
+              <w:rPr>
+                <w:rFonts w:ascii="Cambria" w:hAnsi="Cambria" w:cs="Arial"/>
+              </w:rPr>
+              <w:t>0 a 100.</w:t>
             </w:r>
           </w:p>
         </w:tc>
         <w:tc>
           <w:tcPr>
             <w:tcW w:w="1392" w:type="dxa"/>
-          </w:tcPr>
-          <w:p>
-            <w:pPr>
-              <w:spacing w:line="276" w:lineRule="auto"/>
-              <w:rPr>
-                <w:rFonts w:ascii="Cambria" w:hAnsi="Cambria"/>
-              </w:rPr>
-            </w:pPr>
-            <w:r>
-              <w:rPr>
-                <w:rFonts w:ascii="Cambria" w:hAnsi="Cambria"/>
+            <w:vAlign w:val="bottom"/>
+          </w:tcPr>
+          <w:p>
+            <w:pPr>
+              <w:spacing w:line="276" w:lineRule="auto"/>
+              <w:rPr>
+                <w:rFonts w:ascii="Cambria" w:hAnsi="Cambria"/>
+              </w:rPr>
+            </w:pPr>
+            <w:r>
+              <w:rPr>
+                <w:rFonts w:ascii="Cambria" w:hAnsi="Cambria" w:cs="Arial"/>
               </w:rPr>
               <w:t>Sí</w:t>
             </w:r>
@@ -3489,23 +3499,23 @@
         <w:tc>
           <w:tcPr>
             <w:tcW w:w="562" w:type="dxa"/>
-          </w:tcPr>
-          <w:p>
-            <w:pPr>
-              <w:spacing w:line="276" w:lineRule="auto"/>
-              <w:rPr>
-                <w:rFonts w:ascii="Cambria" w:hAnsi="Cambria"/>
-                <w:b/>
-                <w:bCs/>
-              </w:rPr>
-            </w:pPr>
-            <w:r>
-              <w:rPr>
-                <w:rFonts w:ascii="Cambria" w:hAnsi="Cambria"/>
-                <w:b/>
-                <w:bCs/>
-              </w:rPr>
-              <w:lastRenderedPageBreak/>
+            <w:vAlign w:val="bottom"/>
+          </w:tcPr>
+          <w:p>
+            <w:pPr>
+              <w:spacing w:line="276" w:lineRule="auto"/>
+              <w:rPr>
+                <w:rFonts w:ascii="Cambria" w:hAnsi="Cambria"/>
+                <w:b/>
+                <w:bCs/>
+              </w:rPr>
+            </w:pPr>
+            <w:r>
+              <w:rPr>
+                <w:rFonts w:ascii="Cambria" w:hAnsi="Cambria" w:cs="Arial"/>
+                <w:b/>
+                <w:bCs/>
+              </w:rPr>
               <w:t>10</w:t>
             </w:r>
           </w:p>
@@ -3513,95 +3523,98 @@
         <w:tc>
           <w:tcPr>
             <w:tcW w:w="2410" w:type="dxa"/>
-          </w:tcPr>
-          <w:p>
-            <w:pPr>
-              <w:spacing w:line="276" w:lineRule="auto"/>
-              <w:rPr>
-                <w:rFonts w:ascii="Cambria" w:hAnsi="Cambria"/>
-              </w:rPr>
-            </w:pPr>
-            <w:proofErr w:type="spellStart"/>
-            <w:r>
-              <w:rPr>
-                <w:rFonts w:ascii="Cambria" w:hAnsi="Cambria"/>
-              </w:rPr>
-              <w:t>pobreza_servicios</w:t>
-            </w:r>
-            <w:proofErr w:type="spellEnd"/>
+            <w:vAlign w:val="bottom"/>
+          </w:tcPr>
+          <w:p>
+            <w:pPr>
+              <w:spacing w:line="276" w:lineRule="auto"/>
+              <w:rPr>
+                <w:rFonts w:ascii="Cambria" w:hAnsi="Cambria"/>
+              </w:rPr>
+            </w:pPr>
+            <w:r>
+              <w:rPr>
+                <w:rFonts w:ascii="Cambria" w:hAnsi="Cambria" w:cs="Arial"/>
+              </w:rPr>
+              <w:t>PORCENTAJE_DEPENDENCIA</w:t>
+            </w:r>
           </w:p>
         </w:tc>
         <w:tc>
           <w:tcPr>
             <w:tcW w:w="1276" w:type="dxa"/>
-          </w:tcPr>
-          <w:p>
-            <w:pPr>
-              <w:spacing w:line="276" w:lineRule="auto"/>
-              <w:rPr>
-                <w:rFonts w:ascii="Cambria" w:hAnsi="Cambria"/>
-              </w:rPr>
-            </w:pPr>
-            <w:r>
-              <w:rPr>
-                <w:rFonts w:ascii="Cambria" w:hAnsi="Cambria"/>
-              </w:rPr>
-              <w:t>INT</w:t>
+            <w:vAlign w:val="bottom"/>
+          </w:tcPr>
+          <w:p>
+            <w:pPr>
+              <w:spacing w:line="276" w:lineRule="auto"/>
+              <w:rPr>
+                <w:rFonts w:ascii="Cambria" w:hAnsi="Cambria"/>
+              </w:rPr>
+            </w:pPr>
+            <w:r>
+              <w:rPr>
+                <w:rFonts w:ascii="Cambria" w:hAnsi="Cambria" w:cs="Arial"/>
+              </w:rPr>
+              <w:t>DECIMAL</w:t>
             </w:r>
           </w:p>
         </w:tc>
         <w:tc>
           <w:tcPr>
             <w:tcW w:w="1701" w:type="dxa"/>
-          </w:tcPr>
-          <w:p>
-            <w:pPr>
-              <w:spacing w:line="276" w:lineRule="auto"/>
-              <w:rPr>
-                <w:rFonts w:ascii="Cambria" w:hAnsi="Cambria"/>
-              </w:rPr>
-            </w:pPr>
-            <w:r>
-              <w:rPr>
-                <w:rFonts w:ascii="Cambria" w:hAnsi="Cambria"/>
-              </w:rPr>
-              <w:t>Privación en dimensión Servicios.</w:t>
+            <w:vAlign w:val="bottom"/>
+          </w:tcPr>
+          <w:p>
+            <w:pPr>
+              <w:spacing w:line="276" w:lineRule="auto"/>
+              <w:rPr>
+                <w:rFonts w:ascii="Cambria" w:hAnsi="Cambria"/>
+              </w:rPr>
+            </w:pPr>
+            <w:r>
+              <w:rPr>
+                <w:rFonts w:ascii="Cambria" w:hAnsi="Cambria" w:cs="Arial"/>
+              </w:rPr>
+              <w:t>Tasa de privación por dependencia.</w:t>
             </w:r>
           </w:p>
         </w:tc>
         <w:tc>
           <w:tcPr>
             <w:tcW w:w="1559" w:type="dxa"/>
-          </w:tcPr>
-          <w:p>
-            <w:pPr>
-              <w:spacing w:line="276" w:lineRule="auto"/>
-              <w:rPr>
-                <w:rFonts w:ascii="Cambria" w:hAnsi="Cambria"/>
-              </w:rPr>
-            </w:pPr>
-            <w:r>
-              <w:rPr>
-                <w:rFonts w:ascii="Cambria" w:hAnsi="Cambria"/>
-              </w:rPr>
-              <w:t>Solo valores 0 o 1.</w:t>
+            <w:vAlign w:val="bottom"/>
+          </w:tcPr>
+          <w:p>
+            <w:pPr>
+              <w:spacing w:line="276" w:lineRule="auto"/>
+              <w:rPr>
+                <w:rFonts w:ascii="Cambria" w:hAnsi="Cambria"/>
+              </w:rPr>
+            </w:pPr>
+            <w:r>
+              <w:rPr>
+                <w:rFonts w:ascii="Cambria" w:hAnsi="Cambria" w:cs="Arial"/>
+              </w:rPr>
+              <w:t>0 a 100.</w:t>
             </w:r>
           </w:p>
         </w:tc>
         <w:tc>
           <w:tcPr>
             <w:tcW w:w="1392" w:type="dxa"/>
-          </w:tcPr>
-          <w:p>
-            <w:pPr>
-              <w:spacing w:line="276" w:lineRule="auto"/>
-              <w:rPr>
-                <w:rFonts w:ascii="Cambria" w:hAnsi="Cambria"/>
-              </w:rPr>
-            </w:pPr>
-            <w:r>
-              <w:rPr>
-                <w:rFonts w:ascii="Cambria" w:hAnsi="Cambria"/>
+            <w:vAlign w:val="bottom"/>
+          </w:tcPr>
+          <w:p>
+            <w:pPr>
+              <w:spacing w:line="276" w:lineRule="auto"/>
+              <w:rPr>
+                <w:rFonts w:ascii="Cambria" w:hAnsi="Cambria"/>
+              </w:rPr>
+            </w:pPr>
+            <w:r>
+              <w:rPr>
+                <w:rFonts w:ascii="Cambria" w:hAnsi="Cambria" w:cs="Arial"/>
               </w:rPr>
               <w:t>Sí</w:t>
             </w:r>
@@ -3612,19 +3625,20 @@
         <w:tc>
           <w:tcPr>
             <w:tcW w:w="562" w:type="dxa"/>
-          </w:tcPr>
-          <w:p>
-            <w:pPr>
-              <w:spacing w:line="276" w:lineRule="auto"/>
-              <w:rPr>
-                <w:rFonts w:ascii="Cambria" w:hAnsi="Cambria"/>
-                <w:b/>
-                <w:bCs/>
-              </w:rPr>
-            </w:pPr>
-            <w:r>
-              <w:rPr>
-                <w:rFonts w:ascii="Cambria" w:hAnsi="Cambria"/>
+            <w:vAlign w:val="bottom"/>
+          </w:tcPr>
+          <w:p>
+            <w:pPr>
+              <w:spacing w:line="276" w:lineRule="auto"/>
+              <w:rPr>
+                <w:rFonts w:ascii="Cambria" w:hAnsi="Cambria"/>
+                <w:b/>
+                <w:bCs/>
+              </w:rPr>
+            </w:pPr>
+            <w:r>
+              <w:rPr>
+                <w:rFonts w:ascii="Cambria" w:hAnsi="Cambria" w:cs="Arial"/>
                 <w:b/>
                 <w:bCs/>
               </w:rPr>
@@ -3635,95 +3649,98 @@
         <w:tc>
           <w:tcPr>
             <w:tcW w:w="2410" w:type="dxa"/>
-          </w:tcPr>
-          <w:p>
-            <w:pPr>
-              <w:spacing w:line="276" w:lineRule="auto"/>
-              <w:rPr>
-                <w:rFonts w:ascii="Cambria" w:hAnsi="Cambria"/>
-              </w:rPr>
-            </w:pPr>
-            <w:proofErr w:type="spellStart"/>
-            <w:r>
-              <w:rPr>
-                <w:rFonts w:ascii="Cambria" w:hAnsi="Cambria"/>
-              </w:rPr>
-              <w:t>pobreza_hacinamiento</w:t>
-            </w:r>
-            <w:proofErr w:type="spellEnd"/>
+            <w:vAlign w:val="bottom"/>
+          </w:tcPr>
+          <w:p>
+            <w:pPr>
+              <w:spacing w:line="276" w:lineRule="auto"/>
+              <w:rPr>
+                <w:rFonts w:ascii="Cambria" w:hAnsi="Cambria"/>
+              </w:rPr>
+            </w:pPr>
+            <w:r>
+              <w:rPr>
+                <w:rFonts w:ascii="Cambria" w:hAnsi="Cambria" w:cs="Arial"/>
+              </w:rPr>
+              <w:t>PORCENTAJE_EDUCACION</w:t>
+            </w:r>
           </w:p>
         </w:tc>
         <w:tc>
           <w:tcPr>
             <w:tcW w:w="1276" w:type="dxa"/>
-          </w:tcPr>
-          <w:p>
-            <w:pPr>
-              <w:spacing w:line="276" w:lineRule="auto"/>
-              <w:rPr>
-                <w:rFonts w:ascii="Cambria" w:hAnsi="Cambria"/>
-              </w:rPr>
-            </w:pPr>
-            <w:r>
-              <w:rPr>
-                <w:rFonts w:ascii="Cambria" w:hAnsi="Cambria"/>
-              </w:rPr>
-              <w:t>INT</w:t>
+            <w:vAlign w:val="bottom"/>
+          </w:tcPr>
+          <w:p>
+            <w:pPr>
+              <w:spacing w:line="276" w:lineRule="auto"/>
+              <w:rPr>
+                <w:rFonts w:ascii="Cambria" w:hAnsi="Cambria"/>
+              </w:rPr>
+            </w:pPr>
+            <w:r>
+              <w:rPr>
+                <w:rFonts w:ascii="Cambria" w:hAnsi="Cambria" w:cs="Arial"/>
+              </w:rPr>
+              <w:t>DECIMAL</w:t>
             </w:r>
           </w:p>
         </w:tc>
         <w:tc>
           <w:tcPr>
             <w:tcW w:w="1701" w:type="dxa"/>
-          </w:tcPr>
-          <w:p>
-            <w:pPr>
-              <w:spacing w:line="276" w:lineRule="auto"/>
-              <w:rPr>
-                <w:rFonts w:ascii="Cambria" w:hAnsi="Cambria"/>
-              </w:rPr>
-            </w:pPr>
-            <w:r>
-              <w:rPr>
-                <w:rFonts w:ascii="Cambria" w:hAnsi="Cambria"/>
-              </w:rPr>
-              <w:t>Privación en dimensión Hacinamiento.</w:t>
+            <w:vAlign w:val="bottom"/>
+          </w:tcPr>
+          <w:p>
+            <w:pPr>
+              <w:spacing w:line="276" w:lineRule="auto"/>
+              <w:rPr>
+                <w:rFonts w:ascii="Cambria" w:hAnsi="Cambria"/>
+              </w:rPr>
+            </w:pPr>
+            <w:r>
+              <w:rPr>
+                <w:rFonts w:ascii="Cambria" w:hAnsi="Cambria" w:cs="Arial"/>
+              </w:rPr>
+              <w:t>Tasa de privación por educación.</w:t>
             </w:r>
           </w:p>
         </w:tc>
         <w:tc>
           <w:tcPr>
             <w:tcW w:w="1559" w:type="dxa"/>
-          </w:tcPr>
-          <w:p>
-            <w:pPr>
-              <w:spacing w:line="276" w:lineRule="auto"/>
-              <w:rPr>
-                <w:rFonts w:ascii="Cambria" w:hAnsi="Cambria"/>
-              </w:rPr>
-            </w:pPr>
-            <w:r>
-              <w:rPr>
-                <w:rFonts w:ascii="Cambria" w:hAnsi="Cambria"/>
-              </w:rPr>
-              <w:t>Solo valores 0 o 1.</w:t>
+            <w:vAlign w:val="bottom"/>
+          </w:tcPr>
+          <w:p>
+            <w:pPr>
+              <w:spacing w:line="276" w:lineRule="auto"/>
+              <w:rPr>
+                <w:rFonts w:ascii="Cambria" w:hAnsi="Cambria"/>
+              </w:rPr>
+            </w:pPr>
+            <w:r>
+              <w:rPr>
+                <w:rFonts w:ascii="Cambria" w:hAnsi="Cambria" w:cs="Arial"/>
+              </w:rPr>
+              <w:t>0 a 100.</w:t>
             </w:r>
           </w:p>
         </w:tc>
         <w:tc>
           <w:tcPr>
             <w:tcW w:w="1392" w:type="dxa"/>
-          </w:tcPr>
-          <w:p>
-            <w:pPr>
-              <w:spacing w:line="276" w:lineRule="auto"/>
-              <w:rPr>
-                <w:rFonts w:ascii="Cambria" w:hAnsi="Cambria"/>
-              </w:rPr>
-            </w:pPr>
-            <w:r>
-              <w:rPr>
-                <w:rFonts w:ascii="Cambria" w:hAnsi="Cambria"/>
+            <w:vAlign w:val="bottom"/>
+          </w:tcPr>
+          <w:p>
+            <w:pPr>
+              <w:spacing w:line="276" w:lineRule="auto"/>
+              <w:rPr>
+                <w:rFonts w:ascii="Cambria" w:hAnsi="Cambria"/>
+              </w:rPr>
+            </w:pPr>
+            <w:r>
+              <w:rPr>
+                <w:rFonts w:ascii="Cambria" w:hAnsi="Cambria" w:cs="Arial"/>
               </w:rPr>
               <w:t>Sí</w:t>
             </w:r>
@@ -3734,19 +3751,20 @@
         <w:tc>
           <w:tcPr>
             <w:tcW w:w="562" w:type="dxa"/>
-          </w:tcPr>
-          <w:p>
-            <w:pPr>
-              <w:spacing w:line="276" w:lineRule="auto"/>
-              <w:rPr>
-                <w:rFonts w:ascii="Cambria" w:hAnsi="Cambria"/>
-                <w:b/>
-                <w:bCs/>
-              </w:rPr>
-            </w:pPr>
-            <w:r>
-              <w:rPr>
-                <w:rFonts w:ascii="Cambria" w:hAnsi="Cambria"/>
+            <w:vAlign w:val="bottom"/>
+          </w:tcPr>
+          <w:p>
+            <w:pPr>
+              <w:spacing w:line="276" w:lineRule="auto"/>
+              <w:rPr>
+                <w:rFonts w:ascii="Cambria" w:hAnsi="Cambria"/>
+                <w:b/>
+                <w:bCs/>
+              </w:rPr>
+            </w:pPr>
+            <w:r>
+              <w:rPr>
+                <w:rFonts w:ascii="Cambria" w:hAnsi="Cambria" w:cs="Arial"/>
                 <w:b/>
                 <w:bCs/>
               </w:rPr>
@@ -3757,95 +3775,98 @@
         <w:tc>
           <w:tcPr>
             <w:tcW w:w="2410" w:type="dxa"/>
-          </w:tcPr>
-          <w:p>
-            <w:pPr>
-              <w:spacing w:line="276" w:lineRule="auto"/>
-              <w:rPr>
-                <w:rFonts w:ascii="Cambria" w:hAnsi="Cambria"/>
-              </w:rPr>
-            </w:pPr>
-            <w:proofErr w:type="spellStart"/>
-            <w:r>
-              <w:rPr>
-                <w:rFonts w:ascii="Cambria" w:hAnsi="Cambria"/>
-              </w:rPr>
-              <w:t>pobreza_dependencia</w:t>
-            </w:r>
-            <w:proofErr w:type="spellEnd"/>
+            <w:vAlign w:val="bottom"/>
+          </w:tcPr>
+          <w:p>
+            <w:pPr>
+              <w:spacing w:line="276" w:lineRule="auto"/>
+              <w:rPr>
+                <w:rFonts w:ascii="Cambria" w:hAnsi="Cambria"/>
+              </w:rPr>
+            </w:pPr>
+            <w:r>
+              <w:rPr>
+                <w:rFonts w:ascii="Cambria" w:hAnsi="Cambria" w:cs="Arial"/>
+              </w:rPr>
+              <w:t>PORCENTAJE_HACINAMIENTO</w:t>
+            </w:r>
           </w:p>
         </w:tc>
         <w:tc>
           <w:tcPr>
             <w:tcW w:w="1276" w:type="dxa"/>
-          </w:tcPr>
-          <w:p>
-            <w:pPr>
-              <w:spacing w:line="276" w:lineRule="auto"/>
-              <w:rPr>
-                <w:rFonts w:ascii="Cambria" w:hAnsi="Cambria"/>
-              </w:rPr>
-            </w:pPr>
-            <w:r>
-              <w:rPr>
-                <w:rFonts w:ascii="Cambria" w:hAnsi="Cambria"/>
-              </w:rPr>
-              <w:t>INT</w:t>
+            <w:vAlign w:val="bottom"/>
+          </w:tcPr>
+          <w:p>
+            <w:pPr>
+              <w:spacing w:line="276" w:lineRule="auto"/>
+              <w:rPr>
+                <w:rFonts w:ascii="Cambria" w:hAnsi="Cambria"/>
+              </w:rPr>
+            </w:pPr>
+            <w:r>
+              <w:rPr>
+                <w:rFonts w:ascii="Cambria" w:hAnsi="Cambria" w:cs="Arial"/>
+              </w:rPr>
+              <w:t>DECIMAL</w:t>
             </w:r>
           </w:p>
         </w:tc>
         <w:tc>
           <w:tcPr>
             <w:tcW w:w="1701" w:type="dxa"/>
-          </w:tcPr>
-          <w:p>
-            <w:pPr>
-              <w:spacing w:line="276" w:lineRule="auto"/>
-              <w:rPr>
-                <w:rFonts w:ascii="Cambria" w:hAnsi="Cambria"/>
-              </w:rPr>
-            </w:pPr>
-            <w:r>
-              <w:rPr>
-                <w:rFonts w:ascii="Cambria" w:hAnsi="Cambria"/>
-              </w:rPr>
-              <w:t>Privación en dimensión Dependencia.</w:t>
+            <w:vAlign w:val="bottom"/>
+          </w:tcPr>
+          <w:p>
+            <w:pPr>
+              <w:spacing w:line="276" w:lineRule="auto"/>
+              <w:rPr>
+                <w:rFonts w:ascii="Cambria" w:hAnsi="Cambria"/>
+              </w:rPr>
+            </w:pPr>
+            <w:r>
+              <w:rPr>
+                <w:rFonts w:ascii="Cambria" w:hAnsi="Cambria" w:cs="Arial"/>
+              </w:rPr>
+              <w:t>Tasa de privación por hacinamiento.</w:t>
             </w:r>
           </w:p>
         </w:tc>
         <w:tc>
           <w:tcPr>
             <w:tcW w:w="1559" w:type="dxa"/>
-          </w:tcPr>
-          <w:p>
-            <w:pPr>
-              <w:spacing w:line="276" w:lineRule="auto"/>
-              <w:rPr>
-                <w:rFonts w:ascii="Cambria" w:hAnsi="Cambria"/>
-              </w:rPr>
-            </w:pPr>
-            <w:r>
-              <w:rPr>
-                <w:rFonts w:ascii="Cambria" w:hAnsi="Cambria"/>
-              </w:rPr>
-              <w:t>Solo valores 0 o 1.</w:t>
+            <w:vAlign w:val="bottom"/>
+          </w:tcPr>
+          <w:p>
+            <w:pPr>
+              <w:spacing w:line="276" w:lineRule="auto"/>
+              <w:rPr>
+                <w:rFonts w:ascii="Cambria" w:hAnsi="Cambria"/>
+              </w:rPr>
+            </w:pPr>
+            <w:r>
+              <w:rPr>
+                <w:rFonts w:ascii="Cambria" w:hAnsi="Cambria" w:cs="Arial"/>
+              </w:rPr>
+              <w:t>0 a 100.</w:t>
             </w:r>
           </w:p>
         </w:tc>
         <w:tc>
           <w:tcPr>
             <w:tcW w:w="1392" w:type="dxa"/>
-          </w:tcPr>
-          <w:p>
-            <w:pPr>
-              <w:spacing w:line="276" w:lineRule="auto"/>
-              <w:rPr>
-                <w:rFonts w:ascii="Cambria" w:hAnsi="Cambria"/>
-              </w:rPr>
-            </w:pPr>
-            <w:r>
-              <w:rPr>
-                <w:rFonts w:ascii="Cambria" w:hAnsi="Cambria"/>
+            <w:vAlign w:val="bottom"/>
+          </w:tcPr>
+          <w:p>
+            <w:pPr>
+              <w:spacing w:line="276" w:lineRule="auto"/>
+              <w:rPr>
+                <w:rFonts w:ascii="Cambria" w:hAnsi="Cambria"/>
+              </w:rPr>
+            </w:pPr>
+            <w:r>
+              <w:rPr>
+                <w:rFonts w:ascii="Cambria" w:hAnsi="Cambria" w:cs="Arial"/>
               </w:rPr>
               <w:t>Sí</w:t>
             </w:r>
@@ -3856,22 +3877,24 @@
         <w:tc>
           <w:tcPr>
             <w:tcW w:w="562" w:type="dxa"/>
-          </w:tcPr>
-          <w:p>
-            <w:pPr>
-              <w:spacing w:line="276" w:lineRule="auto"/>
-              <w:rPr>
-                <w:rFonts w:ascii="Cambria" w:hAnsi="Cambria"/>
-                <w:b/>
-                <w:bCs/>
-              </w:rPr>
-            </w:pPr>
-            <w:r>
-              <w:rPr>
-                <w:rFonts w:ascii="Cambria" w:hAnsi="Cambria"/>
-                <w:b/>
-                <w:bCs/>
-              </w:rPr>
+            <w:vAlign w:val="bottom"/>
+          </w:tcPr>
+          <w:p>
+            <w:pPr>
+              <w:spacing w:line="276" w:lineRule="auto"/>
+              <w:rPr>
+                <w:rFonts w:ascii="Cambria" w:hAnsi="Cambria"/>
+                <w:b/>
+                <w:bCs/>
+              </w:rPr>
+            </w:pPr>
+            <w:r>
+              <w:rPr>
+                <w:rFonts w:ascii="Cambria" w:hAnsi="Cambria" w:cs="Arial"/>
+                <w:b/>
+                <w:bCs/>
+              </w:rPr>
+              <w:lastRenderedPageBreak/>
               <w:t>13</w:t>
             </w:r>
           </w:p>
@@ -3879,95 +3902,98 @@
         <w:tc>
           <w:tcPr>
             <w:tcW w:w="2410" w:type="dxa"/>
-          </w:tcPr>
-          <w:p>
-            <w:pPr>
-              <w:spacing w:line="276" w:lineRule="auto"/>
-              <w:rPr>
-                <w:rFonts w:ascii="Cambria" w:hAnsi="Cambria"/>
-              </w:rPr>
-            </w:pPr>
-            <w:proofErr w:type="spellStart"/>
-            <w:r>
-              <w:rPr>
-                <w:rFonts w:ascii="Cambria" w:hAnsi="Cambria"/>
-              </w:rPr>
-              <w:t>quintil_ingreso</w:t>
-            </w:r>
-            <w:proofErr w:type="spellEnd"/>
+            <w:vAlign w:val="bottom"/>
+          </w:tcPr>
+          <w:p>
+            <w:pPr>
+              <w:spacing w:line="276" w:lineRule="auto"/>
+              <w:rPr>
+                <w:rFonts w:ascii="Cambria" w:hAnsi="Cambria"/>
+              </w:rPr>
+            </w:pPr>
+            <w:r>
+              <w:rPr>
+                <w:rFonts w:ascii="Cambria" w:hAnsi="Cambria" w:cs="Arial"/>
+              </w:rPr>
+              <w:t>PORCENTAJE_SERVICIOS</w:t>
+            </w:r>
           </w:p>
         </w:tc>
         <w:tc>
           <w:tcPr>
             <w:tcW w:w="1276" w:type="dxa"/>
-          </w:tcPr>
-          <w:p>
-            <w:pPr>
-              <w:spacing w:line="276" w:lineRule="auto"/>
-              <w:rPr>
-                <w:rFonts w:ascii="Cambria" w:hAnsi="Cambria"/>
-              </w:rPr>
-            </w:pPr>
-            <w:r>
-              <w:rPr>
-                <w:rFonts w:ascii="Cambria" w:hAnsi="Cambria"/>
-              </w:rPr>
-              <w:t>VARCHAR</w:t>
+            <w:vAlign w:val="bottom"/>
+          </w:tcPr>
+          <w:p>
+            <w:pPr>
+              <w:spacing w:line="276" w:lineRule="auto"/>
+              <w:rPr>
+                <w:rFonts w:ascii="Cambria" w:hAnsi="Cambria"/>
+              </w:rPr>
+            </w:pPr>
+            <w:r>
+              <w:rPr>
+                <w:rFonts w:ascii="Cambria" w:hAnsi="Cambria" w:cs="Arial"/>
+              </w:rPr>
+              <w:t>DECIMAL</w:t>
             </w:r>
           </w:p>
         </w:tc>
         <w:tc>
           <w:tcPr>
             <w:tcW w:w="1701" w:type="dxa"/>
-          </w:tcPr>
-          <w:p>
-            <w:pPr>
-              <w:spacing w:line="276" w:lineRule="auto"/>
-              <w:rPr>
-                <w:rFonts w:ascii="Cambria" w:hAnsi="Cambria"/>
-              </w:rPr>
-            </w:pPr>
-            <w:r>
-              <w:rPr>
-                <w:rFonts w:ascii="Cambria" w:hAnsi="Cambria"/>
-              </w:rPr>
-              <w:t>Segmento de ingreso per cápita (Q1 a Q5).</w:t>
+            <w:vAlign w:val="bottom"/>
+          </w:tcPr>
+          <w:p>
+            <w:pPr>
+              <w:spacing w:line="276" w:lineRule="auto"/>
+              <w:rPr>
+                <w:rFonts w:ascii="Cambria" w:hAnsi="Cambria"/>
+              </w:rPr>
+            </w:pPr>
+            <w:r>
+              <w:rPr>
+                <w:rFonts w:ascii="Cambria" w:hAnsi="Cambria" w:cs="Arial"/>
+              </w:rPr>
+              <w:t>Tasa de privación por servicios.</w:t>
             </w:r>
           </w:p>
         </w:tc>
         <w:tc>
           <w:tcPr>
             <w:tcW w:w="1559" w:type="dxa"/>
-          </w:tcPr>
-          <w:p>
-            <w:pPr>
-              <w:spacing w:line="276" w:lineRule="auto"/>
-              <w:rPr>
-                <w:rFonts w:ascii="Cambria" w:hAnsi="Cambria"/>
-              </w:rPr>
-            </w:pPr>
-            <w:r>
-              <w:rPr>
-                <w:rFonts w:ascii="Cambria" w:hAnsi="Cambria"/>
-              </w:rPr>
-              <w:t>Rango estricto de 'Q1' a 'Q5'</w:t>
+            <w:vAlign w:val="bottom"/>
+          </w:tcPr>
+          <w:p>
+            <w:pPr>
+              <w:spacing w:line="276" w:lineRule="auto"/>
+              <w:rPr>
+                <w:rFonts w:ascii="Cambria" w:hAnsi="Cambria"/>
+              </w:rPr>
+            </w:pPr>
+            <w:r>
+              <w:rPr>
+                <w:rFonts w:ascii="Cambria" w:hAnsi="Cambria" w:cs="Arial"/>
+              </w:rPr>
+              <w:t>0 a 100.</w:t>
             </w:r>
           </w:p>
         </w:tc>
         <w:tc>
           <w:tcPr>
             <w:tcW w:w="1392" w:type="dxa"/>
-          </w:tcPr>
-          <w:p>
-            <w:pPr>
-              <w:spacing w:line="276" w:lineRule="auto"/>
-              <w:rPr>
-                <w:rFonts w:ascii="Cambria" w:hAnsi="Cambria"/>
-              </w:rPr>
-            </w:pPr>
-            <w:r>
-              <w:rPr>
-                <w:rFonts w:ascii="Cambria" w:hAnsi="Cambria"/>
+            <w:vAlign w:val="bottom"/>
+          </w:tcPr>
+          <w:p>
+            <w:pPr>
+              <w:spacing w:line="276" w:lineRule="auto"/>
+              <w:rPr>
+                <w:rFonts w:ascii="Cambria" w:hAnsi="Cambria"/>
+              </w:rPr>
+            </w:pPr>
+            <w:r>
+              <w:rPr>
+                <w:rFonts w:ascii="Cambria" w:hAnsi="Cambria" w:cs="Arial"/>
               </w:rPr>
               <w:t>Sí</w:t>
             </w:r>
@@ -3978,19 +4004,20 @@
         <w:tc>
           <w:tcPr>
             <w:tcW w:w="562" w:type="dxa"/>
-          </w:tcPr>
-          <w:p>
-            <w:pPr>
-              <w:spacing w:line="276" w:lineRule="auto"/>
-              <w:rPr>
-                <w:rFonts w:ascii="Cambria" w:hAnsi="Cambria"/>
-                <w:b/>
-                <w:bCs/>
-              </w:rPr>
-            </w:pPr>
-            <w:r>
-              <w:rPr>
-                <w:rFonts w:ascii="Cambria" w:hAnsi="Cambria"/>
+            <w:vAlign w:val="bottom"/>
+          </w:tcPr>
+          <w:p>
+            <w:pPr>
+              <w:spacing w:line="276" w:lineRule="auto"/>
+              <w:rPr>
+                <w:rFonts w:ascii="Cambria" w:hAnsi="Cambria"/>
+                <w:b/>
+                <w:bCs/>
+              </w:rPr>
+            </w:pPr>
+            <w:r>
+              <w:rPr>
+                <w:rFonts w:ascii="Cambria" w:hAnsi="Cambria" w:cs="Arial"/>
                 <w:b/>
                 <w:bCs/>
               </w:rPr>
@@ -4001,6 +4028,763 @@
         <w:tc>
           <w:tcPr>
             <w:tcW w:w="2410" w:type="dxa"/>
+            <w:vAlign w:val="bottom"/>
+          </w:tcPr>
+          <w:p>
+            <w:pPr>
+              <w:spacing w:line="276" w:lineRule="auto"/>
+              <w:rPr>
+                <w:rFonts w:ascii="Cambria" w:hAnsi="Cambria"/>
+              </w:rPr>
+            </w:pPr>
+            <w:r>
+              <w:rPr>
+                <w:rFonts w:ascii="Cambria" w:hAnsi="Cambria" w:cs="Arial"/>
+              </w:rPr>
+              <w:t>PORCENTAJE_VIVIENDA</w:t>
+            </w:r>
+          </w:p>
+        </w:tc>
+        <w:tc>
+          <w:tcPr>
+            <w:tcW w:w="1276" w:type="dxa"/>
+            <w:vAlign w:val="bottom"/>
+          </w:tcPr>
+          <w:p>
+            <w:pPr>
+              <w:spacing w:line="276" w:lineRule="auto"/>
+              <w:rPr>
+                <w:rFonts w:ascii="Cambria" w:hAnsi="Cambria"/>
+              </w:rPr>
+            </w:pPr>
+            <w:r>
+              <w:rPr>
+                <w:rFonts w:ascii="Cambria" w:hAnsi="Cambria" w:cs="Arial"/>
+              </w:rPr>
+              <w:t>DECIMAL</w:t>
+            </w:r>
+          </w:p>
+        </w:tc>
+        <w:tc>
+          <w:tcPr>
+            <w:tcW w:w="1701" w:type="dxa"/>
+            <w:vAlign w:val="bottom"/>
+          </w:tcPr>
+          <w:p>
+            <w:pPr>
+              <w:spacing w:line="276" w:lineRule="auto"/>
+              <w:rPr>
+                <w:rFonts w:ascii="Cambria" w:hAnsi="Cambria"/>
+              </w:rPr>
+            </w:pPr>
+            <w:r>
+              <w:rPr>
+                <w:rFonts w:ascii="Cambria" w:hAnsi="Cambria" w:cs="Arial"/>
+              </w:rPr>
+              <w:t>Tasa de privación por vivienda.</w:t>
+            </w:r>
+          </w:p>
+        </w:tc>
+        <w:tc>
+          <w:tcPr>
+            <w:tcW w:w="1559" w:type="dxa"/>
+            <w:vAlign w:val="bottom"/>
+          </w:tcPr>
+          <w:p>
+            <w:pPr>
+              <w:spacing w:line="276" w:lineRule="auto"/>
+              <w:rPr>
+                <w:rFonts w:ascii="Cambria" w:hAnsi="Cambria"/>
+              </w:rPr>
+            </w:pPr>
+            <w:r>
+              <w:rPr>
+                <w:rFonts w:ascii="Cambria" w:hAnsi="Cambria" w:cs="Arial"/>
+              </w:rPr>
+              <w:t>0 a 100.</w:t>
+            </w:r>
+          </w:p>
+        </w:tc>
+        <w:tc>
+          <w:tcPr>
+            <w:tcW w:w="1392" w:type="dxa"/>
+            <w:vAlign w:val="bottom"/>
+          </w:tcPr>
+          <w:p>
+            <w:pPr>
+              <w:spacing w:line="276" w:lineRule="auto"/>
+              <w:rPr>
+                <w:rFonts w:ascii="Cambria" w:hAnsi="Cambria"/>
+              </w:rPr>
+            </w:pPr>
+            <w:r>
+              <w:rPr>
+                <w:rFonts w:ascii="Cambria" w:hAnsi="Cambria" w:cs="Arial"/>
+              </w:rPr>
+              <w:t>Sí</w:t>
+            </w:r>
+          </w:p>
+        </w:tc>
+      </w:tr>
+      <w:tr>
+        <w:tc>
+          <w:tcPr>
+            <w:tcW w:w="562" w:type="dxa"/>
+            <w:vAlign w:val="bottom"/>
+          </w:tcPr>
+          <w:p>
+            <w:pPr>
+              <w:spacing w:line="276" w:lineRule="auto"/>
+              <w:rPr>
+                <w:rFonts w:ascii="Cambria" w:hAnsi="Cambria"/>
+                <w:b/>
+                <w:bCs/>
+              </w:rPr>
+            </w:pPr>
+            <w:r>
+              <w:rPr>
+                <w:rFonts w:ascii="Cambria" w:hAnsi="Cambria" w:cs="Arial"/>
+                <w:b/>
+                <w:bCs/>
+              </w:rPr>
+              <w:t>15</w:t>
+            </w:r>
+          </w:p>
+        </w:tc>
+        <w:tc>
+          <w:tcPr>
+            <w:tcW w:w="2410" w:type="dxa"/>
+            <w:vAlign w:val="bottom"/>
+          </w:tcPr>
+          <w:p>
+            <w:pPr>
+              <w:spacing w:line="276" w:lineRule="auto"/>
+              <w:rPr>
+                <w:rFonts w:ascii="Cambria" w:hAnsi="Cambria"/>
+              </w:rPr>
+            </w:pPr>
+            <w:r>
+              <w:rPr>
+                <w:rFonts w:ascii="Cambria" w:hAnsi="Cambria" w:cs="Arial"/>
+              </w:rPr>
+              <w:t>DIMENSION_NBI</w:t>
+            </w:r>
+          </w:p>
+        </w:tc>
+        <w:tc>
+          <w:tcPr>
+            <w:tcW w:w="1276" w:type="dxa"/>
+            <w:vAlign w:val="bottom"/>
+          </w:tcPr>
+          <w:p>
+            <w:pPr>
+              <w:spacing w:line="276" w:lineRule="auto"/>
+              <w:rPr>
+                <w:rFonts w:ascii="Cambria" w:hAnsi="Cambria"/>
+              </w:rPr>
+            </w:pPr>
+            <w:r>
+              <w:rPr>
+                <w:rFonts w:ascii="Cambria" w:hAnsi="Cambria" w:cs="Arial"/>
+              </w:rPr>
+              <w:t>VARCHAR</w:t>
+            </w:r>
+          </w:p>
+        </w:tc>
+        <w:tc>
+          <w:tcPr>
+            <w:tcW w:w="1701" w:type="dxa"/>
+            <w:vAlign w:val="bottom"/>
+          </w:tcPr>
+          <w:p>
+            <w:pPr>
+              <w:spacing w:line="276" w:lineRule="auto"/>
+              <w:rPr>
+                <w:rFonts w:ascii="Cambria" w:hAnsi="Cambria"/>
+              </w:rPr>
+            </w:pPr>
+            <w:r>
+              <w:rPr>
+                <w:rFonts w:ascii="Cambria" w:hAnsi="Cambria" w:cs="Arial"/>
+              </w:rPr>
+              <w:t>Nombre de la dimensión NBI.</w:t>
+            </w:r>
+          </w:p>
+        </w:tc>
+        <w:tc>
+          <w:tcPr>
+            <w:tcW w:w="1559" w:type="dxa"/>
+            <w:vAlign w:val="bottom"/>
+          </w:tcPr>
+          <w:p>
+            <w:pPr>
+              <w:spacing w:line="276" w:lineRule="auto"/>
+              <w:rPr>
+                <w:rFonts w:ascii="Cambria" w:hAnsi="Cambria"/>
+              </w:rPr>
+            </w:pPr>
+            <w:r>
+              <w:rPr>
+                <w:rFonts w:ascii="Cambria" w:hAnsi="Cambria" w:cs="Arial"/>
+              </w:rPr>
+              <w:t>Solo dimensiones válidas.</w:t>
+            </w:r>
+          </w:p>
+        </w:tc>
+        <w:tc>
+          <w:tcPr>
+            <w:tcW w:w="1392" w:type="dxa"/>
+            <w:vAlign w:val="bottom"/>
+          </w:tcPr>
+          <w:p>
+            <w:pPr>
+              <w:spacing w:line="276" w:lineRule="auto"/>
+              <w:rPr>
+                <w:rFonts w:ascii="Cambria" w:hAnsi="Cambria"/>
+              </w:rPr>
+            </w:pPr>
+            <w:r>
+              <w:rPr>
+                <w:rFonts w:ascii="Cambria" w:hAnsi="Cambria" w:cs="Arial"/>
+              </w:rPr>
+              <w:t>Sí</w:t>
+            </w:r>
+          </w:p>
+        </w:tc>
+      </w:tr>
+      <w:tr>
+        <w:tc>
+          <w:tcPr>
+            <w:tcW w:w="562" w:type="dxa"/>
+            <w:vAlign w:val="bottom"/>
+          </w:tcPr>
+          <w:p>
+            <w:pPr>
+              <w:spacing w:line="276" w:lineRule="auto"/>
+              <w:rPr>
+                <w:rFonts w:ascii="Cambria" w:hAnsi="Cambria"/>
+                <w:b/>
+                <w:bCs/>
+              </w:rPr>
+            </w:pPr>
+            <w:r>
+              <w:rPr>
+                <w:rFonts w:ascii="Cambria" w:hAnsi="Cambria" w:cs="Arial"/>
+                <w:b/>
+                <w:bCs/>
+              </w:rPr>
+              <w:t>16</w:t>
+            </w:r>
+          </w:p>
+        </w:tc>
+        <w:tc>
+          <w:tcPr>
+            <w:tcW w:w="2410" w:type="dxa"/>
+            <w:vAlign w:val="bottom"/>
+          </w:tcPr>
+          <w:p>
+            <w:pPr>
+              <w:spacing w:line="276" w:lineRule="auto"/>
+              <w:rPr>
+                <w:rFonts w:ascii="Cambria" w:hAnsi="Cambria"/>
+              </w:rPr>
+            </w:pPr>
+            <w:r>
+              <w:rPr>
+                <w:rFonts w:ascii="Cambria" w:hAnsi="Cambria" w:cs="Arial"/>
+              </w:rPr>
+              <w:t>VALOR_NORMALIZADO</w:t>
+            </w:r>
+          </w:p>
+        </w:tc>
+        <w:tc>
+          <w:tcPr>
+            <w:tcW w:w="1276" w:type="dxa"/>
+            <w:vAlign w:val="bottom"/>
+          </w:tcPr>
+          <w:p>
+            <w:pPr>
+              <w:spacing w:line="276" w:lineRule="auto"/>
+              <w:rPr>
+                <w:rFonts w:ascii="Cambria" w:hAnsi="Cambria"/>
+              </w:rPr>
+            </w:pPr>
+            <w:r>
+              <w:rPr>
+                <w:rFonts w:ascii="Cambria" w:hAnsi="Cambria" w:cs="Arial"/>
+              </w:rPr>
+              <w:t>DECIMAL</w:t>
+            </w:r>
+          </w:p>
+        </w:tc>
+        <w:tc>
+          <w:tcPr>
+            <w:tcW w:w="1701" w:type="dxa"/>
+            <w:vAlign w:val="bottom"/>
+          </w:tcPr>
+          <w:p>
+            <w:pPr>
+              <w:spacing w:line="276" w:lineRule="auto"/>
+              <w:rPr>
+                <w:rFonts w:ascii="Cambria" w:hAnsi="Cambria"/>
+              </w:rPr>
+            </w:pPr>
+            <w:r>
+              <w:rPr>
+                <w:rFonts w:ascii="Cambria" w:hAnsi="Cambria" w:cs="Arial"/>
+              </w:rPr>
+              <w:t>Contribución % de la dimensión.</w:t>
+            </w:r>
+          </w:p>
+        </w:tc>
+        <w:tc>
+          <w:tcPr>
+            <w:tcW w:w="1559" w:type="dxa"/>
+            <w:vAlign w:val="bottom"/>
+          </w:tcPr>
+          <w:p>
+            <w:pPr>
+              <w:spacing w:line="276" w:lineRule="auto"/>
+              <w:rPr>
+                <w:rFonts w:ascii="Cambria" w:hAnsi="Cambria"/>
+              </w:rPr>
+            </w:pPr>
+            <w:r>
+              <w:rPr>
+                <w:rFonts w:ascii="Cambria" w:hAnsi="Cambria" w:cs="Arial"/>
+              </w:rPr>
+              <w:t>0 a 100.</w:t>
+            </w:r>
+          </w:p>
+        </w:tc>
+        <w:tc>
+          <w:tcPr>
+            <w:tcW w:w="1392" w:type="dxa"/>
+            <w:vAlign w:val="bottom"/>
+          </w:tcPr>
+          <w:p>
+            <w:pPr>
+              <w:spacing w:line="276" w:lineRule="auto"/>
+              <w:rPr>
+                <w:rFonts w:ascii="Cambria" w:hAnsi="Cambria"/>
+              </w:rPr>
+            </w:pPr>
+            <w:r>
+              <w:rPr>
+                <w:rFonts w:ascii="Cambria" w:hAnsi="Cambria" w:cs="Arial"/>
+              </w:rPr>
+              <w:t>Sí</w:t>
+            </w:r>
+          </w:p>
+        </w:tc>
+      </w:tr>
+      <w:tr>
+        <w:tc>
+          <w:tcPr>
+            <w:tcW w:w="562" w:type="dxa"/>
+            <w:vAlign w:val="bottom"/>
+          </w:tcPr>
+          <w:p>
+            <w:pPr>
+              <w:spacing w:line="276" w:lineRule="auto"/>
+              <w:rPr>
+                <w:rFonts w:ascii="Cambria" w:hAnsi="Cambria"/>
+                <w:b/>
+                <w:bCs/>
+              </w:rPr>
+            </w:pPr>
+            <w:r>
+              <w:rPr>
+                <w:rFonts w:ascii="Cambria" w:hAnsi="Cambria" w:cs="Arial"/>
+                <w:b/>
+                <w:bCs/>
+              </w:rPr>
+              <w:t>17</w:t>
+            </w:r>
+          </w:p>
+        </w:tc>
+        <w:tc>
+          <w:tcPr>
+            <w:tcW w:w="2410" w:type="dxa"/>
+            <w:vAlign w:val="bottom"/>
+          </w:tcPr>
+          <w:p>
+            <w:pPr>
+              <w:spacing w:line="276" w:lineRule="auto"/>
+              <w:rPr>
+                <w:rFonts w:ascii="Cambria" w:hAnsi="Cambria"/>
+              </w:rPr>
+            </w:pPr>
+            <w:r>
+              <w:rPr>
+                <w:rFonts w:ascii="Cambria" w:hAnsi="Cambria" w:cs="Arial"/>
+              </w:rPr>
+              <w:t>QUINTIL_INGPC_ETIQUETA</w:t>
+            </w:r>
+          </w:p>
+        </w:tc>
+        <w:tc>
+          <w:tcPr>
+            <w:tcW w:w="1276" w:type="dxa"/>
+            <w:vAlign w:val="bottom"/>
+          </w:tcPr>
+          <w:p>
+            <w:pPr>
+              <w:spacing w:line="276" w:lineRule="auto"/>
+              <w:rPr>
+                <w:rFonts w:ascii="Cambria" w:hAnsi="Cambria"/>
+              </w:rPr>
+            </w:pPr>
+            <w:r>
+              <w:rPr>
+                <w:rFonts w:ascii="Cambria" w:hAnsi="Cambria" w:cs="Arial"/>
+              </w:rPr>
+              <w:t>VARCHAR</w:t>
+            </w:r>
+          </w:p>
+        </w:tc>
+        <w:tc>
+          <w:tcPr>
+            <w:tcW w:w="1701" w:type="dxa"/>
+            <w:vAlign w:val="bottom"/>
+          </w:tcPr>
+          <w:p>
+            <w:pPr>
+              <w:spacing w:line="276" w:lineRule="auto"/>
+              <w:rPr>
+                <w:rFonts w:ascii="Cambria" w:hAnsi="Cambria"/>
+              </w:rPr>
+            </w:pPr>
+            <w:r>
+              <w:rPr>
+                <w:rFonts w:ascii="Cambria" w:hAnsi="Cambria" w:cs="Arial"/>
+              </w:rPr>
+              <w:t>Segmento de ingresos (Q1-Q5).</w:t>
+            </w:r>
+          </w:p>
+        </w:tc>
+        <w:tc>
+          <w:tcPr>
+            <w:tcW w:w="1559" w:type="dxa"/>
+            <w:vAlign w:val="bottom"/>
+          </w:tcPr>
+          <w:p>
+            <w:pPr>
+              <w:spacing w:line="276" w:lineRule="auto"/>
+              <w:rPr>
+                <w:rFonts w:ascii="Cambria" w:hAnsi="Cambria"/>
+              </w:rPr>
+            </w:pPr>
+            <w:r>
+              <w:rPr>
+                <w:rFonts w:ascii="Cambria" w:hAnsi="Cambria" w:cs="Arial"/>
+              </w:rPr>
+              <w:t>Formato estándar (Q1 a Q5).</w:t>
+            </w:r>
+          </w:p>
+        </w:tc>
+        <w:tc>
+          <w:tcPr>
+            <w:tcW w:w="1392" w:type="dxa"/>
+            <w:vAlign w:val="bottom"/>
+          </w:tcPr>
+          <w:p>
+            <w:pPr>
+              <w:spacing w:line="276" w:lineRule="auto"/>
+              <w:rPr>
+                <w:rFonts w:ascii="Cambria" w:hAnsi="Cambria"/>
+              </w:rPr>
+            </w:pPr>
+            <w:r>
+              <w:rPr>
+                <w:rFonts w:ascii="Cambria" w:hAnsi="Cambria" w:cs="Arial"/>
+              </w:rPr>
+              <w:t>Sí</w:t>
+            </w:r>
+          </w:p>
+        </w:tc>
+      </w:tr>
+      <w:tr>
+        <w:tc>
+          <w:tcPr>
+            <w:tcW w:w="562" w:type="dxa"/>
+            <w:vAlign w:val="bottom"/>
+          </w:tcPr>
+          <w:p>
+            <w:pPr>
+              <w:spacing w:line="276" w:lineRule="auto"/>
+              <w:rPr>
+                <w:rFonts w:ascii="Cambria" w:hAnsi="Cambria"/>
+                <w:b/>
+                <w:bCs/>
+              </w:rPr>
+            </w:pPr>
+            <w:r>
+              <w:rPr>
+                <w:rFonts w:ascii="Cambria" w:hAnsi="Cambria" w:cs="Arial"/>
+                <w:b/>
+                <w:bCs/>
+              </w:rPr>
+              <w:t>18</w:t>
+            </w:r>
+          </w:p>
+        </w:tc>
+        <w:tc>
+          <w:tcPr>
+            <w:tcW w:w="2410" w:type="dxa"/>
+            <w:vAlign w:val="bottom"/>
+          </w:tcPr>
+          <w:p>
+            <w:pPr>
+              <w:spacing w:line="276" w:lineRule="auto"/>
+              <w:rPr>
+                <w:rFonts w:ascii="Cambria" w:hAnsi="Cambria"/>
+              </w:rPr>
+            </w:pPr>
+            <w:r>
+              <w:rPr>
+                <w:rFonts w:ascii="Cambria" w:hAnsi="Cambria" w:cs="Arial"/>
+              </w:rPr>
+              <w:t>% NBI</w:t>
+            </w:r>
+          </w:p>
+        </w:tc>
+        <w:tc>
+          <w:tcPr>
+            <w:tcW w:w="1276" w:type="dxa"/>
+            <w:vAlign w:val="bottom"/>
+          </w:tcPr>
+          <w:p>
+            <w:pPr>
+              <w:spacing w:line="276" w:lineRule="auto"/>
+              <w:rPr>
+                <w:rFonts w:ascii="Cambria" w:hAnsi="Cambria"/>
+              </w:rPr>
+            </w:pPr>
+            <w:r>
+              <w:rPr>
+                <w:rFonts w:ascii="Cambria" w:hAnsi="Cambria" w:cs="Arial"/>
+              </w:rPr>
+              <w:t>DECIMAL</w:t>
+            </w:r>
+          </w:p>
+        </w:tc>
+        <w:tc>
+          <w:tcPr>
+            <w:tcW w:w="1701" w:type="dxa"/>
+            <w:vAlign w:val="bottom"/>
+          </w:tcPr>
+          <w:p>
+            <w:pPr>
+              <w:spacing w:line="276" w:lineRule="auto"/>
+              <w:rPr>
+                <w:rFonts w:ascii="Cambria" w:hAnsi="Cambria"/>
+              </w:rPr>
+            </w:pPr>
+            <w:r>
+              <w:rPr>
+                <w:rFonts w:ascii="Cambria" w:hAnsi="Cambria" w:cs="Arial"/>
+              </w:rPr>
+              <w:t>Tasa NBI por quintil.</w:t>
+            </w:r>
+          </w:p>
+        </w:tc>
+        <w:tc>
+          <w:tcPr>
+            <w:tcW w:w="1559" w:type="dxa"/>
+            <w:vAlign w:val="bottom"/>
+          </w:tcPr>
+          <w:p>
+            <w:pPr>
+              <w:spacing w:line="276" w:lineRule="auto"/>
+              <w:rPr>
+                <w:rFonts w:ascii="Cambria" w:hAnsi="Cambria"/>
+              </w:rPr>
+            </w:pPr>
+            <w:r>
+              <w:rPr>
+                <w:rFonts w:ascii="Cambria" w:hAnsi="Cambria" w:cs="Arial"/>
+              </w:rPr>
+              <w:t>0 a 100. Sin nulos.</w:t>
+            </w:r>
+          </w:p>
+        </w:tc>
+        <w:tc>
+          <w:tcPr>
+            <w:tcW w:w="1392" w:type="dxa"/>
+            <w:vAlign w:val="bottom"/>
+          </w:tcPr>
+          <w:p>
+            <w:pPr>
+              <w:spacing w:line="276" w:lineRule="auto"/>
+              <w:rPr>
+                <w:rFonts w:ascii="Cambria" w:hAnsi="Cambria"/>
+              </w:rPr>
+            </w:pPr>
+            <w:r>
+              <w:rPr>
+                <w:rFonts w:ascii="Cambria" w:hAnsi="Cambria" w:cs="Arial"/>
+              </w:rPr>
+              <w:t>Sí</w:t>
+            </w:r>
+          </w:p>
+        </w:tc>
+      </w:tr>
+      <w:tr>
+        <w:tc>
+          <w:tcPr>
+            <w:tcW w:w="562" w:type="dxa"/>
+            <w:vAlign w:val="bottom"/>
+          </w:tcPr>
+          <w:p>
+            <w:pPr>
+              <w:spacing w:line="276" w:lineRule="auto"/>
+              <w:rPr>
+                <w:rFonts w:ascii="Cambria" w:hAnsi="Cambria"/>
+                <w:b/>
+                <w:bCs/>
+              </w:rPr>
+            </w:pPr>
+            <w:r>
+              <w:rPr>
+                <w:rFonts w:ascii="Cambria" w:hAnsi="Cambria" w:cs="Arial"/>
+                <w:b/>
+                <w:bCs/>
+              </w:rPr>
+              <w:t>19</w:t>
+            </w:r>
+          </w:p>
+        </w:tc>
+        <w:tc>
+          <w:tcPr>
+            <w:tcW w:w="2410" w:type="dxa"/>
+            <w:vAlign w:val="bottom"/>
+          </w:tcPr>
+          <w:p>
+            <w:pPr>
+              <w:spacing w:line="276" w:lineRule="auto"/>
+              <w:rPr>
+                <w:rFonts w:ascii="Cambria" w:hAnsi="Cambria"/>
+              </w:rPr>
+            </w:pPr>
+            <w:r>
+              <w:rPr>
+                <w:rFonts w:ascii="Cambria" w:hAnsi="Cambria" w:cs="Arial"/>
+              </w:rPr>
+              <w:t>Hogares expandidos</w:t>
+            </w:r>
+          </w:p>
+        </w:tc>
+        <w:tc>
+          <w:tcPr>
+            <w:tcW w:w="1276" w:type="dxa"/>
+            <w:vAlign w:val="bottom"/>
+          </w:tcPr>
+          <w:p>
+            <w:pPr>
+              <w:spacing w:line="276" w:lineRule="auto"/>
+              <w:rPr>
+                <w:rFonts w:ascii="Cambria" w:hAnsi="Cambria"/>
+              </w:rPr>
+            </w:pPr>
+            <w:r>
+              <w:rPr>
+                <w:rFonts w:ascii="Cambria" w:hAnsi="Cambria" w:cs="Arial"/>
+              </w:rPr>
+              <w:t>DECIMAL</w:t>
+            </w:r>
+          </w:p>
+        </w:tc>
+        <w:tc>
+          <w:tcPr>
+            <w:tcW w:w="1701" w:type="dxa"/>
+            <w:vAlign w:val="bottom"/>
+          </w:tcPr>
+          <w:p>
+            <w:pPr>
+              <w:spacing w:line="276" w:lineRule="auto"/>
+              <w:rPr>
+                <w:rFonts w:ascii="Cambria" w:hAnsi="Cambria"/>
+              </w:rPr>
+            </w:pPr>
+            <w:r>
+              <w:rPr>
+                <w:rFonts w:ascii="Cambria" w:hAnsi="Cambria" w:cs="Arial"/>
+              </w:rPr>
+              <w:t>Hogares totales proyectados.</w:t>
+            </w:r>
+          </w:p>
+        </w:tc>
+        <w:tc>
+          <w:tcPr>
+            <w:tcW w:w="1559" w:type="dxa"/>
+            <w:vAlign w:val="bottom"/>
+          </w:tcPr>
+          <w:p>
+            <w:pPr>
+              <w:spacing w:line="276" w:lineRule="auto"/>
+              <w:rPr>
+                <w:rFonts w:ascii="Cambria" w:hAnsi="Cambria"/>
+              </w:rPr>
+            </w:pPr>
+            <w:r>
+              <w:rPr>
+                <w:rFonts w:ascii="Cambria" w:hAnsi="Cambria" w:cs="Arial"/>
+              </w:rPr>
+              <w:t>Mayor a 0. Sin nulos.</w:t>
+            </w:r>
+          </w:p>
+        </w:tc>
+        <w:tc>
+          <w:tcPr>
+            <w:tcW w:w="1392" w:type="dxa"/>
+            <w:vAlign w:val="bottom"/>
+          </w:tcPr>
+          <w:p>
+            <w:pPr>
+              <w:spacing w:line="276" w:lineRule="auto"/>
+              <w:rPr>
+                <w:rFonts w:ascii="Cambria" w:hAnsi="Cambria"/>
+              </w:rPr>
+            </w:pPr>
+            <w:r>
+              <w:rPr>
+                <w:rFonts w:ascii="Cambria" w:hAnsi="Cambria" w:cs="Arial"/>
+              </w:rPr>
+              <w:t>Sí</w:t>
+            </w:r>
+          </w:p>
+        </w:tc>
+      </w:tr>
+      <w:tr>
+        <w:tc>
+          <w:tcPr>
+            <w:tcW w:w="562" w:type="dxa"/>
+            <w:vAlign w:val="bottom"/>
+          </w:tcPr>
+          <w:p>
+            <w:pPr>
+              <w:spacing w:line="276" w:lineRule="auto"/>
+              <w:rPr>
+                <w:rFonts w:ascii="Cambria" w:hAnsi="Cambria"/>
+                <w:b/>
+                <w:bCs/>
+              </w:rPr>
+            </w:pPr>
+            <w:r>
+              <w:rPr>
+                <w:rFonts w:ascii="Cambria" w:hAnsi="Cambria" w:cs="Arial"/>
+                <w:b/>
+                <w:bCs/>
+              </w:rPr>
+              <w:t>20</w:t>
+            </w:r>
+          </w:p>
+        </w:tc>
+        <w:tc>
+          <w:tcPr>
+            <w:tcW w:w="2410" w:type="dxa"/>
+            <w:vAlign w:val="bottom"/>
           </w:tcPr>
           <w:p>
             <w:pPr>
@@ -4012,9 +4796,9 @@
             <w:proofErr w:type="spellStart"/>
             <w:r>
               <w:rPr>
-                <w:rFonts w:ascii="Cambria" w:hAnsi="Cambria"/>
-              </w:rPr>
-              <w:t>factor_expansion</w:t>
+                <w:rFonts w:ascii="Cambria" w:hAnsi="Cambria" w:cs="Arial"/>
+              </w:rPr>
+              <w:t>Provincia_Mapa</w:t>
             </w:r>
             <w:proofErr w:type="spellEnd"/>
           </w:p>
@@ -4022,74 +4806,78 @@
         <w:tc>
           <w:tcPr>
             <w:tcW w:w="1276" w:type="dxa"/>
-          </w:tcPr>
-          <w:p>
-            <w:pPr>
-              <w:spacing w:line="276" w:lineRule="auto"/>
-              <w:rPr>
-                <w:rFonts w:ascii="Cambria" w:hAnsi="Cambria"/>
-              </w:rPr>
-            </w:pPr>
-            <w:r>
-              <w:rPr>
-                <w:rFonts w:ascii="Cambria" w:hAnsi="Cambria"/>
-              </w:rPr>
-              <w:t>DECIMAL</w:t>
+            <w:vAlign w:val="bottom"/>
+          </w:tcPr>
+          <w:p>
+            <w:pPr>
+              <w:spacing w:line="276" w:lineRule="auto"/>
+              <w:rPr>
+                <w:rFonts w:ascii="Cambria" w:hAnsi="Cambria"/>
+              </w:rPr>
+            </w:pPr>
+            <w:r>
+              <w:rPr>
+                <w:rFonts w:ascii="Cambria" w:hAnsi="Cambria" w:cs="Arial"/>
+              </w:rPr>
+              <w:t>VARCHAR</w:t>
             </w:r>
           </w:p>
         </w:tc>
         <w:tc>
           <w:tcPr>
             <w:tcW w:w="1701" w:type="dxa"/>
-          </w:tcPr>
-          <w:p>
-            <w:pPr>
-              <w:spacing w:line="276" w:lineRule="auto"/>
-              <w:rPr>
-                <w:rFonts w:ascii="Cambria" w:hAnsi="Cambria"/>
-              </w:rPr>
-            </w:pPr>
-            <w:r>
-              <w:rPr>
-                <w:rFonts w:ascii="Cambria" w:hAnsi="Cambria"/>
-              </w:rPr>
-              <w:t>Peso de muestra para proyección nacional.</w:t>
+            <w:vAlign w:val="bottom"/>
+          </w:tcPr>
+          <w:p>
+            <w:pPr>
+              <w:spacing w:line="276" w:lineRule="auto"/>
+              <w:rPr>
+                <w:rFonts w:ascii="Cambria" w:hAnsi="Cambria"/>
+              </w:rPr>
+            </w:pPr>
+            <w:r>
+              <w:rPr>
+                <w:rFonts w:ascii="Cambria" w:hAnsi="Cambria" w:cs="Arial"/>
+              </w:rPr>
+              <w:t>Nombre de provincia para el mapa.</w:t>
             </w:r>
           </w:p>
         </w:tc>
         <w:tc>
           <w:tcPr>
             <w:tcW w:w="1559" w:type="dxa"/>
-          </w:tcPr>
-          <w:p>
-            <w:pPr>
-              <w:spacing w:line="276" w:lineRule="auto"/>
-              <w:rPr>
-                <w:rFonts w:ascii="Cambria" w:hAnsi="Cambria"/>
-              </w:rPr>
-            </w:pPr>
-            <w:r>
-              <w:rPr>
-                <w:rFonts w:ascii="Cambria" w:hAnsi="Cambria"/>
-              </w:rPr>
-              <w:t>Mayor a 0. No nulo.</w:t>
+            <w:vAlign w:val="bottom"/>
+          </w:tcPr>
+          <w:p>
+            <w:pPr>
+              <w:spacing w:line="276" w:lineRule="auto"/>
+              <w:rPr>
+                <w:rFonts w:ascii="Cambria" w:hAnsi="Cambria"/>
+              </w:rPr>
+            </w:pPr>
+            <w:r>
+              <w:rPr>
+                <w:rFonts w:ascii="Cambria" w:hAnsi="Cambria" w:cs="Arial"/>
+              </w:rPr>
+              <w:t>Formato geográfico válido.</w:t>
             </w:r>
           </w:p>
         </w:tc>
         <w:tc>
           <w:tcPr>
             <w:tcW w:w="1392" w:type="dxa"/>
-          </w:tcPr>
-          <w:p>
-            <w:pPr>
-              <w:spacing w:line="276" w:lineRule="auto"/>
-              <w:rPr>
-                <w:rFonts w:ascii="Cambria" w:hAnsi="Cambria"/>
-              </w:rPr>
-            </w:pPr>
-            <w:r>
-              <w:rPr>
-                <w:rFonts w:ascii="Cambria" w:hAnsi="Cambria"/>
+            <w:vAlign w:val="bottom"/>
+          </w:tcPr>
+          <w:p>
+            <w:pPr>
+              <w:spacing w:line="276" w:lineRule="auto"/>
+              <w:rPr>
+                <w:rFonts w:ascii="Cambria" w:hAnsi="Cambria"/>
+              </w:rPr>
+            </w:pPr>
+            <w:r>
+              <w:rPr>
+                <w:rFonts w:ascii="Cambria" w:hAnsi="Cambria" w:cs="Arial"/>
               </w:rPr>
               <w:t>Sí</w:t>
             </w:r>
@@ -4612,6 +5400,7 @@
               <w:rPr>
                 <w:rFonts w:ascii="Cambria" w:hAnsi="Cambria"/>
               </w:rPr>
+              <w:lastRenderedPageBreak/>
               <w:t>Snowflake</w:t>
             </w:r>
             <w:proofErr w:type="spellEnd"/>
@@ -4644,6 +5433,7 @@
                 <w:b/>
                 <w:bCs/>
               </w:rPr>
+              <w:lastRenderedPageBreak/>
               <w:t>Frecuencia de actualización</w:t>
             </w:r>
           </w:p>
@@ -4712,7 +5502,6 @@
           <w:bCs/>
           <w:lang w:val="es-MX"/>
         </w:rPr>
-        <w:lastRenderedPageBreak/>
         <w:t xml:space="preserve">6.- </w:t>
       </w:r>
       <w:r>
@@ -6049,6 +6838,7 @@
   <w:style w:type="character" w:default="1" w:styleId="DefaultParagraphFont">
     <w:name w:val="Default Paragraph Font"/>
     <w:uiPriority w:val="1"/>
+    <w:semiHidden/>
     <w:unhideWhenUsed/>
   </w:style>
   <w:style w:type="table" w:default="1" w:styleId="TableNormal">

</xml_diff>

<commit_message>
v1.0.0 documento en producción de especificación de datos INEC
</commit_message>
<xml_diff>
--- a/DOCS/DPDS_INEC.docx
+++ b/DOCS/DPDS_INEC.docx
@@ -53,14 +53,28 @@
           <w:rFonts w:ascii="Cambria" w:hAnsi="Cambria"/>
           <w:lang w:val="es-MX"/>
         </w:rPr>
-        <w:t>v0.</w:t>
-      </w:r>
-      <w:r>
-        <w:rPr>
-          <w:rFonts w:ascii="Cambria" w:hAnsi="Cambria"/>
-          <w:lang w:val="es-MX"/>
-        </w:rPr>
-        <w:t>3</w:t>
+        <w:t>v</w:t>
+      </w:r>
+      <w:r>
+        <w:rPr>
+          <w:rFonts w:ascii="Cambria" w:hAnsi="Cambria"/>
+          <w:lang w:val="es-MX"/>
+        </w:rPr>
+        <w:t>1</w:t>
+      </w:r>
+      <w:r>
+        <w:rPr>
+          <w:rFonts w:ascii="Cambria" w:hAnsi="Cambria"/>
+          <w:lang w:val="es-MX"/>
+        </w:rPr>
+        <w:t>.</w:t>
+      </w:r>
+      <w:r>
+        <w:rPr>
+          <w:rFonts w:ascii="Cambria" w:hAnsi="Cambria"/>
+          <w:lang w:val="es-MX"/>
+        </w:rPr>
+        <w:t>0</w:t>
       </w:r>
       <w:r>
         <w:rPr>
@@ -351,14 +365,21 @@
                 <w:rFonts w:ascii="Cambria" w:hAnsi="Cambria"/>
                 <w:lang w:val="es-MX"/>
               </w:rPr>
-              <w:t>v0.</w:t>
+              <w:t>V1</w:t>
             </w:r>
             <w:r>
               <w:rPr>
                 <w:rFonts w:ascii="Cambria" w:hAnsi="Cambria"/>
                 <w:lang w:val="es-MX"/>
               </w:rPr>
-              <w:t>3</w:t>
+              <w:t>.</w:t>
+            </w:r>
+            <w:r>
+              <w:rPr>
+                <w:rFonts w:ascii="Cambria" w:hAnsi="Cambria"/>
+                <w:lang w:val="es-MX"/>
+              </w:rPr>
+              <w:t>0</w:t>
             </w:r>
             <w:r>
               <w:rPr>
@@ -413,7 +434,7 @@
                 <w:rFonts w:ascii="Cambria" w:hAnsi="Cambria"/>
                 <w:lang w:val="es-MX"/>
               </w:rPr>
-              <w:t>En desarrollo</w:t>
+              <w:t>Producción</w:t>
             </w:r>
           </w:p>
         </w:tc>
@@ -1556,7 +1577,7 @@
           <w:rFonts w:ascii="Cambria" w:hAnsi="Cambria"/>
           <w:b/>
           <w:bCs/>
-          <w:lang w:val="es-MX"/>
+          <w:lang w:val="en-US"/>
         </w:rPr>
       </w:pPr>
     </w:p>
@@ -5519,11 +5540,12 @@
         <w:tblStyle w:val="TableGrid"/>
         <w:tblW w:w="0" w:type="auto"/>
         <w:jc w:val="center"/>
+        <w:tblLayout w:type="fixed"/>
         <w:tblLook w:val="04A0" w:firstRow="1" w:lastRow="0" w:firstColumn="1" w:lastColumn="0" w:noHBand="0" w:noVBand="1"/>
       </w:tblPr>
       <w:tblGrid>
-        <w:gridCol w:w="4106"/>
-        <w:gridCol w:w="4388"/>
+        <w:gridCol w:w="2122"/>
+        <w:gridCol w:w="6372"/>
       </w:tblGrid>
       <w:tr>
         <w:trPr>
@@ -5531,7 +5553,7 @@
         </w:trPr>
         <w:tc>
           <w:tcPr>
-            <w:tcW w:w="4106" w:type="dxa"/>
+            <w:tcW w:w="2122" w:type="dxa"/>
             <w:hideMark/>
           </w:tcPr>
           <w:p>
@@ -5555,7 +5577,7 @@
         </w:tc>
         <w:tc>
           <w:tcPr>
-            <w:tcW w:w="4388" w:type="dxa"/>
+            <w:tcW w:w="6372" w:type="dxa"/>
             <w:hideMark/>
           </w:tcPr>
           <w:p>
@@ -5584,7 +5606,7 @@
         </w:trPr>
         <w:tc>
           <w:tcPr>
-            <w:tcW w:w="4106" w:type="dxa"/>
+            <w:tcW w:w="2122" w:type="dxa"/>
           </w:tcPr>
           <w:p>
             <w:pPr>
@@ -5607,7 +5629,7 @@
         </w:tc>
         <w:tc>
           <w:tcPr>
-            <w:tcW w:w="4388" w:type="dxa"/>
+            <w:tcW w:w="6372" w:type="dxa"/>
           </w:tcPr>
           <w:p>
             <w:pPr>
@@ -5631,7 +5653,7 @@
         </w:trPr>
         <w:tc>
           <w:tcPr>
-            <w:tcW w:w="4106" w:type="dxa"/>
+            <w:tcW w:w="2122" w:type="dxa"/>
           </w:tcPr>
           <w:p>
             <w:pPr>
@@ -5654,7 +5676,7 @@
         </w:tc>
         <w:tc>
           <w:tcPr>
-            <w:tcW w:w="4388" w:type="dxa"/>
+            <w:tcW w:w="6372" w:type="dxa"/>
           </w:tcPr>
           <w:p>
             <w:pPr>
@@ -5728,7 +5750,7 @@
         </w:trPr>
         <w:tc>
           <w:tcPr>
-            <w:tcW w:w="4106" w:type="dxa"/>
+            <w:tcW w:w="2122" w:type="dxa"/>
           </w:tcPr>
           <w:p>
             <w:pPr>
@@ -5751,15 +5773,24 @@
         </w:tc>
         <w:tc>
           <w:tcPr>
-            <w:tcW w:w="4388" w:type="dxa"/>
-          </w:tcPr>
-          <w:p>
-            <w:pPr>
-              <w:spacing w:after="160" w:line="276" w:lineRule="auto"/>
-              <w:rPr>
-                <w:rFonts w:ascii="Cambria" w:hAnsi="Cambria"/>
-              </w:rPr>
-            </w:pPr>
+            <w:tcW w:w="6372" w:type="dxa"/>
+          </w:tcPr>
+          <w:p>
+            <w:pPr>
+              <w:spacing w:after="160" w:line="276" w:lineRule="auto"/>
+              <w:rPr>
+                <w:rFonts w:ascii="Cambria" w:hAnsi="Cambria"/>
+              </w:rPr>
+            </w:pPr>
+            <w:hyperlink r:id="rId5" w:history="1">
+              <w:r>
+                <w:rPr>
+                  <w:rStyle w:val="Hyperlink"/>
+                  <w:rFonts w:ascii="Cambria" w:hAnsi="Cambria"/>
+                </w:rPr>
+                <w:t>https://liveespochedu-my.sharepoint.com/:w:/g/personal/kevin_barragan_espoch_edu_ec/IQDwnHlPd400Qrwf4aDPRbb2AYRTO3Ci_X9_wfPiBaCrxfI?e=95mbc1</w:t>
+              </w:r>
+            </w:hyperlink>
           </w:p>
         </w:tc>
       </w:tr>
@@ -5769,7 +5800,7 @@
         </w:trPr>
         <w:tc>
           <w:tcPr>
-            <w:tcW w:w="4106" w:type="dxa"/>
+            <w:tcW w:w="2122" w:type="dxa"/>
           </w:tcPr>
           <w:p>
             <w:pPr>
@@ -5802,15 +5833,63 @@
         </w:tc>
         <w:tc>
           <w:tcPr>
-            <w:tcW w:w="4388" w:type="dxa"/>
-          </w:tcPr>
-          <w:p>
-            <w:pPr>
-              <w:spacing w:after="160" w:line="276" w:lineRule="auto"/>
-              <w:rPr>
-                <w:rFonts w:ascii="Cambria" w:hAnsi="Cambria"/>
-              </w:rPr>
-            </w:pPr>
+            <w:tcW w:w="6372" w:type="dxa"/>
+          </w:tcPr>
+          <w:p>
+            <w:pPr>
+              <w:spacing w:after="160" w:line="276" w:lineRule="auto"/>
+              <w:rPr>
+                <w:rFonts w:ascii="Cambria" w:hAnsi="Cambria"/>
+              </w:rPr>
+            </w:pPr>
+            <w:hyperlink r:id="rId6" w:history="1">
+              <w:r>
+                <w:rPr>
+                  <w:rStyle w:val="Hyperlink"/>
+                  <w:rFonts w:ascii="Cambria" w:hAnsi="Cambria"/>
+                </w:rPr>
+                <w:t>https://openmetadata.andresgaibor.com/signin</w:t>
+              </w:r>
+            </w:hyperlink>
+          </w:p>
+          <w:p>
+            <w:pPr>
+              <w:spacing w:after="160" w:line="276" w:lineRule="auto"/>
+              <w:rPr>
+                <w:rFonts w:ascii="Cambria" w:hAnsi="Cambria"/>
+              </w:rPr>
+            </w:pPr>
+            <w:r>
+              <w:rPr>
+                <w:rFonts w:ascii="Cambria" w:hAnsi="Cambria"/>
+              </w:rPr>
+              <w:t>Email: fipabo4000@lidugw.com</w:t>
+            </w:r>
+          </w:p>
+          <w:p>
+            <w:pPr>
+              <w:spacing w:after="160" w:line="276" w:lineRule="auto"/>
+              <w:rPr>
+                <w:rFonts w:ascii="Cambria" w:hAnsi="Cambria"/>
+                <w:lang w:val="en-US"/>
+              </w:rPr>
+            </w:pPr>
+            <w:proofErr w:type="spellStart"/>
+            <w:r>
+              <w:rPr>
+                <w:rFonts w:ascii="Cambria" w:hAnsi="Cambria"/>
+                <w:lang w:val="en-US"/>
+              </w:rPr>
+              <w:t>Contraseña</w:t>
+            </w:r>
+            <w:proofErr w:type="spellEnd"/>
+            <w:r>
+              <w:rPr>
+                <w:rFonts w:ascii="Cambria" w:hAnsi="Cambria"/>
+                <w:lang w:val="en-US"/>
+              </w:rPr>
+              <w:t>: Visit@123</w:t>
+            </w:r>
           </w:p>
         </w:tc>
       </w:tr>
@@ -5820,7 +5899,7 @@
         </w:trPr>
         <w:tc>
           <w:tcPr>
-            <w:tcW w:w="4106" w:type="dxa"/>
+            <w:tcW w:w="2122" w:type="dxa"/>
           </w:tcPr>
           <w:p>
             <w:pPr>
@@ -5843,59 +5922,24 @@
         </w:tc>
         <w:tc>
           <w:tcPr>
-            <w:tcW w:w="4388" w:type="dxa"/>
-          </w:tcPr>
-          <w:p>
-            <w:pPr>
-              <w:spacing w:after="160" w:line="276" w:lineRule="auto"/>
-              <w:rPr>
-                <w:rFonts w:ascii="Cambria" w:hAnsi="Cambria"/>
-              </w:rPr>
-            </w:pPr>
-            <w:r>
-              <w:rPr>
-                <w:rFonts w:ascii="Cambria" w:hAnsi="Cambria"/>
-              </w:rPr>
-              <w:t xml:space="preserve">Repositorio </w:t>
-            </w:r>
-            <w:r>
-              <w:rPr>
-                <w:rFonts w:ascii="Cambria" w:hAnsi="Cambria"/>
-              </w:rPr>
-              <w:t xml:space="preserve">en </w:t>
-            </w:r>
-            <w:r>
-              <w:rPr>
-                <w:rFonts w:ascii="Cambria" w:hAnsi="Cambria"/>
-              </w:rPr>
-              <w:t>Git</w:t>
-            </w:r>
-            <w:r>
-              <w:rPr>
-                <w:rFonts w:ascii="Cambria" w:hAnsi="Cambria"/>
-              </w:rPr>
-              <w:t>Hub</w:t>
-            </w:r>
-            <w:r>
-              <w:rPr>
-                <w:rFonts w:ascii="Cambria" w:hAnsi="Cambria"/>
-              </w:rPr>
-              <w:t xml:space="preserve"> del </w:t>
-            </w:r>
-            <w:proofErr w:type="spellStart"/>
-            <w:r>
-              <w:rPr>
-                <w:rFonts w:ascii="Cambria" w:hAnsi="Cambria"/>
-              </w:rPr>
-              <w:t>Datatón</w:t>
-            </w:r>
-            <w:proofErr w:type="spellEnd"/>
-            <w:r>
-              <w:rPr>
-                <w:rFonts w:ascii="Cambria" w:hAnsi="Cambria"/>
-              </w:rPr>
-              <w:t xml:space="preserve"> conteniendo el README</w:t>
-            </w:r>
+            <w:tcW w:w="6372" w:type="dxa"/>
+          </w:tcPr>
+          <w:p>
+            <w:pPr>
+              <w:spacing w:after="160" w:line="276" w:lineRule="auto"/>
+              <w:rPr>
+                <w:rFonts w:ascii="Cambria" w:hAnsi="Cambria"/>
+              </w:rPr>
+            </w:pPr>
+            <w:hyperlink r:id="rId7" w:history="1">
+              <w:r>
+                <w:rPr>
+                  <w:rStyle w:val="Hyperlink"/>
+                  <w:rFonts w:ascii="Cambria" w:hAnsi="Cambria"/>
+                </w:rPr>
+                <w:t>https://github.com/JALE2026MAY/HACKATON_JUN2026/tree/Grupo2</w:t>
+              </w:r>
+            </w:hyperlink>
           </w:p>
         </w:tc>
       </w:tr>
@@ -7181,6 +7225,41 @@
       <w:color w:val="666666"/>
     </w:rPr>
   </w:style>
+  <w:style w:type="character" w:styleId="Hyperlink">
+    <w:name w:val="Hyperlink"/>
+    <w:basedOn w:val="DefaultParagraphFont"/>
+    <w:uiPriority w:val="99"/>
+    <w:unhideWhenUsed/>
+    <w:rsid w:val="00FB08ED"/>
+    <w:rPr>
+      <w:color w:val="467886" w:themeColor="hyperlink"/>
+      <w:u w:val="single"/>
+    </w:rPr>
+  </w:style>
+  <w:style w:type="character" w:styleId="UnresolvedMention">
+    <w:name w:val="Unresolved Mention"/>
+    <w:basedOn w:val="DefaultParagraphFont"/>
+    <w:uiPriority w:val="99"/>
+    <w:semiHidden/>
+    <w:unhideWhenUsed/>
+    <w:rsid w:val="00FB08ED"/>
+    <w:rPr>
+      <w:color w:val="605E5C"/>
+      <w:shd w:val="clear" w:color="auto" w:fill="E1DFDD"/>
+    </w:rPr>
+  </w:style>
+  <w:style w:type="character" w:styleId="FollowedHyperlink">
+    <w:name w:val="FollowedHyperlink"/>
+    <w:basedOn w:val="DefaultParagraphFont"/>
+    <w:uiPriority w:val="99"/>
+    <w:semiHidden/>
+    <w:unhideWhenUsed/>
+    <w:rsid w:val="0047429C"/>
+    <w:rPr>
+      <w:color w:val="96607D" w:themeColor="followedHyperlink"/>
+      <w:u w:val="single"/>
+    </w:rPr>
+  </w:style>
 </w:styles>
 </file>
 

</xml_diff>